<commit_message>
feat: integrate najava scraping into web report pipeline
- Add parsear_najava() to extract data from ffm.mk/najava/{id} pages
- Add enriquecer_con_najava() to merge najava data into izvestaj results
- Extract: Cyrillic team names, explicit goalkeeper/captain markers,
  head coaches, match delegate (Контролор)
- Replace heuristic goalkeeper detection with explicit najava data
- Replace Latin team names with Cyrillic in partido_info and events
- Includes config file updates (conversions, name_corrections, etc.)
</commit_message>
<xml_diff>
--- a/zapisnik-komet.docx
+++ b/zapisnik-komet.docx
@@ -44,9 +44,9 @@
                           <a:avLst/>
                           <a:gdLst>
                             <a:gd name="textAreaLeft" fmla="*/ 0 w 3996000"/>
-                            <a:gd name="textAreaRight" fmla="*/ 4005720 w 3996000"/>
+                            <a:gd name="textAreaRight" fmla="*/ 4006800 w 3996000"/>
                             <a:gd name="textAreaTop" fmla="*/ 0 h 720"/>
-                            <a:gd name="textAreaBottom" fmla="*/ 33181200 h 720"/>
+                            <a:gd name="textAreaBottom" fmla="*/ 111986280 h 720"/>
                             <a:gd name="GluePoint1X" fmla=""/>
                             <a:gd name="GluePoint1Y" fmla=""/>
                             <a:gd name="GluePoint2X" fmla=""/>
@@ -231,7 +231,7 @@
           <w:szCs w:val="20"/>
           <w:lang w:val="mk-MK"/>
         </w:rPr>
-        <w:t>Кадетска Женска Фудбалска Лига 25/26</w:t>
+        <w:t>Младинска Женска Фудбалска Лига 25/26</w:t>
       </w:r>
       <w:r>
         <w:rPr>
@@ -278,7 +278,7 @@
         <w:pStyle w:val="BodyText"/>
         <w:widowControl w:val="false"/>
         <w:suppressAutoHyphens w:val="true"/>
-        <w:overflowPunct w:val="false"/>
+        <w:overflowPunct w:val="true"/>
         <w:bidi w:val="0"/>
         <w:spacing w:before="137" w:after="0"/>
         <w:ind w:firstLine="1349" w:left="0" w:right="1889"/>
@@ -294,7 +294,7 @@
       </w:pPr>
       <w:r>
         <w:rPr>
-          <w:rFonts w:ascii="system-ui;apple-system;Segoe UI;Roboto;Helvetica;Arial;sans-serif;Apple Color Emoji;Segoe UI Emoji" w:hAnsi="system-ui;apple-system;Segoe UI;Roboto;Helvetica;Arial;sans-serif;Apple Color Emoji;Segoe UI Emoji"/>
+          <w:rFonts w:ascii="Arial" w:hAnsi="Arial"/>
           <w:b/>
           <w:bCs/>
           <w:i w:val="false"/>
@@ -302,11 +302,11 @@
           <w:smallCaps w:val="false"/>
           <w:color w:val="212121"/>
           <w:spacing w:val="0"/>
-          <w:sz w:val="26"/>
+          <w:sz w:val="28"/>
           <w:szCs w:val="20"/>
           <w:lang w:val="mk-MK"/>
         </w:rPr>
-        <w:t>ФК АСС УНИТЕД/ЖФК - ЖФК Ускана</w:t>
+        <w:t>ЖФК КАМЕНИЦА САСА - ЖФК ЉУБОТЕН</w:t>
       </w:r>
     </w:p>
     <w:p>
@@ -330,7 +330,31 @@
           <w:sz w:val="28"/>
           <w:szCs w:val="28"/>
         </w:rPr>
-        <w:t>0:0</w:t>
+        <w:t>3:0*</w:t>
+      </w:r>
+    </w:p>
+    <w:p>
+      <w:pPr>
+        <w:pStyle w:val="BodyText"/>
+        <w:spacing w:before="19" w:after="283"/>
+        <w:jc w:val="center"/>
+        <w:rPr>
+          <w:rFonts w:ascii="Arial" w:hAnsi="Arial" w:eastAsia="Arial" w:cs="Arial"/>
+          <w:b w:val="false"/>
+          <w:bCs w:val="false"/>
+          <w:sz w:val="14"/>
+          <w:szCs w:val="14"/>
+        </w:rPr>
+      </w:pPr>
+      <w:r>
+        <w:rPr>
+          <w:rFonts w:eastAsia="Arial" w:cs="Arial" w:ascii="Arial" w:hAnsi="Arial"/>
+          <w:b w:val="false"/>
+          <w:bCs w:val="false"/>
+          <w:sz w:val="14"/>
+          <w:szCs w:val="14"/>
+        </w:rPr>
+        <w:t>*службен резултат</w:t>
       </w:r>
     </w:p>
     <w:p>
@@ -364,7 +388,15 @@
       </w:r>
       <w:r>
         <w:rPr/>
-        <w:t>Датум/време: 11.11.2025 15:00 CET</w:t>
+        <w:t>Датум/време: 28.03.2026 1</w:t>
+      </w:r>
+      <w:r>
+        <w:rPr/>
+        <w:t>5:0</w:t>
+      </w:r>
+      <w:r>
+        <w:rPr/>
+        <w:t>0 CEST</w:t>
       </w:r>
     </w:p>
     <w:p>
@@ -382,7 +414,7 @@
       </w:r>
       <w:r>
         <w:rPr/>
-        <w:t>Игралиште: Терен на АМС ЖФК АСС</w:t>
+        <w:t>Игралиште: Градски стадион Македонска</w:t>
       </w:r>
     </w:p>
     <w:p>
@@ -415,15 +447,7 @@
           <w:sz w:val="10"/>
           <w:szCs w:val="10"/>
         </w:rPr>
-        <w:t xml:space="preserve">Коло: </w:t>
-      </w:r>
-      <w:r>
-        <w:rPr>
-          <w:spacing w:val="-1"/>
-          <w:sz w:val="10"/>
-          <w:szCs w:val="10"/>
-        </w:rPr>
-        <w:t>7</w:t>
+        <w:t>Коло: 15</w:t>
       </w:r>
     </w:p>
     <w:p>
@@ -442,7 +466,7 @@
         <w:pStyle w:val="BodyText"/>
         <w:widowControl w:val="false"/>
         <w:suppressAutoHyphens w:val="true"/>
-        <w:overflowPunct w:val="false"/>
+        <w:overflowPunct w:val="true"/>
         <w:bidi w:val="0"/>
         <w:spacing w:before="0" w:after="0"/>
         <w:ind w:hanging="0" w:left="0" w:right="1080"/>
@@ -492,8 +516,8 @@
           <w:pgMar w:left="280" w:right="280" w:gutter="0" w:header="0" w:top="360" w:footer="405" w:bottom="600"/>
           <w:cols w:num="3" w:equalWidth="false" w:sep="false">
             <w:col w:w="4741" w:space="40"/>
-            <w:col w:w="1251" w:space="708"/>
-            <w:col w:w="4604"/>
+            <w:col w:w="1248" w:space="708"/>
+            <w:col w:w="4607"/>
           </w:cols>
           <w:formProt w:val="false"/>
           <w:textDirection w:val="lrTb"/>
@@ -537,7 +561,7 @@
         <w:rPr>
           <w:u w:val="none"/>
         </w:rPr>
-        <w:t>: Мојсоски Марио (Струга)</w:t>
+        <w:t>: Ѓеоргиевски Мики (Македонска Каменица)</w:t>
       </w:r>
       <w:r>
         <w:rPr/>
@@ -590,7 +614,7 @@
         <w:rPr>
           <w:sz w:val="16"/>
         </w:rPr>
-        <w:t>помошен: Лаброски Ѓорѓи (Струга)</w:t>
+        <w:t>помошен: Ананиев Александар (Нас.Оризари,Кочани)</w:t>
         <w:tab/>
       </w:r>
       <w:r>
@@ -659,7 +683,7 @@
           <w:sz w:val="16"/>
           <w:lang w:val="mk-MK"/>
         </w:rPr>
-        <w:t xml:space="preserve"> Бекри Кренар (Струга)</w:t>
+        <w:t xml:space="preserve"> Велиновски Мартин (Македонска Каменица)</w:t>
       </w:r>
       <w:r>
         <w:rPr>
@@ -768,9 +792,9 @@
                           <a:avLst/>
                           <a:gdLst>
                             <a:gd name="textAreaLeft" fmla="*/ 0 w 3996000"/>
-                            <a:gd name="textAreaRight" fmla="*/ 4005720 w 3996000"/>
+                            <a:gd name="textAreaRight" fmla="*/ 4006800 w 3996000"/>
                             <a:gd name="textAreaTop" fmla="*/ 0 h 720"/>
-                            <a:gd name="textAreaBottom" fmla="*/ 33181200 h 720"/>
+                            <a:gd name="textAreaBottom" fmla="*/ 111986280 h 720"/>
                             <a:gd name="GluePoint1X" fmla=""/>
                             <a:gd name="GluePoint1Y" fmla=""/>
                             <a:gd name="GluePoint2X" fmla=""/>
@@ -829,7 +853,7 @@
           <w:u w:val="none"/>
           <w:lang w:val="mk-MK"/>
         </w:rPr>
-        <w:t xml:space="preserve"> Рика Муамер (Струга)</w:t>
+        <w:t xml:space="preserve"> Јаневски Драган (Кочани)</w:t>
       </w:r>
     </w:p>
     <w:p>
@@ -1248,7 +1272,6 @@
               <w:rPr>
                 <w:sz w:val="14"/>
               </w:rPr>
-              <w:t>1</w:t>
             </w:r>
           </w:p>
         </w:tc>
@@ -1274,7 +1297,6 @@
               <w:rPr>
                 <w:sz w:val="14"/>
               </w:rPr>
-              <w:t>Џероска Леонтина Г</w:t>
             </w:r>
           </w:p>
         </w:tc>
@@ -1300,7 +1322,6 @@
               <w:rPr>
                 <w:sz w:val="14"/>
               </w:rPr>
-              <w:t>255592</w:t>
             </w:r>
           </w:p>
         </w:tc>
@@ -1434,7 +1455,6 @@
               <w:rPr>
                 <w:sz w:val="14"/>
               </w:rPr>
-              <w:t>1</w:t>
             </w:r>
           </w:p>
         </w:tc>
@@ -1460,7 +1480,6 @@
               <w:rPr>
                 <w:sz w:val="14"/>
               </w:rPr>
-              <w:t>Сејдини Дорунтина Г К</w:t>
             </w:r>
           </w:p>
         </w:tc>
@@ -1486,7 +1505,6 @@
               <w:rPr>
                 <w:sz w:val="14"/>
               </w:rPr>
-              <w:t>149491</w:t>
             </w:r>
           </w:p>
         </w:tc>
@@ -1631,7 +1649,6 @@
               <w:rPr>
                 <w:sz w:val="14"/>
               </w:rPr>
-              <w:t>3</w:t>
             </w:r>
           </w:p>
         </w:tc>
@@ -1657,7 +1674,6 @@
               <w:rPr>
                 <w:sz w:val="14"/>
               </w:rPr>
-              <w:t>Полиси Еда</w:t>
             </w:r>
           </w:p>
         </w:tc>
@@ -1683,7 +1699,6 @@
               <w:rPr>
                 <w:sz w:val="14"/>
               </w:rPr>
-              <w:t>264679</w:t>
             </w:r>
           </w:p>
         </w:tc>
@@ -1817,7 +1832,6 @@
               <w:rPr>
                 <w:sz w:val="14"/>
               </w:rPr>
-              <w:t>2</w:t>
             </w:r>
           </w:p>
         </w:tc>
@@ -1843,7 +1857,6 @@
               <w:rPr>
                 <w:sz w:val="14"/>
               </w:rPr>
-              <w:t>Арсланоска Арианеса</w:t>
             </w:r>
           </w:p>
         </w:tc>
@@ -1869,7 +1882,6 @@
               <w:rPr>
                 <w:sz w:val="14"/>
               </w:rPr>
-              <w:t>269501</w:t>
             </w:r>
           </w:p>
         </w:tc>
@@ -2014,7 +2026,6 @@
               <w:rPr>
                 <w:sz w:val="14"/>
               </w:rPr>
-              <w:t>4</w:t>
             </w:r>
           </w:p>
         </w:tc>
@@ -2040,7 +2051,6 @@
               <w:rPr>
                 <w:sz w:val="14"/>
               </w:rPr>
-              <w:t>Калајџиеска Геновева</w:t>
             </w:r>
           </w:p>
         </w:tc>
@@ -2066,7 +2076,6 @@
               <w:rPr>
                 <w:sz w:val="14"/>
               </w:rPr>
-              <w:t>260753</w:t>
             </w:r>
           </w:p>
         </w:tc>
@@ -2200,7 +2209,6 @@
               <w:rPr>
                 <w:sz w:val="14"/>
               </w:rPr>
-              <w:t>3</w:t>
             </w:r>
           </w:p>
         </w:tc>
@@ -2226,7 +2234,6 @@
               <w:rPr>
                 <w:sz w:val="14"/>
               </w:rPr>
-              <w:t>Ахмеди Луиза</w:t>
             </w:r>
           </w:p>
         </w:tc>
@@ -2252,7 +2259,6 @@
               <w:rPr>
                 <w:sz w:val="14"/>
               </w:rPr>
-              <w:t>268343</w:t>
             </w:r>
           </w:p>
         </w:tc>
@@ -2397,7 +2403,6 @@
               <w:rPr>
                 <w:sz w:val="14"/>
               </w:rPr>
-              <w:t>5</w:t>
             </w:r>
           </w:p>
         </w:tc>
@@ -2423,7 +2428,6 @@
               <w:rPr>
                 <w:sz w:val="14"/>
               </w:rPr>
-              <w:t>Мангоска Елена</w:t>
             </w:r>
           </w:p>
         </w:tc>
@@ -2449,7 +2453,6 @@
               <w:rPr>
                 <w:sz w:val="14"/>
               </w:rPr>
-              <w:t>266786</w:t>
             </w:r>
           </w:p>
         </w:tc>
@@ -2583,7 +2586,6 @@
               <w:rPr>
                 <w:sz w:val="14"/>
               </w:rPr>
-              <w:t>4</w:t>
             </w:r>
           </w:p>
         </w:tc>
@@ -2609,7 +2611,6 @@
               <w:rPr>
                 <w:sz w:val="14"/>
               </w:rPr>
-              <w:t>Арслани Шаќире</w:t>
             </w:r>
           </w:p>
         </w:tc>
@@ -2635,7 +2636,6 @@
               <w:rPr>
                 <w:sz w:val="14"/>
               </w:rPr>
-              <w:t>269502</w:t>
             </w:r>
           </w:p>
         </w:tc>
@@ -2780,7 +2780,6 @@
               <w:rPr>
                 <w:sz w:val="14"/>
               </w:rPr>
-              <w:t>9</w:t>
             </w:r>
           </w:p>
         </w:tc>
@@ -2806,7 +2805,6 @@
               <w:rPr>
                 <w:sz w:val="14"/>
               </w:rPr>
-              <w:t>Цветаноска Ива К</w:t>
             </w:r>
           </w:p>
         </w:tc>
@@ -2832,7 +2830,6 @@
               <w:rPr>
                 <w:sz w:val="14"/>
               </w:rPr>
-              <w:t>250782</w:t>
             </w:r>
           </w:p>
         </w:tc>
@@ -2966,7 +2963,6 @@
               <w:rPr>
                 <w:sz w:val="14"/>
               </w:rPr>
-              <w:t>5</w:t>
             </w:r>
           </w:p>
         </w:tc>
@@ -2992,7 +2988,6 @@
               <w:rPr>
                 <w:sz w:val="14"/>
               </w:rPr>
-              <w:t>Расими Лура</w:t>
             </w:r>
           </w:p>
         </w:tc>
@@ -3018,7 +3013,6 @@
               <w:rPr>
                 <w:sz w:val="14"/>
               </w:rPr>
-              <w:t>268362</w:t>
             </w:r>
           </w:p>
         </w:tc>
@@ -3163,7 +3157,6 @@
               <w:rPr>
                 <w:sz w:val="14"/>
               </w:rPr>
-              <w:t>11</w:t>
             </w:r>
           </w:p>
         </w:tc>
@@ -3189,7 +3182,6 @@
               <w:rPr>
                 <w:sz w:val="14"/>
               </w:rPr>
-              <w:t>Шерифоска Мелек</w:t>
             </w:r>
           </w:p>
         </w:tc>
@@ -3215,7 +3207,6 @@
               <w:rPr>
                 <w:sz w:val="14"/>
               </w:rPr>
-              <w:t>255588</w:t>
             </w:r>
           </w:p>
         </w:tc>
@@ -3349,7 +3340,6 @@
               <w:rPr>
                 <w:sz w:val="14"/>
               </w:rPr>
-              <w:t>6</w:t>
             </w:r>
           </w:p>
         </w:tc>
@@ -3375,7 +3365,6 @@
               <w:rPr>
                 <w:sz w:val="14"/>
               </w:rPr>
-              <w:t>Лика Јонида</w:t>
             </w:r>
           </w:p>
         </w:tc>
@@ -3401,7 +3390,6 @@
               <w:rPr>
                 <w:sz w:val="14"/>
               </w:rPr>
-              <w:t>149490</w:t>
             </w:r>
           </w:p>
         </w:tc>
@@ -3546,7 +3534,6 @@
               <w:rPr>
                 <w:sz w:val="14"/>
               </w:rPr>
-              <w:t>13</w:t>
             </w:r>
           </w:p>
         </w:tc>
@@ -3572,7 +3559,6 @@
               <w:rPr>
                 <w:sz w:val="14"/>
               </w:rPr>
-              <w:t>Алими Сибора</w:t>
             </w:r>
           </w:p>
         </w:tc>
@@ -3598,7 +3584,6 @@
               <w:rPr>
                 <w:sz w:val="14"/>
               </w:rPr>
-              <w:t>255998</w:t>
             </w:r>
           </w:p>
         </w:tc>
@@ -3732,7 +3717,6 @@
               <w:rPr>
                 <w:sz w:val="14"/>
               </w:rPr>
-              <w:t>7</w:t>
             </w:r>
           </w:p>
         </w:tc>
@@ -3758,7 +3742,6 @@
               <w:rPr>
                 <w:sz w:val="14"/>
               </w:rPr>
-              <w:t>Арслани Арјана</w:t>
             </w:r>
           </w:p>
         </w:tc>
@@ -3784,7 +3767,6 @@
               <w:rPr>
                 <w:sz w:val="14"/>
               </w:rPr>
-              <w:t>269500</w:t>
             </w:r>
           </w:p>
         </w:tc>
@@ -3929,7 +3911,6 @@
               <w:rPr>
                 <w:sz w:val="14"/>
               </w:rPr>
-              <w:t>14</w:t>
             </w:r>
           </w:p>
         </w:tc>
@@ -3955,7 +3936,6 @@
               <w:rPr>
                 <w:sz w:val="14"/>
               </w:rPr>
-              <w:t>Глигороска Марија</w:t>
             </w:r>
           </w:p>
         </w:tc>
@@ -3981,7 +3961,6 @@
               <w:rPr>
                 <w:sz w:val="14"/>
               </w:rPr>
-              <w:t>255997</w:t>
             </w:r>
           </w:p>
         </w:tc>
@@ -4115,7 +4094,6 @@
               <w:rPr>
                 <w:sz w:val="14"/>
               </w:rPr>
-              <w:t>8</w:t>
             </w:r>
           </w:p>
         </w:tc>
@@ -4141,7 +4119,6 @@
               <w:rPr>
                 <w:sz w:val="14"/>
               </w:rPr>
-              <w:t>Имери Лијана</w:t>
             </w:r>
           </w:p>
         </w:tc>
@@ -4167,7 +4144,6 @@
               <w:rPr>
                 <w:sz w:val="14"/>
               </w:rPr>
-              <w:t>255376</w:t>
             </w:r>
           </w:p>
         </w:tc>
@@ -4312,7 +4288,6 @@
               <w:rPr>
                 <w:sz w:val="14"/>
               </w:rPr>
-              <w:t>15</w:t>
             </w:r>
           </w:p>
         </w:tc>
@@ -4338,7 +4313,6 @@
               <w:rPr>
                 <w:sz w:val="14"/>
               </w:rPr>
-              <w:t>Куциноска Јоана</w:t>
             </w:r>
           </w:p>
         </w:tc>
@@ -4364,7 +4338,6 @@
               <w:rPr>
                 <w:sz w:val="14"/>
               </w:rPr>
-              <w:t>255995</w:t>
             </w:r>
           </w:p>
         </w:tc>
@@ -4498,7 +4471,6 @@
               <w:rPr>
                 <w:sz w:val="14"/>
               </w:rPr>
-              <w:t>9</w:t>
             </w:r>
           </w:p>
         </w:tc>
@@ -4524,7 +4496,6 @@
               <w:rPr>
                 <w:sz w:val="14"/>
               </w:rPr>
-              <w:t>Балажи Исније</w:t>
             </w:r>
           </w:p>
         </w:tc>
@@ -4550,7 +4521,6 @@
               <w:rPr>
                 <w:sz w:val="14"/>
               </w:rPr>
-              <w:t>259875</w:t>
             </w:r>
           </w:p>
         </w:tc>
@@ -4695,7 +4665,6 @@
               <w:rPr>
                 <w:sz w:val="14"/>
               </w:rPr>
-              <w:t>17</w:t>
             </w:r>
           </w:p>
         </w:tc>
@@ -4721,7 +4690,6 @@
               <w:rPr>
                 <w:sz w:val="14"/>
               </w:rPr>
-              <w:t>Илјази Ера</w:t>
             </w:r>
           </w:p>
         </w:tc>
@@ -4747,7 +4715,6 @@
               <w:rPr>
                 <w:sz w:val="14"/>
               </w:rPr>
-              <w:t>265004</w:t>
             </w:r>
           </w:p>
         </w:tc>
@@ -4881,7 +4848,6 @@
               <w:rPr>
                 <w:sz w:val="14"/>
               </w:rPr>
-              <w:t>10</w:t>
             </w:r>
           </w:p>
         </w:tc>
@@ -4907,7 +4873,6 @@
               <w:rPr>
                 <w:sz w:val="14"/>
               </w:rPr>
-              <w:t>Балажи Зелије</w:t>
             </w:r>
           </w:p>
         </w:tc>
@@ -4933,7 +4898,6 @@
               <w:rPr>
                 <w:sz w:val="14"/>
               </w:rPr>
-              <w:t>259876</w:t>
             </w:r>
           </w:p>
         </w:tc>
@@ -5078,7 +5042,6 @@
               <w:rPr>
                 <w:sz w:val="14"/>
               </w:rPr>
-              <w:t>21</w:t>
             </w:r>
           </w:p>
         </w:tc>
@@ -5104,7 +5067,6 @@
               <w:rPr>
                 <w:sz w:val="14"/>
               </w:rPr>
-              <w:t>Ферати Вера</w:t>
             </w:r>
           </w:p>
         </w:tc>
@@ -5130,7 +5092,6 @@
               <w:rPr>
                 <w:sz w:val="14"/>
               </w:rPr>
-              <w:t>255999</w:t>
             </w:r>
           </w:p>
         </w:tc>
@@ -5264,7 +5225,6 @@
               <w:rPr>
                 <w:sz w:val="14"/>
               </w:rPr>
-              <w:t>11</w:t>
             </w:r>
           </w:p>
         </w:tc>
@@ -5290,7 +5250,6 @@
               <w:rPr>
                 <w:sz w:val="14"/>
               </w:rPr>
-              <w:t>Алијоска Ајлин</w:t>
             </w:r>
           </w:p>
         </w:tc>
@@ -5316,7 +5275,6 @@
               <w:rPr>
                 <w:sz w:val="14"/>
               </w:rPr>
-              <w:t>272365</w:t>
             </w:r>
           </w:p>
         </w:tc>
@@ -5501,7 +5459,6 @@
               <w:rPr>
                 <w:sz w:val="14"/>
               </w:rPr>
-              <w:t>6</w:t>
             </w:r>
           </w:p>
         </w:tc>
@@ -5527,7 +5484,6 @@
               <w:rPr>
                 <w:sz w:val="14"/>
               </w:rPr>
-              <w:t>Арслани Елиф</w:t>
             </w:r>
           </w:p>
         </w:tc>
@@ -5553,7 +5509,6 @@
               <w:rPr>
                 <w:sz w:val="14"/>
               </w:rPr>
-              <w:t>255585</w:t>
             </w:r>
           </w:p>
         </w:tc>
@@ -5654,7 +5609,6 @@
               <w:rPr>
                 <w:sz w:val="14"/>
               </w:rPr>
-              <w:t>(17) 50</w:t>
             </w:r>
           </w:p>
         </w:tc>
@@ -5680,7 +5634,6 @@
               <w:rPr>
                 <w:sz w:val="14"/>
               </w:rPr>
-              <w:t>12</w:t>
             </w:r>
           </w:p>
         </w:tc>
@@ -5706,7 +5659,6 @@
               <w:rPr>
                 <w:sz w:val="14"/>
               </w:rPr>
-              <w:t>Реџепи Рита</w:t>
             </w:r>
           </w:p>
         </w:tc>
@@ -5732,7 +5684,6 @@
               <w:rPr>
                 <w:sz w:val="14"/>
               </w:rPr>
-              <w:t>268344</w:t>
             </w:r>
           </w:p>
         </w:tc>
@@ -5831,7 +5782,6 @@
               <w:rPr>
                 <w:sz w:val="14"/>
               </w:rPr>
-              <w:t>(5) 56</w:t>
             </w:r>
           </w:p>
         </w:tc>
@@ -5862,7 +5812,6 @@
               <w:rPr>
                 <w:sz w:val="14"/>
               </w:rPr>
-              <w:t>16</w:t>
             </w:r>
           </w:p>
         </w:tc>
@@ -5888,7 +5837,6 @@
               <w:rPr>
                 <w:sz w:val="14"/>
               </w:rPr>
-              <w:t>Даути Ерина</w:t>
             </w:r>
           </w:p>
         </w:tc>
@@ -5914,7 +5862,6 @@
               <w:rPr>
                 <w:sz w:val="14"/>
               </w:rPr>
-              <w:t>255589</w:t>
             </w:r>
           </w:p>
         </w:tc>
@@ -6015,7 +5962,6 @@
               <w:rPr>
                 <w:sz w:val="14"/>
               </w:rPr>
-              <w:t>(11) 50</w:t>
             </w:r>
           </w:p>
         </w:tc>
@@ -6041,7 +5987,6 @@
               <w:rPr>
                 <w:sz w:val="14"/>
               </w:rPr>
-              <w:t>13</w:t>
             </w:r>
           </w:p>
         </w:tc>
@@ -6067,7 +6012,6 @@
               <w:rPr>
                 <w:sz w:val="14"/>
               </w:rPr>
-              <w:t>Расими Лура</w:t>
             </w:r>
           </w:p>
         </w:tc>
@@ -6093,7 +6037,6 @@
               <w:rPr>
                 <w:sz w:val="14"/>
               </w:rPr>
-              <w:t>268362</w:t>
             </w:r>
           </w:p>
         </w:tc>
@@ -6192,7 +6135,6 @@
               <w:rPr>
                 <w:sz w:val="14"/>
               </w:rPr>
-              <w:t>(2) 56</w:t>
             </w:r>
           </w:p>
         </w:tc>
@@ -6220,7 +6162,9 @@
               </w:rPr>
             </w:pPr>
             <w:r>
-              <w:rPr/>
+              <w:rPr>
+                <w:sz w:val="14"/>
+              </w:rPr>
             </w:r>
           </w:p>
         </w:tc>
@@ -6243,7 +6187,9 @@
               </w:rPr>
             </w:pPr>
             <w:r>
-              <w:rPr/>
+              <w:rPr>
+                <w:sz w:val="14"/>
+              </w:rPr>
             </w:r>
           </w:p>
         </w:tc>
@@ -6266,7 +6212,9 @@
               </w:rPr>
             </w:pPr>
             <w:r>
-              <w:rPr/>
+              <w:rPr>
+                <w:sz w:val="14"/>
+              </w:rPr>
             </w:r>
           </w:p>
         </w:tc>
@@ -6392,7 +6340,6 @@
               <w:rPr>
                 <w:sz w:val="14"/>
               </w:rPr>
-              <w:t>14</w:t>
             </w:r>
           </w:p>
         </w:tc>
@@ -6418,7 +6365,6 @@
               <w:rPr>
                 <w:sz w:val="14"/>
               </w:rPr>
-              <w:t>Сулејмани Блеона</w:t>
             </w:r>
           </w:p>
         </w:tc>
@@ -6444,7 +6390,6 @@
               <w:rPr>
                 <w:sz w:val="14"/>
               </w:rPr>
-              <w:t>274489</w:t>
             </w:r>
           </w:p>
         </w:tc>
@@ -6568,7 +6513,9 @@
               </w:rPr>
             </w:pPr>
             <w:r>
-              <w:rPr/>
+              <w:rPr>
+                <w:sz w:val="14"/>
+              </w:rPr>
             </w:r>
           </w:p>
         </w:tc>
@@ -6591,7 +6538,9 @@
               </w:rPr>
             </w:pPr>
             <w:r>
-              <w:rPr/>
+              <w:rPr>
+                <w:sz w:val="14"/>
+              </w:rPr>
             </w:r>
           </w:p>
         </w:tc>
@@ -6614,7 +6563,9 @@
               </w:rPr>
             </w:pPr>
             <w:r>
-              <w:rPr/>
+              <w:rPr>
+                <w:sz w:val="14"/>
+              </w:rPr>
             </w:r>
           </w:p>
         </w:tc>
@@ -6712,7 +6663,9 @@
               </w:rPr>
             </w:pPr>
             <w:r>
-              <w:rPr/>
+              <w:rPr>
+                <w:sz w:val="14"/>
+              </w:rPr>
             </w:r>
           </w:p>
         </w:tc>
@@ -6738,7 +6691,6 @@
               <w:rPr>
                 <w:sz w:val="14"/>
               </w:rPr>
-              <w:t>15</w:t>
             </w:r>
           </w:p>
         </w:tc>
@@ -6764,7 +6716,6 @@
               <w:rPr>
                 <w:sz w:val="14"/>
               </w:rPr>
-              <w:t>Шерифоска Елиф</w:t>
             </w:r>
           </w:p>
         </w:tc>
@@ -6790,7 +6741,6 @@
               <w:rPr>
                 <w:sz w:val="14"/>
               </w:rPr>
-              <w:t>269533</w:t>
             </w:r>
           </w:p>
         </w:tc>
@@ -6914,7 +6864,9 @@
               </w:rPr>
             </w:pPr>
             <w:r>
-              <w:rPr/>
+              <w:rPr>
+                <w:sz w:val="14"/>
+              </w:rPr>
             </w:r>
           </w:p>
         </w:tc>
@@ -6937,7 +6889,9 @@
               </w:rPr>
             </w:pPr>
             <w:r>
-              <w:rPr/>
+              <w:rPr>
+                <w:sz w:val="14"/>
+              </w:rPr>
             </w:r>
           </w:p>
         </w:tc>
@@ -6960,7 +6914,9 @@
               </w:rPr>
             </w:pPr>
             <w:r>
-              <w:rPr/>
+              <w:rPr>
+                <w:sz w:val="14"/>
+              </w:rPr>
             </w:r>
           </w:p>
         </w:tc>
@@ -7058,7 +7014,9 @@
               </w:rPr>
             </w:pPr>
             <w:r>
-              <w:rPr/>
+              <w:rPr>
+                <w:sz w:val="14"/>
+              </w:rPr>
             </w:r>
           </w:p>
         </w:tc>
@@ -7084,7 +7042,6 @@
               <w:rPr>
                 <w:sz w:val="14"/>
               </w:rPr>
-              <w:t>16</w:t>
             </w:r>
           </w:p>
         </w:tc>
@@ -7110,7 +7067,6 @@
               <w:rPr>
                 <w:sz w:val="14"/>
               </w:rPr>
-              <w:t>Мехмеди Сара</w:t>
             </w:r>
           </w:p>
         </w:tc>
@@ -7136,7 +7092,6 @@
               <w:rPr>
                 <w:sz w:val="14"/>
               </w:rPr>
-              <w:t>272364</w:t>
             </w:r>
           </w:p>
         </w:tc>
@@ -7235,7 +7190,6 @@
               <w:rPr>
                 <w:sz w:val="14"/>
               </w:rPr>
-              <w:t>(8) 52</w:t>
             </w:r>
           </w:p>
         </w:tc>
@@ -7263,7 +7217,9 @@
               </w:rPr>
             </w:pPr>
             <w:r>
-              <w:rPr/>
+              <w:rPr>
+                <w:sz w:val="14"/>
+              </w:rPr>
             </w:r>
           </w:p>
         </w:tc>
@@ -7286,7 +7242,9 @@
               </w:rPr>
             </w:pPr>
             <w:r>
-              <w:rPr/>
+              <w:rPr>
+                <w:sz w:val="14"/>
+              </w:rPr>
             </w:r>
           </w:p>
         </w:tc>
@@ -7309,7 +7267,9 @@
               </w:rPr>
             </w:pPr>
             <w:r>
-              <w:rPr/>
+              <w:rPr>
+                <w:sz w:val="14"/>
+              </w:rPr>
             </w:r>
           </w:p>
         </w:tc>
@@ -7406,7 +7366,9 @@
               </w:rPr>
             </w:pPr>
             <w:r>
-              <w:rPr/>
+              <w:rPr>
+                <w:sz w:val="14"/>
+              </w:rPr>
             </w:r>
           </w:p>
         </w:tc>
@@ -7432,7 +7394,6 @@
               <w:rPr>
                 <w:sz w:val="14"/>
               </w:rPr>
-              <w:t>17</w:t>
             </w:r>
           </w:p>
         </w:tc>
@@ -7458,7 +7419,6 @@
               <w:rPr>
                 <w:sz w:val="14"/>
               </w:rPr>
-              <w:t>Лимани Бора</w:t>
             </w:r>
           </w:p>
         </w:tc>
@@ -7484,7 +7444,6 @@
               <w:rPr>
                 <w:sz w:val="14"/>
               </w:rPr>
-              <w:t>269898</w:t>
             </w:r>
           </w:p>
         </w:tc>
@@ -7791,7 +7750,6 @@
               <w:rPr>
                 <w:sz w:val="14"/>
               </w:rPr>
-              <w:t>18</w:t>
             </w:r>
           </w:p>
         </w:tc>
@@ -7817,7 +7775,6 @@
               <w:rPr>
                 <w:sz w:val="14"/>
               </w:rPr>
-              <w:t>Шаќири Мелек</w:t>
             </w:r>
           </w:p>
         </w:tc>
@@ -7843,7 +7800,6 @@
               <w:rPr>
                 <w:sz w:val="14"/>
               </w:rPr>
-              <w:t>254579</w:t>
             </w:r>
           </w:p>
         </w:tc>
@@ -9652,7 +9608,9 @@
                                     </w:rPr>
                                   </w:pPr>
                                   <w:r>
-                                    <w:rPr/>
+                                    <w:rPr>
+                                      <w:sz w:val="12"/>
+                                    </w:rPr>
                                   </w:r>
                                 </w:p>
                               </w:tc>
@@ -10290,7 +10248,9 @@
                                     </w:rPr>
                                   </w:pPr>
                                   <w:r>
-                                    <w:rPr/>
+                                    <w:rPr>
+                                      <w:sz w:val="12"/>
+                                    </w:rPr>
                                   </w:r>
                                 </w:p>
                               </w:tc>
@@ -10418,7 +10378,9 @@
                               </w:rPr>
                             </w:pPr>
                             <w:r>
-                              <w:rPr/>
+                              <w:rPr>
+                                <w:sz w:val="12"/>
+                              </w:rPr>
                             </w:r>
                           </w:p>
                         </w:tc>
@@ -11056,7 +11018,9 @@
                               </w:rPr>
                             </w:pPr>
                             <w:r>
-                              <w:rPr/>
+                              <w:rPr>
+                                <w:sz w:val="12"/>
+                              </w:rPr>
                             </w:r>
                           </w:p>
                         </w:tc>
@@ -11216,7 +11180,6 @@
                                     <w:rPr>
                                       <w:sz w:val="12"/>
                                     </w:rPr>
-                                    <w:t>Мерко Астрит</w:t>
                                   </w:r>
                                 </w:p>
                               </w:tc>
@@ -11294,7 +11257,9 @@
                                     </w:rPr>
                                   </w:pPr>
                                   <w:r>
-                                    <w:rPr/>
+                                    <w:rPr>
+                                      <w:sz w:val="12"/>
+                                    </w:rPr>
                                   </w:r>
                                 </w:p>
                               </w:tc>
@@ -11455,7 +11420,6 @@
                                     <w:rPr>
                                       <w:sz w:val="12"/>
                                     </w:rPr>
-                                    <w:t>Гучески Ненад</w:t>
                                   </w:r>
                                 </w:p>
                               </w:tc>
@@ -11533,7 +11497,9 @@
                                     </w:rPr>
                                   </w:pPr>
                                   <w:r>
-                                    <w:rPr/>
+                                    <w:rPr>
+                                      <w:sz w:val="12"/>
+                                    </w:rPr>
                                   </w:r>
                                 </w:p>
                               </w:tc>
@@ -11614,7 +11580,6 @@
                                     <w:rPr>
                                       <w:sz w:val="12"/>
                                     </w:rPr>
-                                    <w:t>Бојческа Марина</w:t>
                                   </w:r>
                                 </w:p>
                               </w:tc>
@@ -11695,7 +11660,6 @@
                                     <w:rPr>
                                       <w:sz w:val="12"/>
                                     </w:rPr>
-                                    <w:t>Миминоски Сефер</w:t>
                                   </w:r>
                                 </w:p>
                               </w:tc>
@@ -11773,7 +11737,9 @@
                                     </w:rPr>
                                   </w:pPr>
                                   <w:r>
-                                    <w:rPr/>
+                                    <w:rPr>
+                                      <w:sz w:val="12"/>
+                                    </w:rPr>
                                   </w:r>
                                 </w:p>
                               </w:tc>
@@ -11851,7 +11817,9 @@
                                     </w:rPr>
                                   </w:pPr>
                                   <w:r>
-                                    <w:rPr/>
+                                    <w:rPr>
+                                      <w:sz w:val="12"/>
+                                    </w:rPr>
                                   </w:r>
                                 </w:p>
                               </w:tc>
@@ -11982,7 +11950,6 @@
                               <w:rPr>
                                 <w:sz w:val="12"/>
                               </w:rPr>
-                              <w:t>Мерко Астрит</w:t>
                             </w:r>
                           </w:p>
                         </w:tc>
@@ -12060,7 +12027,9 @@
                               </w:rPr>
                             </w:pPr>
                             <w:r>
-                              <w:rPr/>
+                              <w:rPr>
+                                <w:sz w:val="12"/>
+                              </w:rPr>
                             </w:r>
                           </w:p>
                         </w:tc>
@@ -12221,7 +12190,6 @@
                               <w:rPr>
                                 <w:sz w:val="12"/>
                               </w:rPr>
-                              <w:t>Гучески Ненад</w:t>
                             </w:r>
                           </w:p>
                         </w:tc>
@@ -12299,7 +12267,9 @@
                               </w:rPr>
                             </w:pPr>
                             <w:r>
-                              <w:rPr/>
+                              <w:rPr>
+                                <w:sz w:val="12"/>
+                              </w:rPr>
                             </w:r>
                           </w:p>
                         </w:tc>
@@ -12380,7 +12350,6 @@
                               <w:rPr>
                                 <w:sz w:val="12"/>
                               </w:rPr>
-                              <w:t>Бојческа Марина</w:t>
                             </w:r>
                           </w:p>
                         </w:tc>
@@ -12461,7 +12430,6 @@
                               <w:rPr>
                                 <w:sz w:val="12"/>
                               </w:rPr>
-                              <w:t>Миминоски Сефер</w:t>
                             </w:r>
                           </w:p>
                         </w:tc>
@@ -12539,7 +12507,9 @@
                               </w:rPr>
                             </w:pPr>
                             <w:r>
-                              <w:rPr/>
+                              <w:rPr>
+                                <w:sz w:val="12"/>
+                              </w:rPr>
                             </w:r>
                           </w:p>
                         </w:tc>
@@ -12617,7 +12587,9 @@
                               </w:rPr>
                             </w:pPr>
                             <w:r>
-                              <w:rPr/>
+                              <w:rPr>
+                                <w:sz w:val="12"/>
+                              </w:rPr>
                             </w:r>
                           </w:p>
                         </w:tc>
@@ -12925,35 +12897,35 @@
                               <w:gridCol w:w="259"/>
                               <w:gridCol w:w="1"/>
                               <w:gridCol w:w="260"/>
-                              <w:gridCol w:w="286"/>
-                              <w:gridCol w:w="256"/>
+                              <w:gridCol w:w="289"/>
+                              <w:gridCol w:w="253"/>
                               <w:gridCol w:w="247"/>
                               <w:gridCol w:w="250"/>
-                              <w:gridCol w:w="285"/>
+                              <w:gridCol w:w="288"/>
                               <w:gridCol w:w="260"/>
-                              <w:gridCol w:w="265"/>
-                              <w:gridCol w:w="269"/>
+                              <w:gridCol w:w="268"/>
+                              <w:gridCol w:w="266"/>
                               <w:gridCol w:w="254"/>
                               <w:gridCol w:w="253"/>
-                              <w:gridCol w:w="265"/>
+                              <w:gridCol w:w="268"/>
                               <w:gridCol w:w="279"/>
-                              <w:gridCol w:w="257"/>
-                              <w:gridCol w:w="261"/>
+                              <w:gridCol w:w="254"/>
+                              <w:gridCol w:w="264"/>
                               <w:gridCol w:w="265"/>
                               <w:gridCol w:w="260"/>
-                              <w:gridCol w:w="257"/>
-                              <w:gridCol w:w="269"/>
-                              <w:gridCol w:w="264"/>
+                              <w:gridCol w:w="259"/>
+                              <w:gridCol w:w="268"/>
+                              <w:gridCol w:w="263"/>
                               <w:gridCol w:w="260"/>
-                              <w:gridCol w:w="261"/>
                               <w:gridCol w:w="264"/>
                               <w:gridCol w:w="264"/>
                               <w:gridCol w:w="263"/>
+                              <w:gridCol w:w="264"/>
                               <w:gridCol w:w="262"/>
                               <w:gridCol w:w="264"/>
-                              <w:gridCol w:w="263"/>
-                              <w:gridCol w:w="263"/>
-                              <w:gridCol w:w="171"/>
+                              <w:gridCol w:w="266"/>
+                              <w:gridCol w:w="262"/>
+                              <w:gridCol w:w="160"/>
                             </w:tblGrid>
                             <w:tr>
                               <w:trPr>
@@ -12980,7 +12952,11 @@
                                     </w:rPr>
                                   </w:pPr>
                                   <w:r>
-                                    <w:rPr/>
+                                    <w:rPr>
+                                      <w:rFonts w:ascii="Times New Roman" w:hAnsi="Times New Roman"/>
+                                      <w:sz w:val="12"/>
+                                      <w:szCs w:val="12"/>
+                                    </w:rPr>
                                   </w:r>
                                 </w:p>
                               </w:tc>
@@ -13005,7 +12981,11 @@
                                     </w:rPr>
                                   </w:pPr>
                                   <w:r>
-                                    <w:rPr/>
+                                    <w:rPr>
+                                      <w:rFonts w:ascii="Times New Roman" w:hAnsi="Times New Roman"/>
+                                      <w:sz w:val="12"/>
+                                      <w:szCs w:val="12"/>
+                                    </w:rPr>
                                   </w:r>
                                 </w:p>
                               </w:tc>
@@ -13069,7 +13049,7 @@
                               </w:tc>
                               <w:tc>
                                 <w:tcPr>
-                                  <w:tcW w:w="547" w:type="dxa"/>
+                                  <w:tcW w:w="550" w:type="dxa"/>
                                   <w:gridSpan w:val="3"/>
                                   <w:tcBorders>
                                     <w:top w:val="single" w:sz="2" w:space="0" w:color="000000"/>
@@ -13098,7 +13078,7 @@
                               </w:tc>
                               <w:tc>
                                 <w:tcPr>
-                                  <w:tcW w:w="503" w:type="dxa"/>
+                                  <w:tcW w:w="500" w:type="dxa"/>
                                   <w:gridSpan w:val="2"/>
                                   <w:tcBorders>
                                     <w:top w:val="single" w:sz="2" w:space="0" w:color="000000"/>
@@ -13127,7 +13107,7 @@
                               </w:tc>
                               <w:tc>
                                 <w:tcPr>
-                                  <w:tcW w:w="535" w:type="dxa"/>
+                                  <w:tcW w:w="538" w:type="dxa"/>
                                   <w:gridSpan w:val="2"/>
                                   <w:tcBorders>
                                     <w:top w:val="single" w:sz="2" w:space="0" w:color="000000"/>
@@ -13156,7 +13136,7 @@
                               </w:tc>
                               <w:tc>
                                 <w:tcPr>
-                                  <w:tcW w:w="525" w:type="dxa"/>
+                                  <w:tcW w:w="528" w:type="dxa"/>
                                   <w:gridSpan w:val="2"/>
                                   <w:tcBorders>
                                     <w:top w:val="single" w:sz="2" w:space="0" w:color="000000"/>
@@ -13185,7 +13165,7 @@
                               </w:tc>
                               <w:tc>
                                 <w:tcPr>
-                                  <w:tcW w:w="523" w:type="dxa"/>
+                                  <w:tcW w:w="520" w:type="dxa"/>
                                   <w:gridSpan w:val="2"/>
                                   <w:tcBorders>
                                     <w:top w:val="single" w:sz="2" w:space="0" w:color="000000"/>
@@ -13214,7 +13194,7 @@
                               </w:tc>
                               <w:tc>
                                 <w:tcPr>
-                                  <w:tcW w:w="518" w:type="dxa"/>
+                                  <w:tcW w:w="521" w:type="dxa"/>
                                   <w:gridSpan w:val="2"/>
                                   <w:tcBorders>
                                     <w:top w:val="single" w:sz="2" w:space="0" w:color="000000"/>
@@ -13243,7 +13223,142 @@
                               </w:tc>
                               <w:tc>
                                 <w:tcPr>
-                                  <w:tcW w:w="536" w:type="dxa"/>
+                                  <w:tcW w:w="533" w:type="dxa"/>
+                                  <w:gridSpan w:val="2"/>
+                                  <w:tcBorders>
+                                    <w:top w:val="single" w:sz="2" w:space="0" w:color="000000"/>
+                                    <w:left w:val="single" w:sz="2" w:space="0" w:color="000000"/>
+                                    <w:bottom w:val="single" w:sz="2" w:space="0" w:color="000000"/>
+                                    <w:right w:val="single" w:sz="2" w:space="0" w:color="000000"/>
+                                  </w:tcBorders>
+                                </w:tcPr>
+                                <w:p>
+                                  <w:pPr>
+                                    <w:pStyle w:val="TableParagraph"/>
+                                    <w:rPr>
+                                      <w:rFonts w:ascii="Times New Roman" w:hAnsi="Times New Roman"/>
+                                      <w:sz w:val="12"/>
+                                    </w:rPr>
+                                  </w:pPr>
+                                  <w:r>
+                                    <w:rPr>
+                                      <w:rFonts w:ascii="Times New Roman" w:hAnsi="Times New Roman"/>
+                                      <w:sz w:val="12"/>
+                                    </w:rPr>
+                                  </w:r>
+                                </w:p>
+                              </w:tc>
+                              <w:tc>
+                                <w:tcPr>
+                                  <w:tcW w:w="529" w:type="dxa"/>
+                                  <w:gridSpan w:val="2"/>
+                                  <w:tcBorders>
+                                    <w:top w:val="single" w:sz="2" w:space="0" w:color="000000"/>
+                                    <w:left w:val="single" w:sz="2" w:space="0" w:color="000000"/>
+                                    <w:bottom w:val="single" w:sz="2" w:space="0" w:color="000000"/>
+                                    <w:right w:val="single" w:sz="2" w:space="0" w:color="000000"/>
+                                  </w:tcBorders>
+                                </w:tcPr>
+                                <w:p>
+                                  <w:pPr>
+                                    <w:pStyle w:val="TableParagraph"/>
+                                    <w:rPr>
+                                      <w:rFonts w:ascii="Times New Roman" w:hAnsi="Times New Roman"/>
+                                      <w:sz w:val="12"/>
+                                    </w:rPr>
+                                  </w:pPr>
+                                  <w:r>
+                                    <w:rPr>
+                                      <w:rFonts w:ascii="Times New Roman" w:hAnsi="Times New Roman"/>
+                                      <w:sz w:val="12"/>
+                                    </w:rPr>
+                                  </w:r>
+                                </w:p>
+                              </w:tc>
+                              <w:tc>
+                                <w:tcPr>
+                                  <w:tcW w:w="519" w:type="dxa"/>
+                                  <w:gridSpan w:val="2"/>
+                                  <w:tcBorders>
+                                    <w:top w:val="single" w:sz="2" w:space="0" w:color="000000"/>
+                                    <w:left w:val="single" w:sz="2" w:space="0" w:color="000000"/>
+                                    <w:bottom w:val="single" w:sz="2" w:space="0" w:color="000000"/>
+                                    <w:right w:val="single" w:sz="2" w:space="0" w:color="000000"/>
+                                  </w:tcBorders>
+                                </w:tcPr>
+                                <w:p>
+                                  <w:pPr>
+                                    <w:pStyle w:val="TableParagraph"/>
+                                    <w:rPr>
+                                      <w:rFonts w:ascii="Times New Roman" w:hAnsi="Times New Roman"/>
+                                      <w:sz w:val="12"/>
+                                    </w:rPr>
+                                  </w:pPr>
+                                  <w:r>
+                                    <w:rPr>
+                                      <w:rFonts w:ascii="Times New Roman" w:hAnsi="Times New Roman"/>
+                                      <w:sz w:val="12"/>
+                                    </w:rPr>
+                                  </w:r>
+                                </w:p>
+                              </w:tc>
+                              <w:tc>
+                                <w:tcPr>
+                                  <w:tcW w:w="531" w:type="dxa"/>
+                                  <w:gridSpan w:val="2"/>
+                                  <w:tcBorders>
+                                    <w:top w:val="single" w:sz="2" w:space="0" w:color="000000"/>
+                                    <w:left w:val="single" w:sz="2" w:space="0" w:color="000000"/>
+                                    <w:bottom w:val="single" w:sz="2" w:space="0" w:color="000000"/>
+                                    <w:right w:val="single" w:sz="2" w:space="0" w:color="000000"/>
+                                  </w:tcBorders>
+                                </w:tcPr>
+                                <w:p>
+                                  <w:pPr>
+                                    <w:pStyle w:val="TableParagraph"/>
+                                    <w:rPr>
+                                      <w:rFonts w:ascii="Times New Roman" w:hAnsi="Times New Roman"/>
+                                      <w:sz w:val="12"/>
+                                    </w:rPr>
+                                  </w:pPr>
+                                  <w:r>
+                                    <w:rPr>
+                                      <w:rFonts w:ascii="Times New Roman" w:hAnsi="Times New Roman"/>
+                                      <w:sz w:val="12"/>
+                                    </w:rPr>
+                                  </w:r>
+                                </w:p>
+                              </w:tc>
+                              <w:tc>
+                                <w:tcPr>
+                                  <w:tcW w:w="524" w:type="dxa"/>
+                                  <w:gridSpan w:val="2"/>
+                                  <w:tcBorders>
+                                    <w:top w:val="single" w:sz="2" w:space="0" w:color="000000"/>
+                                    <w:left w:val="single" w:sz="2" w:space="0" w:color="000000"/>
+                                    <w:bottom w:val="single" w:sz="2" w:space="0" w:color="000000"/>
+                                    <w:right w:val="single" w:sz="2" w:space="0" w:color="000000"/>
+                                  </w:tcBorders>
+                                </w:tcPr>
+                                <w:p>
+                                  <w:pPr>
+                                    <w:pStyle w:val="TableParagraph"/>
+                                    <w:rPr>
+                                      <w:rFonts w:ascii="Times New Roman" w:hAnsi="Times New Roman"/>
+                                      <w:sz w:val="12"/>
+                                    </w:rPr>
+                                  </w:pPr>
+                                  <w:r>
+                                    <w:rPr>
+                                      <w:rFonts w:ascii="Times New Roman" w:hAnsi="Times New Roman"/>
+                                      <w:sz w:val="12"/>
+                                    </w:rPr>
+                                  </w:r>
+                                </w:p>
+                              </w:tc>
+                              <w:tc>
+                                <w:tcPr>
+                                  <w:tcW w:w="527" w:type="dxa"/>
                                   <w:gridSpan w:val="2"/>
                                   <w:tcBorders>
                                     <w:top w:val="single" w:sz="2" w:space="0" w:color="000000"/>
@@ -13297,7 +13412,7 @@
                               </w:tc>
                               <w:tc>
                                 <w:tcPr>
-                                  <w:tcW w:w="517" w:type="dxa"/>
+                                  <w:tcW w:w="530" w:type="dxa"/>
                                   <w:gridSpan w:val="2"/>
                                   <w:tcBorders>
                                     <w:top w:val="single" w:sz="2" w:space="0" w:color="000000"/>
@@ -13324,142 +13439,7 @@
                               </w:tc>
                               <w:tc>
                                 <w:tcPr>
-                                  <w:tcW w:w="533" w:type="dxa"/>
-                                  <w:gridSpan w:val="2"/>
-                                  <w:tcBorders>
-                                    <w:top w:val="single" w:sz="2" w:space="0" w:color="000000"/>
-                                    <w:left w:val="single" w:sz="2" w:space="0" w:color="000000"/>
-                                    <w:bottom w:val="single" w:sz="2" w:space="0" w:color="000000"/>
-                                    <w:right w:val="single" w:sz="2" w:space="0" w:color="000000"/>
-                                  </w:tcBorders>
-                                </w:tcPr>
-                                <w:p>
-                                  <w:pPr>
-                                    <w:pStyle w:val="TableParagraph"/>
-                                    <w:rPr>
-                                      <w:rFonts w:ascii="Times New Roman" w:hAnsi="Times New Roman"/>
-                                      <w:sz w:val="12"/>
-                                    </w:rPr>
-                                  </w:pPr>
-                                  <w:r>
-                                    <w:rPr>
-                                      <w:rFonts w:ascii="Times New Roman" w:hAnsi="Times New Roman"/>
-                                      <w:sz w:val="12"/>
-                                    </w:rPr>
-                                  </w:r>
-                                </w:p>
-                              </w:tc>
-                              <w:tc>
-                                <w:tcPr>
-                                  <w:tcW w:w="521" w:type="dxa"/>
-                                  <w:gridSpan w:val="2"/>
-                                  <w:tcBorders>
-                                    <w:top w:val="single" w:sz="2" w:space="0" w:color="000000"/>
-                                    <w:left w:val="single" w:sz="2" w:space="0" w:color="000000"/>
-                                    <w:bottom w:val="single" w:sz="2" w:space="0" w:color="000000"/>
-                                    <w:right w:val="single" w:sz="2" w:space="0" w:color="000000"/>
-                                  </w:tcBorders>
-                                </w:tcPr>
-                                <w:p>
-                                  <w:pPr>
-                                    <w:pStyle w:val="TableParagraph"/>
-                                    <w:rPr>
-                                      <w:rFonts w:ascii="Times New Roman" w:hAnsi="Times New Roman"/>
-                                      <w:sz w:val="12"/>
-                                    </w:rPr>
-                                  </w:pPr>
-                                  <w:r>
-                                    <w:rPr>
-                                      <w:rFonts w:ascii="Times New Roman" w:hAnsi="Times New Roman"/>
-                                      <w:sz w:val="12"/>
-                                    </w:rPr>
-                                  </w:r>
-                                </w:p>
-                              </w:tc>
-                              <w:tc>
-                                <w:tcPr>
-                                  <w:tcW w:w="528" w:type="dxa"/>
-                                  <w:gridSpan w:val="2"/>
-                                  <w:tcBorders>
-                                    <w:top w:val="single" w:sz="2" w:space="0" w:color="000000"/>
-                                    <w:left w:val="single" w:sz="2" w:space="0" w:color="000000"/>
-                                    <w:bottom w:val="single" w:sz="2" w:space="0" w:color="000000"/>
-                                    <w:right w:val="single" w:sz="2" w:space="0" w:color="000000"/>
-                                  </w:tcBorders>
-                                </w:tcPr>
-                                <w:p>
-                                  <w:pPr>
-                                    <w:pStyle w:val="TableParagraph"/>
-                                    <w:rPr>
-                                      <w:rFonts w:ascii="Times New Roman" w:hAnsi="Times New Roman"/>
-                                      <w:sz w:val="12"/>
-                                    </w:rPr>
-                                  </w:pPr>
-                                  <w:r>
-                                    <w:rPr>
-                                      <w:rFonts w:ascii="Times New Roman" w:hAnsi="Times New Roman"/>
-                                      <w:sz w:val="12"/>
-                                    </w:rPr>
-                                  </w:r>
-                                </w:p>
-                              </w:tc>
-                              <w:tc>
-                                <w:tcPr>
-                                  <w:tcW w:w="525" w:type="dxa"/>
-                                  <w:gridSpan w:val="2"/>
-                                  <w:tcBorders>
-                                    <w:top w:val="single" w:sz="2" w:space="0" w:color="000000"/>
-                                    <w:left w:val="single" w:sz="2" w:space="0" w:color="000000"/>
-                                    <w:bottom w:val="single" w:sz="2" w:space="0" w:color="000000"/>
-                                    <w:right w:val="single" w:sz="2" w:space="0" w:color="000000"/>
-                                  </w:tcBorders>
-                                </w:tcPr>
-                                <w:p>
-                                  <w:pPr>
-                                    <w:pStyle w:val="TableParagraph"/>
-                                    <w:rPr>
-                                      <w:rFonts w:ascii="Times New Roman" w:hAnsi="Times New Roman"/>
-                                      <w:sz w:val="12"/>
-                                    </w:rPr>
-                                  </w:pPr>
-                                  <w:r>
-                                    <w:rPr>
-                                      <w:rFonts w:ascii="Times New Roman" w:hAnsi="Times New Roman"/>
-                                      <w:sz w:val="12"/>
-                                    </w:rPr>
-                                  </w:r>
-                                </w:p>
-                              </w:tc>
-                              <w:tc>
-                                <w:tcPr>
-                                  <w:tcW w:w="527" w:type="dxa"/>
-                                  <w:gridSpan w:val="2"/>
-                                  <w:tcBorders>
-                                    <w:top w:val="single" w:sz="2" w:space="0" w:color="000000"/>
-                                    <w:left w:val="single" w:sz="2" w:space="0" w:color="000000"/>
-                                    <w:bottom w:val="single" w:sz="2" w:space="0" w:color="000000"/>
-                                    <w:right w:val="single" w:sz="2" w:space="0" w:color="000000"/>
-                                  </w:tcBorders>
-                                </w:tcPr>
-                                <w:p>
-                                  <w:pPr>
-                                    <w:pStyle w:val="TableParagraph"/>
-                                    <w:rPr>
-                                      <w:rFonts w:ascii="Times New Roman" w:hAnsi="Times New Roman"/>
-                                      <w:sz w:val="12"/>
-                                    </w:rPr>
-                                  </w:pPr>
-                                  <w:r>
-                                    <w:rPr>
-                                      <w:rFonts w:ascii="Times New Roman" w:hAnsi="Times New Roman"/>
-                                      <w:sz w:val="12"/>
-                                    </w:rPr>
-                                  </w:r>
-                                </w:p>
-                              </w:tc>
-                              <w:tc>
-                                <w:tcPr>
-                                  <w:tcW w:w="434" w:type="dxa"/>
+                                  <w:tcW w:w="422" w:type="dxa"/>
                                   <w:gridSpan w:val="2"/>
                                   <w:tcBorders>
                                     <w:top w:val="single" w:sz="2" w:space="0" w:color="000000"/>
@@ -13508,7 +13488,10 @@
                                     </w:rPr>
                                   </w:pPr>
                                   <w:r>
-                                    <w:rPr/>
+                                    <w:rPr>
+                                      <w:rFonts w:ascii="Times New Roman" w:hAnsi="Times New Roman"/>
+                                      <w:sz w:val="12"/>
+                                    </w:rPr>
                                   </w:r>
                                 </w:p>
                               </w:tc>
@@ -13532,7 +13515,10 @@
                                     </w:rPr>
                                   </w:pPr>
                                   <w:r>
-                                    <w:rPr/>
+                                    <w:rPr>
+                                      <w:rFonts w:ascii="Times New Roman" w:hAnsi="Times New Roman"/>
+                                      <w:sz w:val="12"/>
+                                    </w:rPr>
                                   </w:r>
                                 </w:p>
                               </w:tc>
@@ -13555,7 +13541,10 @@
                                     </w:rPr>
                                   </w:pPr>
                                   <w:r>
-                                    <w:rPr/>
+                                    <w:rPr>
+                                      <w:rFonts w:ascii="Times New Roman" w:hAnsi="Times New Roman"/>
+                                      <w:sz w:val="12"/>
+                                    </w:rPr>
                                   </w:r>
                                 </w:p>
                               </w:tc>
@@ -13578,7 +13567,10 @@
                                     </w:rPr>
                                   </w:pPr>
                                   <w:r>
-                                    <w:rPr/>
+                                    <w:rPr>
+                                      <w:rFonts w:ascii="Times New Roman" w:hAnsi="Times New Roman"/>
+                                      <w:sz w:val="12"/>
+                                    </w:rPr>
                                   </w:r>
                                 </w:p>
                               </w:tc>
@@ -13715,7 +13707,7 @@
                               </w:tc>
                               <w:tc>
                                 <w:tcPr>
-                                  <w:tcW w:w="286" w:type="dxa"/>
+                                  <w:tcW w:w="289" w:type="dxa"/>
                                   <w:tcBorders>
                                     <w:top w:val="single" w:sz="2" w:space="0" w:color="000000"/>
                                     <w:left w:val="single" w:sz="2" w:space="0" w:color="000000"/>
@@ -13741,7 +13733,7 @@
                               </w:tc>
                               <w:tc>
                                 <w:tcPr>
-                                  <w:tcW w:w="256" w:type="dxa"/>
+                                  <w:tcW w:w="253" w:type="dxa"/>
                                   <w:tcBorders>
                                     <w:top w:val="single" w:sz="2" w:space="0" w:color="000000"/>
                                     <w:left w:val="single" w:sz="2" w:space="0" w:color="000000"/>
@@ -13819,7 +13811,7 @@
                               </w:tc>
                               <w:tc>
                                 <w:tcPr>
-                                  <w:tcW w:w="285" w:type="dxa"/>
+                                  <w:tcW w:w="288" w:type="dxa"/>
                                   <w:tcBorders>
                                     <w:top w:val="single" w:sz="2" w:space="0" w:color="000000"/>
                                     <w:left w:val="single" w:sz="2" w:space="0" w:color="000000"/>
@@ -13871,7 +13863,7 @@
                               </w:tc>
                               <w:tc>
                                 <w:tcPr>
-                                  <w:tcW w:w="265" w:type="dxa"/>
+                                  <w:tcW w:w="268" w:type="dxa"/>
                                   <w:tcBorders>
                                     <w:top w:val="single" w:sz="2" w:space="0" w:color="000000"/>
                                     <w:left w:val="single" w:sz="2" w:space="0" w:color="000000"/>
@@ -13897,7 +13889,7 @@
                               </w:tc>
                               <w:tc>
                                 <w:tcPr>
-                                  <w:tcW w:w="269" w:type="dxa"/>
+                                  <w:tcW w:w="266" w:type="dxa"/>
                                   <w:tcBorders>
                                     <w:top w:val="single" w:sz="2" w:space="0" w:color="000000"/>
                                     <w:left w:val="single" w:sz="2" w:space="0" w:color="000000"/>
@@ -13975,7 +13967,7 @@
                               </w:tc>
                               <w:tc>
                                 <w:tcPr>
-                                  <w:tcW w:w="265" w:type="dxa"/>
+                                  <w:tcW w:w="268" w:type="dxa"/>
                                   <w:tcBorders>
                                     <w:top w:val="single" w:sz="2" w:space="0" w:color="000000"/>
                                     <w:left w:val="single" w:sz="2" w:space="0" w:color="000000"/>
@@ -14027,7 +14019,7 @@
                               </w:tc>
                               <w:tc>
                                 <w:tcPr>
-                                  <w:tcW w:w="257" w:type="dxa"/>
+                                  <w:tcW w:w="254" w:type="dxa"/>
                                   <w:tcBorders>
                                     <w:top w:val="single" w:sz="2" w:space="0" w:color="000000"/>
                                     <w:left w:val="single" w:sz="2" w:space="0" w:color="000000"/>
@@ -14053,7 +14045,7 @@
                               </w:tc>
                               <w:tc>
                                 <w:tcPr>
-                                  <w:tcW w:w="261" w:type="dxa"/>
+                                  <w:tcW w:w="264" w:type="dxa"/>
                                   <w:tcBorders>
                                     <w:top w:val="single" w:sz="2" w:space="0" w:color="000000"/>
                                     <w:left w:val="single" w:sz="2" w:space="0" w:color="000000"/>
@@ -14131,7 +14123,7 @@
                               </w:tc>
                               <w:tc>
                                 <w:tcPr>
-                                  <w:tcW w:w="257" w:type="dxa"/>
+                                  <w:tcW w:w="259" w:type="dxa"/>
                                   <w:tcBorders>
                                     <w:top w:val="single" w:sz="2" w:space="0" w:color="000000"/>
                                     <w:left w:val="single" w:sz="2" w:space="0" w:color="000000"/>
@@ -14157,7 +14149,59 @@
                               </w:tc>
                               <w:tc>
                                 <w:tcPr>
-                                  <w:tcW w:w="269" w:type="dxa"/>
+                                  <w:tcW w:w="268" w:type="dxa"/>
+                                  <w:tcBorders>
+                                    <w:top w:val="single" w:sz="2" w:space="0" w:color="000000"/>
+                                    <w:left w:val="single" w:sz="2" w:space="0" w:color="000000"/>
+                                    <w:bottom w:val="single" w:sz="2" w:space="0" w:color="000000"/>
+                                    <w:right w:val="single" w:sz="2" w:space="0" w:color="000000"/>
+                                  </w:tcBorders>
+                                </w:tcPr>
+                                <w:p>
+                                  <w:pPr>
+                                    <w:pStyle w:val="TableParagraph"/>
+                                    <w:rPr>
+                                      <w:rFonts w:ascii="Times New Roman" w:hAnsi="Times New Roman"/>
+                                      <w:sz w:val="12"/>
+                                    </w:rPr>
+                                  </w:pPr>
+                                  <w:r>
+                                    <w:rPr>
+                                      <w:rFonts w:ascii="Times New Roman" w:hAnsi="Times New Roman"/>
+                                      <w:sz w:val="12"/>
+                                    </w:rPr>
+                                  </w:r>
+                                </w:p>
+                              </w:tc>
+                              <w:tc>
+                                <w:tcPr>
+                                  <w:tcW w:w="263" w:type="dxa"/>
+                                  <w:tcBorders>
+                                    <w:top w:val="single" w:sz="2" w:space="0" w:color="000000"/>
+                                    <w:left w:val="single" w:sz="2" w:space="0" w:color="000000"/>
+                                    <w:bottom w:val="single" w:sz="2" w:space="0" w:color="000000"/>
+                                    <w:right w:val="single" w:sz="2" w:space="0" w:color="000000"/>
+                                  </w:tcBorders>
+                                </w:tcPr>
+                                <w:p>
+                                  <w:pPr>
+                                    <w:pStyle w:val="TableParagraph"/>
+                                    <w:rPr>
+                                      <w:rFonts w:ascii="Times New Roman" w:hAnsi="Times New Roman"/>
+                                      <w:sz w:val="12"/>
+                                    </w:rPr>
+                                  </w:pPr>
+                                  <w:r>
+                                    <w:rPr>
+                                      <w:rFonts w:ascii="Times New Roman" w:hAnsi="Times New Roman"/>
+                                      <w:sz w:val="12"/>
+                                    </w:rPr>
+                                  </w:r>
+                                </w:p>
+                              </w:tc>
+                              <w:tc>
+                                <w:tcPr>
+                                  <w:tcW w:w="260" w:type="dxa"/>
                                   <w:tcBorders>
                                     <w:top w:val="single" w:sz="2" w:space="0" w:color="000000"/>
                                     <w:left w:val="single" w:sz="2" w:space="0" w:color="000000"/>
@@ -14209,7 +14253,7 @@
                               </w:tc>
                               <w:tc>
                                 <w:tcPr>
-                                  <w:tcW w:w="260" w:type="dxa"/>
+                                  <w:tcW w:w="264" w:type="dxa"/>
                                   <w:tcBorders>
                                     <w:top w:val="single" w:sz="2" w:space="0" w:color="000000"/>
                                     <w:left w:val="single" w:sz="2" w:space="0" w:color="000000"/>
@@ -14235,7 +14279,7 @@
                               </w:tc>
                               <w:tc>
                                 <w:tcPr>
-                                  <w:tcW w:w="261" w:type="dxa"/>
+                                  <w:tcW w:w="263" w:type="dxa"/>
                                   <w:tcBorders>
                                     <w:top w:val="single" w:sz="2" w:space="0" w:color="000000"/>
                                     <w:left w:val="single" w:sz="2" w:space="0" w:color="000000"/>
@@ -14287,6 +14331,32 @@
                               </w:tc>
                               <w:tc>
                                 <w:tcPr>
+                                  <w:tcW w:w="262" w:type="dxa"/>
+                                  <w:tcBorders>
+                                    <w:top w:val="single" w:sz="2" w:space="0" w:color="000000"/>
+                                    <w:left w:val="single" w:sz="2" w:space="0" w:color="000000"/>
+                                    <w:bottom w:val="single" w:sz="2" w:space="0" w:color="000000"/>
+                                    <w:right w:val="single" w:sz="2" w:space="0" w:color="000000"/>
+                                  </w:tcBorders>
+                                </w:tcPr>
+                                <w:p>
+                                  <w:pPr>
+                                    <w:pStyle w:val="TableParagraph"/>
+                                    <w:rPr>
+                                      <w:rFonts w:ascii="Times New Roman" w:hAnsi="Times New Roman"/>
+                                      <w:sz w:val="12"/>
+                                    </w:rPr>
+                                  </w:pPr>
+                                  <w:r>
+                                    <w:rPr>
+                                      <w:rFonts w:ascii="Times New Roman" w:hAnsi="Times New Roman"/>
+                                      <w:sz w:val="12"/>
+                                    </w:rPr>
+                                  </w:r>
+                                </w:p>
+                              </w:tc>
+                              <w:tc>
+                                <w:tcPr>
                                   <w:tcW w:w="264" w:type="dxa"/>
                                   <w:tcBorders>
                                     <w:top w:val="single" w:sz="2" w:space="0" w:color="000000"/>
@@ -14313,7 +14383,7 @@
                               </w:tc>
                               <w:tc>
                                 <w:tcPr>
-                                  <w:tcW w:w="263" w:type="dxa"/>
+                                  <w:tcW w:w="266" w:type="dxa"/>
                                   <w:tcBorders>
                                     <w:top w:val="single" w:sz="2" w:space="0" w:color="000000"/>
                                     <w:left w:val="single" w:sz="2" w:space="0" w:color="000000"/>
@@ -14365,85 +14435,7 @@
                               </w:tc>
                               <w:tc>
                                 <w:tcPr>
-                                  <w:tcW w:w="264" w:type="dxa"/>
-                                  <w:tcBorders>
-                                    <w:top w:val="single" w:sz="2" w:space="0" w:color="000000"/>
-                                    <w:left w:val="single" w:sz="2" w:space="0" w:color="000000"/>
-                                    <w:bottom w:val="single" w:sz="2" w:space="0" w:color="000000"/>
-                                    <w:right w:val="single" w:sz="2" w:space="0" w:color="000000"/>
-                                  </w:tcBorders>
-                                </w:tcPr>
-                                <w:p>
-                                  <w:pPr>
-                                    <w:pStyle w:val="TableParagraph"/>
-                                    <w:rPr>
-                                      <w:rFonts w:ascii="Times New Roman" w:hAnsi="Times New Roman"/>
-                                      <w:sz w:val="12"/>
-                                    </w:rPr>
-                                  </w:pPr>
-                                  <w:r>
-                                    <w:rPr>
-                                      <w:rFonts w:ascii="Times New Roman" w:hAnsi="Times New Roman"/>
-                                      <w:sz w:val="12"/>
-                                    </w:rPr>
-                                  </w:r>
-                                </w:p>
-                              </w:tc>
-                              <w:tc>
-                                <w:tcPr>
-                                  <w:tcW w:w="263" w:type="dxa"/>
-                                  <w:tcBorders>
-                                    <w:top w:val="single" w:sz="2" w:space="0" w:color="000000"/>
-                                    <w:left w:val="single" w:sz="2" w:space="0" w:color="000000"/>
-                                    <w:bottom w:val="single" w:sz="2" w:space="0" w:color="000000"/>
-                                    <w:right w:val="single" w:sz="2" w:space="0" w:color="000000"/>
-                                  </w:tcBorders>
-                                </w:tcPr>
-                                <w:p>
-                                  <w:pPr>
-                                    <w:pStyle w:val="TableParagraph"/>
-                                    <w:rPr>
-                                      <w:rFonts w:ascii="Times New Roman" w:hAnsi="Times New Roman"/>
-                                      <w:sz w:val="12"/>
-                                    </w:rPr>
-                                  </w:pPr>
-                                  <w:r>
-                                    <w:rPr>
-                                      <w:rFonts w:ascii="Times New Roman" w:hAnsi="Times New Roman"/>
-                                      <w:sz w:val="12"/>
-                                    </w:rPr>
-                                  </w:r>
-                                </w:p>
-                              </w:tc>
-                              <w:tc>
-                                <w:tcPr>
-                                  <w:tcW w:w="263" w:type="dxa"/>
-                                  <w:tcBorders>
-                                    <w:top w:val="single" w:sz="2" w:space="0" w:color="000000"/>
-                                    <w:left w:val="single" w:sz="2" w:space="0" w:color="000000"/>
-                                    <w:bottom w:val="single" w:sz="2" w:space="0" w:color="000000"/>
-                                    <w:right w:val="single" w:sz="2" w:space="0" w:color="000000"/>
-                                  </w:tcBorders>
-                                </w:tcPr>
-                                <w:p>
-                                  <w:pPr>
-                                    <w:pStyle w:val="TableParagraph"/>
-                                    <w:rPr>
-                                      <w:rFonts w:ascii="Times New Roman" w:hAnsi="Times New Roman"/>
-                                      <w:sz w:val="12"/>
-                                    </w:rPr>
-                                  </w:pPr>
-                                  <w:r>
-                                    <w:rPr>
-                                      <w:rFonts w:ascii="Times New Roman" w:hAnsi="Times New Roman"/>
-                                      <w:sz w:val="12"/>
-                                    </w:rPr>
-                                  </w:r>
-                                </w:p>
-                              </w:tc>
-                              <w:tc>
-                                <w:tcPr>
-                                  <w:tcW w:w="171" w:type="dxa"/>
+                                  <w:tcW w:w="160" w:type="dxa"/>
                                   <w:tcBorders>
                                     <w:top w:val="single" w:sz="2" w:space="0" w:color="000000"/>
                                     <w:left w:val="single" w:sz="2" w:space="0" w:color="000000"/>
@@ -14582,7 +14574,7 @@
                               </w:tc>
                               <w:tc>
                                 <w:tcPr>
-                                  <w:tcW w:w="547" w:type="dxa"/>
+                                  <w:tcW w:w="550" w:type="dxa"/>
                                   <w:gridSpan w:val="3"/>
                                   <w:tcBorders>
                                     <w:top w:val="single" w:sz="2" w:space="0" w:color="000000"/>
@@ -14609,7 +14601,7 @@
                               </w:tc>
                               <w:tc>
                                 <w:tcPr>
-                                  <w:tcW w:w="503" w:type="dxa"/>
+                                  <w:tcW w:w="500" w:type="dxa"/>
                                   <w:gridSpan w:val="2"/>
                                   <w:tcBorders>
                                     <w:top w:val="single" w:sz="2" w:space="0" w:color="000000"/>
@@ -14636,7 +14628,7 @@
                               </w:tc>
                               <w:tc>
                                 <w:tcPr>
-                                  <w:tcW w:w="535" w:type="dxa"/>
+                                  <w:tcW w:w="538" w:type="dxa"/>
                                   <w:gridSpan w:val="2"/>
                                   <w:tcBorders>
                                     <w:top w:val="single" w:sz="2" w:space="0" w:color="000000"/>
@@ -14663,7 +14655,7 @@
                               </w:tc>
                               <w:tc>
                                 <w:tcPr>
-                                  <w:tcW w:w="525" w:type="dxa"/>
+                                  <w:tcW w:w="528" w:type="dxa"/>
                                   <w:gridSpan w:val="2"/>
                                   <w:tcBorders>
                                     <w:top w:val="single" w:sz="2" w:space="0" w:color="000000"/>
@@ -14690,7 +14682,7 @@
                               </w:tc>
                               <w:tc>
                                 <w:tcPr>
-                                  <w:tcW w:w="523" w:type="dxa"/>
+                                  <w:tcW w:w="520" w:type="dxa"/>
                                   <w:gridSpan w:val="2"/>
                                   <w:tcBorders>
                                     <w:top w:val="single" w:sz="2" w:space="0" w:color="000000"/>
@@ -14717,7 +14709,7 @@
                               </w:tc>
                               <w:tc>
                                 <w:tcPr>
-                                  <w:tcW w:w="518" w:type="dxa"/>
+                                  <w:tcW w:w="521" w:type="dxa"/>
                                   <w:gridSpan w:val="2"/>
                                   <w:tcBorders>
                                     <w:top w:val="single" w:sz="2" w:space="0" w:color="000000"/>
@@ -14744,7 +14736,142 @@
                               </w:tc>
                               <w:tc>
                                 <w:tcPr>
-                                  <w:tcW w:w="536" w:type="dxa"/>
+                                  <w:tcW w:w="533" w:type="dxa"/>
+                                  <w:gridSpan w:val="2"/>
+                                  <w:tcBorders>
+                                    <w:top w:val="single" w:sz="2" w:space="0" w:color="000000"/>
+                                    <w:left w:val="single" w:sz="2" w:space="0" w:color="000000"/>
+                                    <w:bottom w:val="single" w:sz="2" w:space="0" w:color="000000"/>
+                                    <w:right w:val="single" w:sz="2" w:space="0" w:color="000000"/>
+                                  </w:tcBorders>
+                                </w:tcPr>
+                                <w:p>
+                                  <w:pPr>
+                                    <w:pStyle w:val="TableParagraph"/>
+                                    <w:rPr>
+                                      <w:rFonts w:ascii="Times New Roman" w:hAnsi="Times New Roman"/>
+                                      <w:sz w:val="12"/>
+                                    </w:rPr>
+                                  </w:pPr>
+                                  <w:r>
+                                    <w:rPr>
+                                      <w:rFonts w:ascii="Times New Roman" w:hAnsi="Times New Roman"/>
+                                      <w:sz w:val="12"/>
+                                    </w:rPr>
+                                  </w:r>
+                                </w:p>
+                              </w:tc>
+                              <w:tc>
+                                <w:tcPr>
+                                  <w:tcW w:w="529" w:type="dxa"/>
+                                  <w:gridSpan w:val="2"/>
+                                  <w:tcBorders>
+                                    <w:top w:val="single" w:sz="2" w:space="0" w:color="000000"/>
+                                    <w:left w:val="single" w:sz="2" w:space="0" w:color="000000"/>
+                                    <w:bottom w:val="single" w:sz="2" w:space="0" w:color="000000"/>
+                                    <w:right w:val="single" w:sz="2" w:space="0" w:color="000000"/>
+                                  </w:tcBorders>
+                                </w:tcPr>
+                                <w:p>
+                                  <w:pPr>
+                                    <w:pStyle w:val="TableParagraph"/>
+                                    <w:rPr>
+                                      <w:rFonts w:ascii="Times New Roman" w:hAnsi="Times New Roman"/>
+                                      <w:sz w:val="12"/>
+                                    </w:rPr>
+                                  </w:pPr>
+                                  <w:r>
+                                    <w:rPr>
+                                      <w:rFonts w:ascii="Times New Roman" w:hAnsi="Times New Roman"/>
+                                      <w:sz w:val="12"/>
+                                    </w:rPr>
+                                  </w:r>
+                                </w:p>
+                              </w:tc>
+                              <w:tc>
+                                <w:tcPr>
+                                  <w:tcW w:w="519" w:type="dxa"/>
+                                  <w:gridSpan w:val="2"/>
+                                  <w:tcBorders>
+                                    <w:top w:val="single" w:sz="2" w:space="0" w:color="000000"/>
+                                    <w:left w:val="single" w:sz="2" w:space="0" w:color="000000"/>
+                                    <w:bottom w:val="single" w:sz="2" w:space="0" w:color="000000"/>
+                                    <w:right w:val="single" w:sz="2" w:space="0" w:color="000000"/>
+                                  </w:tcBorders>
+                                </w:tcPr>
+                                <w:p>
+                                  <w:pPr>
+                                    <w:pStyle w:val="TableParagraph"/>
+                                    <w:rPr>
+                                      <w:rFonts w:ascii="Times New Roman" w:hAnsi="Times New Roman"/>
+                                      <w:sz w:val="12"/>
+                                    </w:rPr>
+                                  </w:pPr>
+                                  <w:r>
+                                    <w:rPr>
+                                      <w:rFonts w:ascii="Times New Roman" w:hAnsi="Times New Roman"/>
+                                      <w:sz w:val="12"/>
+                                    </w:rPr>
+                                  </w:r>
+                                </w:p>
+                              </w:tc>
+                              <w:tc>
+                                <w:tcPr>
+                                  <w:tcW w:w="531" w:type="dxa"/>
+                                  <w:gridSpan w:val="2"/>
+                                  <w:tcBorders>
+                                    <w:top w:val="single" w:sz="2" w:space="0" w:color="000000"/>
+                                    <w:left w:val="single" w:sz="2" w:space="0" w:color="000000"/>
+                                    <w:bottom w:val="single" w:sz="2" w:space="0" w:color="000000"/>
+                                    <w:right w:val="single" w:sz="2" w:space="0" w:color="000000"/>
+                                  </w:tcBorders>
+                                </w:tcPr>
+                                <w:p>
+                                  <w:pPr>
+                                    <w:pStyle w:val="TableParagraph"/>
+                                    <w:rPr>
+                                      <w:rFonts w:ascii="Times New Roman" w:hAnsi="Times New Roman"/>
+                                      <w:sz w:val="12"/>
+                                    </w:rPr>
+                                  </w:pPr>
+                                  <w:r>
+                                    <w:rPr>
+                                      <w:rFonts w:ascii="Times New Roman" w:hAnsi="Times New Roman"/>
+                                      <w:sz w:val="12"/>
+                                    </w:rPr>
+                                  </w:r>
+                                </w:p>
+                              </w:tc>
+                              <w:tc>
+                                <w:tcPr>
+                                  <w:tcW w:w="524" w:type="dxa"/>
+                                  <w:gridSpan w:val="2"/>
+                                  <w:tcBorders>
+                                    <w:top w:val="single" w:sz="2" w:space="0" w:color="000000"/>
+                                    <w:left w:val="single" w:sz="2" w:space="0" w:color="000000"/>
+                                    <w:bottom w:val="single" w:sz="2" w:space="0" w:color="000000"/>
+                                    <w:right w:val="single" w:sz="2" w:space="0" w:color="000000"/>
+                                  </w:tcBorders>
+                                </w:tcPr>
+                                <w:p>
+                                  <w:pPr>
+                                    <w:pStyle w:val="TableParagraph"/>
+                                    <w:rPr>
+                                      <w:rFonts w:ascii="Times New Roman" w:hAnsi="Times New Roman"/>
+                                      <w:sz w:val="12"/>
+                                    </w:rPr>
+                                  </w:pPr>
+                                  <w:r>
+                                    <w:rPr>
+                                      <w:rFonts w:ascii="Times New Roman" w:hAnsi="Times New Roman"/>
+                                      <w:sz w:val="12"/>
+                                    </w:rPr>
+                                  </w:r>
+                                </w:p>
+                              </w:tc>
+                              <w:tc>
+                                <w:tcPr>
+                                  <w:tcW w:w="527" w:type="dxa"/>
                                   <w:gridSpan w:val="2"/>
                                   <w:tcBorders>
                                     <w:top w:val="single" w:sz="2" w:space="0" w:color="000000"/>
@@ -14798,7 +14925,7 @@
                               </w:tc>
                               <w:tc>
                                 <w:tcPr>
-                                  <w:tcW w:w="517" w:type="dxa"/>
+                                  <w:tcW w:w="530" w:type="dxa"/>
                                   <w:gridSpan w:val="2"/>
                                   <w:tcBorders>
                                     <w:top w:val="single" w:sz="2" w:space="0" w:color="000000"/>
@@ -14825,142 +14952,7 @@
                               </w:tc>
                               <w:tc>
                                 <w:tcPr>
-                                  <w:tcW w:w="533" w:type="dxa"/>
-                                  <w:gridSpan w:val="2"/>
-                                  <w:tcBorders>
-                                    <w:top w:val="single" w:sz="2" w:space="0" w:color="000000"/>
-                                    <w:left w:val="single" w:sz="2" w:space="0" w:color="000000"/>
-                                    <w:bottom w:val="single" w:sz="2" w:space="0" w:color="000000"/>
-                                    <w:right w:val="single" w:sz="2" w:space="0" w:color="000000"/>
-                                  </w:tcBorders>
-                                </w:tcPr>
-                                <w:p>
-                                  <w:pPr>
-                                    <w:pStyle w:val="TableParagraph"/>
-                                    <w:rPr>
-                                      <w:rFonts w:ascii="Times New Roman" w:hAnsi="Times New Roman"/>
-                                      <w:sz w:val="12"/>
-                                    </w:rPr>
-                                  </w:pPr>
-                                  <w:r>
-                                    <w:rPr>
-                                      <w:rFonts w:ascii="Times New Roman" w:hAnsi="Times New Roman"/>
-                                      <w:sz w:val="12"/>
-                                    </w:rPr>
-                                  </w:r>
-                                </w:p>
-                              </w:tc>
-                              <w:tc>
-                                <w:tcPr>
-                                  <w:tcW w:w="521" w:type="dxa"/>
-                                  <w:gridSpan w:val="2"/>
-                                  <w:tcBorders>
-                                    <w:top w:val="single" w:sz="2" w:space="0" w:color="000000"/>
-                                    <w:left w:val="single" w:sz="2" w:space="0" w:color="000000"/>
-                                    <w:bottom w:val="single" w:sz="2" w:space="0" w:color="000000"/>
-                                    <w:right w:val="single" w:sz="2" w:space="0" w:color="000000"/>
-                                  </w:tcBorders>
-                                </w:tcPr>
-                                <w:p>
-                                  <w:pPr>
-                                    <w:pStyle w:val="TableParagraph"/>
-                                    <w:rPr>
-                                      <w:rFonts w:ascii="Times New Roman" w:hAnsi="Times New Roman"/>
-                                      <w:sz w:val="12"/>
-                                    </w:rPr>
-                                  </w:pPr>
-                                  <w:r>
-                                    <w:rPr>
-                                      <w:rFonts w:ascii="Times New Roman" w:hAnsi="Times New Roman"/>
-                                      <w:sz w:val="12"/>
-                                    </w:rPr>
-                                  </w:r>
-                                </w:p>
-                              </w:tc>
-                              <w:tc>
-                                <w:tcPr>
-                                  <w:tcW w:w="528" w:type="dxa"/>
-                                  <w:gridSpan w:val="2"/>
-                                  <w:tcBorders>
-                                    <w:top w:val="single" w:sz="2" w:space="0" w:color="000000"/>
-                                    <w:left w:val="single" w:sz="2" w:space="0" w:color="000000"/>
-                                    <w:bottom w:val="single" w:sz="2" w:space="0" w:color="000000"/>
-                                    <w:right w:val="single" w:sz="2" w:space="0" w:color="000000"/>
-                                  </w:tcBorders>
-                                </w:tcPr>
-                                <w:p>
-                                  <w:pPr>
-                                    <w:pStyle w:val="TableParagraph"/>
-                                    <w:rPr>
-                                      <w:rFonts w:ascii="Times New Roman" w:hAnsi="Times New Roman"/>
-                                      <w:sz w:val="12"/>
-                                    </w:rPr>
-                                  </w:pPr>
-                                  <w:r>
-                                    <w:rPr>
-                                      <w:rFonts w:ascii="Times New Roman" w:hAnsi="Times New Roman"/>
-                                      <w:sz w:val="12"/>
-                                    </w:rPr>
-                                  </w:r>
-                                </w:p>
-                              </w:tc>
-                              <w:tc>
-                                <w:tcPr>
-                                  <w:tcW w:w="525" w:type="dxa"/>
-                                  <w:gridSpan w:val="2"/>
-                                  <w:tcBorders>
-                                    <w:top w:val="single" w:sz="2" w:space="0" w:color="000000"/>
-                                    <w:left w:val="single" w:sz="2" w:space="0" w:color="000000"/>
-                                    <w:bottom w:val="single" w:sz="2" w:space="0" w:color="000000"/>
-                                    <w:right w:val="single" w:sz="2" w:space="0" w:color="000000"/>
-                                  </w:tcBorders>
-                                </w:tcPr>
-                                <w:p>
-                                  <w:pPr>
-                                    <w:pStyle w:val="TableParagraph"/>
-                                    <w:rPr>
-                                      <w:rFonts w:ascii="Times New Roman" w:hAnsi="Times New Roman"/>
-                                      <w:sz w:val="12"/>
-                                    </w:rPr>
-                                  </w:pPr>
-                                  <w:r>
-                                    <w:rPr>
-                                      <w:rFonts w:ascii="Times New Roman" w:hAnsi="Times New Roman"/>
-                                      <w:sz w:val="12"/>
-                                    </w:rPr>
-                                  </w:r>
-                                </w:p>
-                              </w:tc>
-                              <w:tc>
-                                <w:tcPr>
-                                  <w:tcW w:w="527" w:type="dxa"/>
-                                  <w:gridSpan w:val="2"/>
-                                  <w:tcBorders>
-                                    <w:top w:val="single" w:sz="2" w:space="0" w:color="000000"/>
-                                    <w:left w:val="single" w:sz="2" w:space="0" w:color="000000"/>
-                                    <w:bottom w:val="single" w:sz="2" w:space="0" w:color="000000"/>
-                                    <w:right w:val="single" w:sz="2" w:space="0" w:color="000000"/>
-                                  </w:tcBorders>
-                                </w:tcPr>
-                                <w:p>
-                                  <w:pPr>
-                                    <w:pStyle w:val="TableParagraph"/>
-                                    <w:rPr>
-                                      <w:rFonts w:ascii="Times New Roman" w:hAnsi="Times New Roman"/>
-                                      <w:sz w:val="12"/>
-                                    </w:rPr>
-                                  </w:pPr>
-                                  <w:r>
-                                    <w:rPr>
-                                      <w:rFonts w:ascii="Times New Roman" w:hAnsi="Times New Roman"/>
-                                      <w:sz w:val="12"/>
-                                    </w:rPr>
-                                  </w:r>
-                                </w:p>
-                              </w:tc>
-                              <w:tc>
-                                <w:tcPr>
-                                  <w:tcW w:w="434" w:type="dxa"/>
+                                  <w:tcW w:w="422" w:type="dxa"/>
                                   <w:gridSpan w:val="2"/>
                                   <w:tcBorders>
                                     <w:top w:val="single" w:sz="2" w:space="0" w:color="000000"/>
@@ -15043,35 +15035,35 @@
                         <w:gridCol w:w="259"/>
                         <w:gridCol w:w="1"/>
                         <w:gridCol w:w="260"/>
-                        <w:gridCol w:w="286"/>
-                        <w:gridCol w:w="256"/>
+                        <w:gridCol w:w="289"/>
+                        <w:gridCol w:w="253"/>
                         <w:gridCol w:w="247"/>
                         <w:gridCol w:w="250"/>
-                        <w:gridCol w:w="285"/>
+                        <w:gridCol w:w="288"/>
                         <w:gridCol w:w="260"/>
-                        <w:gridCol w:w="265"/>
-                        <w:gridCol w:w="269"/>
+                        <w:gridCol w:w="268"/>
+                        <w:gridCol w:w="266"/>
                         <w:gridCol w:w="254"/>
                         <w:gridCol w:w="253"/>
-                        <w:gridCol w:w="265"/>
+                        <w:gridCol w:w="268"/>
                         <w:gridCol w:w="279"/>
-                        <w:gridCol w:w="257"/>
-                        <w:gridCol w:w="261"/>
+                        <w:gridCol w:w="254"/>
+                        <w:gridCol w:w="264"/>
                         <w:gridCol w:w="265"/>
                         <w:gridCol w:w="260"/>
-                        <w:gridCol w:w="257"/>
-                        <w:gridCol w:w="269"/>
-                        <w:gridCol w:w="264"/>
+                        <w:gridCol w:w="259"/>
+                        <w:gridCol w:w="268"/>
+                        <w:gridCol w:w="263"/>
                         <w:gridCol w:w="260"/>
-                        <w:gridCol w:w="261"/>
                         <w:gridCol w:w="264"/>
                         <w:gridCol w:w="264"/>
                         <w:gridCol w:w="263"/>
+                        <w:gridCol w:w="264"/>
                         <w:gridCol w:w="262"/>
                         <w:gridCol w:w="264"/>
-                        <w:gridCol w:w="263"/>
-                        <w:gridCol w:w="263"/>
-                        <w:gridCol w:w="171"/>
+                        <w:gridCol w:w="266"/>
+                        <w:gridCol w:w="262"/>
+                        <w:gridCol w:w="160"/>
                       </w:tblGrid>
                       <w:tr>
                         <w:trPr>
@@ -15098,7 +15090,11 @@
                               </w:rPr>
                             </w:pPr>
                             <w:r>
-                              <w:rPr/>
+                              <w:rPr>
+                                <w:rFonts w:ascii="Times New Roman" w:hAnsi="Times New Roman"/>
+                                <w:sz w:val="12"/>
+                                <w:szCs w:val="12"/>
+                              </w:rPr>
                             </w:r>
                           </w:p>
                         </w:tc>
@@ -15123,7 +15119,11 @@
                               </w:rPr>
                             </w:pPr>
                             <w:r>
-                              <w:rPr/>
+                              <w:rPr>
+                                <w:rFonts w:ascii="Times New Roman" w:hAnsi="Times New Roman"/>
+                                <w:sz w:val="12"/>
+                                <w:szCs w:val="12"/>
+                              </w:rPr>
                             </w:r>
                           </w:p>
                         </w:tc>
@@ -15187,7 +15187,7 @@
                         </w:tc>
                         <w:tc>
                           <w:tcPr>
-                            <w:tcW w:w="547" w:type="dxa"/>
+                            <w:tcW w:w="550" w:type="dxa"/>
                             <w:gridSpan w:val="3"/>
                             <w:tcBorders>
                               <w:top w:val="single" w:sz="2" w:space="0" w:color="000000"/>
@@ -15216,7 +15216,7 @@
                         </w:tc>
                         <w:tc>
                           <w:tcPr>
-                            <w:tcW w:w="503" w:type="dxa"/>
+                            <w:tcW w:w="500" w:type="dxa"/>
                             <w:gridSpan w:val="2"/>
                             <w:tcBorders>
                               <w:top w:val="single" w:sz="2" w:space="0" w:color="000000"/>
@@ -15245,7 +15245,7 @@
                         </w:tc>
                         <w:tc>
                           <w:tcPr>
-                            <w:tcW w:w="535" w:type="dxa"/>
+                            <w:tcW w:w="538" w:type="dxa"/>
                             <w:gridSpan w:val="2"/>
                             <w:tcBorders>
                               <w:top w:val="single" w:sz="2" w:space="0" w:color="000000"/>
@@ -15274,7 +15274,7 @@
                         </w:tc>
                         <w:tc>
                           <w:tcPr>
-                            <w:tcW w:w="525" w:type="dxa"/>
+                            <w:tcW w:w="528" w:type="dxa"/>
                             <w:gridSpan w:val="2"/>
                             <w:tcBorders>
                               <w:top w:val="single" w:sz="2" w:space="0" w:color="000000"/>
@@ -15303,7 +15303,7 @@
                         </w:tc>
                         <w:tc>
                           <w:tcPr>
-                            <w:tcW w:w="523" w:type="dxa"/>
+                            <w:tcW w:w="520" w:type="dxa"/>
                             <w:gridSpan w:val="2"/>
                             <w:tcBorders>
                               <w:top w:val="single" w:sz="2" w:space="0" w:color="000000"/>
@@ -15332,7 +15332,7 @@
                         </w:tc>
                         <w:tc>
                           <w:tcPr>
-                            <w:tcW w:w="518" w:type="dxa"/>
+                            <w:tcW w:w="521" w:type="dxa"/>
                             <w:gridSpan w:val="2"/>
                             <w:tcBorders>
                               <w:top w:val="single" w:sz="2" w:space="0" w:color="000000"/>
@@ -15361,7 +15361,142 @@
                         </w:tc>
                         <w:tc>
                           <w:tcPr>
-                            <w:tcW w:w="536" w:type="dxa"/>
+                            <w:tcW w:w="533" w:type="dxa"/>
+                            <w:gridSpan w:val="2"/>
+                            <w:tcBorders>
+                              <w:top w:val="single" w:sz="2" w:space="0" w:color="000000"/>
+                              <w:left w:val="single" w:sz="2" w:space="0" w:color="000000"/>
+                              <w:bottom w:val="single" w:sz="2" w:space="0" w:color="000000"/>
+                              <w:right w:val="single" w:sz="2" w:space="0" w:color="000000"/>
+                            </w:tcBorders>
+                          </w:tcPr>
+                          <w:p>
+                            <w:pPr>
+                              <w:pStyle w:val="TableParagraph"/>
+                              <w:rPr>
+                                <w:rFonts w:ascii="Times New Roman" w:hAnsi="Times New Roman"/>
+                                <w:sz w:val="12"/>
+                              </w:rPr>
+                            </w:pPr>
+                            <w:r>
+                              <w:rPr>
+                                <w:rFonts w:ascii="Times New Roman" w:hAnsi="Times New Roman"/>
+                                <w:sz w:val="12"/>
+                              </w:rPr>
+                            </w:r>
+                          </w:p>
+                        </w:tc>
+                        <w:tc>
+                          <w:tcPr>
+                            <w:tcW w:w="529" w:type="dxa"/>
+                            <w:gridSpan w:val="2"/>
+                            <w:tcBorders>
+                              <w:top w:val="single" w:sz="2" w:space="0" w:color="000000"/>
+                              <w:left w:val="single" w:sz="2" w:space="0" w:color="000000"/>
+                              <w:bottom w:val="single" w:sz="2" w:space="0" w:color="000000"/>
+                              <w:right w:val="single" w:sz="2" w:space="0" w:color="000000"/>
+                            </w:tcBorders>
+                          </w:tcPr>
+                          <w:p>
+                            <w:pPr>
+                              <w:pStyle w:val="TableParagraph"/>
+                              <w:rPr>
+                                <w:rFonts w:ascii="Times New Roman" w:hAnsi="Times New Roman"/>
+                                <w:sz w:val="12"/>
+                              </w:rPr>
+                            </w:pPr>
+                            <w:r>
+                              <w:rPr>
+                                <w:rFonts w:ascii="Times New Roman" w:hAnsi="Times New Roman"/>
+                                <w:sz w:val="12"/>
+                              </w:rPr>
+                            </w:r>
+                          </w:p>
+                        </w:tc>
+                        <w:tc>
+                          <w:tcPr>
+                            <w:tcW w:w="519" w:type="dxa"/>
+                            <w:gridSpan w:val="2"/>
+                            <w:tcBorders>
+                              <w:top w:val="single" w:sz="2" w:space="0" w:color="000000"/>
+                              <w:left w:val="single" w:sz="2" w:space="0" w:color="000000"/>
+                              <w:bottom w:val="single" w:sz="2" w:space="0" w:color="000000"/>
+                              <w:right w:val="single" w:sz="2" w:space="0" w:color="000000"/>
+                            </w:tcBorders>
+                          </w:tcPr>
+                          <w:p>
+                            <w:pPr>
+                              <w:pStyle w:val="TableParagraph"/>
+                              <w:rPr>
+                                <w:rFonts w:ascii="Times New Roman" w:hAnsi="Times New Roman"/>
+                                <w:sz w:val="12"/>
+                              </w:rPr>
+                            </w:pPr>
+                            <w:r>
+                              <w:rPr>
+                                <w:rFonts w:ascii="Times New Roman" w:hAnsi="Times New Roman"/>
+                                <w:sz w:val="12"/>
+                              </w:rPr>
+                            </w:r>
+                          </w:p>
+                        </w:tc>
+                        <w:tc>
+                          <w:tcPr>
+                            <w:tcW w:w="531" w:type="dxa"/>
+                            <w:gridSpan w:val="2"/>
+                            <w:tcBorders>
+                              <w:top w:val="single" w:sz="2" w:space="0" w:color="000000"/>
+                              <w:left w:val="single" w:sz="2" w:space="0" w:color="000000"/>
+                              <w:bottom w:val="single" w:sz="2" w:space="0" w:color="000000"/>
+                              <w:right w:val="single" w:sz="2" w:space="0" w:color="000000"/>
+                            </w:tcBorders>
+                          </w:tcPr>
+                          <w:p>
+                            <w:pPr>
+                              <w:pStyle w:val="TableParagraph"/>
+                              <w:rPr>
+                                <w:rFonts w:ascii="Times New Roman" w:hAnsi="Times New Roman"/>
+                                <w:sz w:val="12"/>
+                              </w:rPr>
+                            </w:pPr>
+                            <w:r>
+                              <w:rPr>
+                                <w:rFonts w:ascii="Times New Roman" w:hAnsi="Times New Roman"/>
+                                <w:sz w:val="12"/>
+                              </w:rPr>
+                            </w:r>
+                          </w:p>
+                        </w:tc>
+                        <w:tc>
+                          <w:tcPr>
+                            <w:tcW w:w="524" w:type="dxa"/>
+                            <w:gridSpan w:val="2"/>
+                            <w:tcBorders>
+                              <w:top w:val="single" w:sz="2" w:space="0" w:color="000000"/>
+                              <w:left w:val="single" w:sz="2" w:space="0" w:color="000000"/>
+                              <w:bottom w:val="single" w:sz="2" w:space="0" w:color="000000"/>
+                              <w:right w:val="single" w:sz="2" w:space="0" w:color="000000"/>
+                            </w:tcBorders>
+                          </w:tcPr>
+                          <w:p>
+                            <w:pPr>
+                              <w:pStyle w:val="TableParagraph"/>
+                              <w:rPr>
+                                <w:rFonts w:ascii="Times New Roman" w:hAnsi="Times New Roman"/>
+                                <w:sz w:val="12"/>
+                              </w:rPr>
+                            </w:pPr>
+                            <w:r>
+                              <w:rPr>
+                                <w:rFonts w:ascii="Times New Roman" w:hAnsi="Times New Roman"/>
+                                <w:sz w:val="12"/>
+                              </w:rPr>
+                            </w:r>
+                          </w:p>
+                        </w:tc>
+                        <w:tc>
+                          <w:tcPr>
+                            <w:tcW w:w="527" w:type="dxa"/>
                             <w:gridSpan w:val="2"/>
                             <w:tcBorders>
                               <w:top w:val="single" w:sz="2" w:space="0" w:color="000000"/>
@@ -15415,7 +15550,7 @@
                         </w:tc>
                         <w:tc>
                           <w:tcPr>
-                            <w:tcW w:w="517" w:type="dxa"/>
+                            <w:tcW w:w="530" w:type="dxa"/>
                             <w:gridSpan w:val="2"/>
                             <w:tcBorders>
                               <w:top w:val="single" w:sz="2" w:space="0" w:color="000000"/>
@@ -15442,142 +15577,7 @@
                         </w:tc>
                         <w:tc>
                           <w:tcPr>
-                            <w:tcW w:w="533" w:type="dxa"/>
-                            <w:gridSpan w:val="2"/>
-                            <w:tcBorders>
-                              <w:top w:val="single" w:sz="2" w:space="0" w:color="000000"/>
-                              <w:left w:val="single" w:sz="2" w:space="0" w:color="000000"/>
-                              <w:bottom w:val="single" w:sz="2" w:space="0" w:color="000000"/>
-                              <w:right w:val="single" w:sz="2" w:space="0" w:color="000000"/>
-                            </w:tcBorders>
-                          </w:tcPr>
-                          <w:p>
-                            <w:pPr>
-                              <w:pStyle w:val="TableParagraph"/>
-                              <w:rPr>
-                                <w:rFonts w:ascii="Times New Roman" w:hAnsi="Times New Roman"/>
-                                <w:sz w:val="12"/>
-                              </w:rPr>
-                            </w:pPr>
-                            <w:r>
-                              <w:rPr>
-                                <w:rFonts w:ascii="Times New Roman" w:hAnsi="Times New Roman"/>
-                                <w:sz w:val="12"/>
-                              </w:rPr>
-                            </w:r>
-                          </w:p>
-                        </w:tc>
-                        <w:tc>
-                          <w:tcPr>
-                            <w:tcW w:w="521" w:type="dxa"/>
-                            <w:gridSpan w:val="2"/>
-                            <w:tcBorders>
-                              <w:top w:val="single" w:sz="2" w:space="0" w:color="000000"/>
-                              <w:left w:val="single" w:sz="2" w:space="0" w:color="000000"/>
-                              <w:bottom w:val="single" w:sz="2" w:space="0" w:color="000000"/>
-                              <w:right w:val="single" w:sz="2" w:space="0" w:color="000000"/>
-                            </w:tcBorders>
-                          </w:tcPr>
-                          <w:p>
-                            <w:pPr>
-                              <w:pStyle w:val="TableParagraph"/>
-                              <w:rPr>
-                                <w:rFonts w:ascii="Times New Roman" w:hAnsi="Times New Roman"/>
-                                <w:sz w:val="12"/>
-                              </w:rPr>
-                            </w:pPr>
-                            <w:r>
-                              <w:rPr>
-                                <w:rFonts w:ascii="Times New Roman" w:hAnsi="Times New Roman"/>
-                                <w:sz w:val="12"/>
-                              </w:rPr>
-                            </w:r>
-                          </w:p>
-                        </w:tc>
-                        <w:tc>
-                          <w:tcPr>
-                            <w:tcW w:w="528" w:type="dxa"/>
-                            <w:gridSpan w:val="2"/>
-                            <w:tcBorders>
-                              <w:top w:val="single" w:sz="2" w:space="0" w:color="000000"/>
-                              <w:left w:val="single" w:sz="2" w:space="0" w:color="000000"/>
-                              <w:bottom w:val="single" w:sz="2" w:space="0" w:color="000000"/>
-                              <w:right w:val="single" w:sz="2" w:space="0" w:color="000000"/>
-                            </w:tcBorders>
-                          </w:tcPr>
-                          <w:p>
-                            <w:pPr>
-                              <w:pStyle w:val="TableParagraph"/>
-                              <w:rPr>
-                                <w:rFonts w:ascii="Times New Roman" w:hAnsi="Times New Roman"/>
-                                <w:sz w:val="12"/>
-                              </w:rPr>
-                            </w:pPr>
-                            <w:r>
-                              <w:rPr>
-                                <w:rFonts w:ascii="Times New Roman" w:hAnsi="Times New Roman"/>
-                                <w:sz w:val="12"/>
-                              </w:rPr>
-                            </w:r>
-                          </w:p>
-                        </w:tc>
-                        <w:tc>
-                          <w:tcPr>
-                            <w:tcW w:w="525" w:type="dxa"/>
-                            <w:gridSpan w:val="2"/>
-                            <w:tcBorders>
-                              <w:top w:val="single" w:sz="2" w:space="0" w:color="000000"/>
-                              <w:left w:val="single" w:sz="2" w:space="0" w:color="000000"/>
-                              <w:bottom w:val="single" w:sz="2" w:space="0" w:color="000000"/>
-                              <w:right w:val="single" w:sz="2" w:space="0" w:color="000000"/>
-                            </w:tcBorders>
-                          </w:tcPr>
-                          <w:p>
-                            <w:pPr>
-                              <w:pStyle w:val="TableParagraph"/>
-                              <w:rPr>
-                                <w:rFonts w:ascii="Times New Roman" w:hAnsi="Times New Roman"/>
-                                <w:sz w:val="12"/>
-                              </w:rPr>
-                            </w:pPr>
-                            <w:r>
-                              <w:rPr>
-                                <w:rFonts w:ascii="Times New Roman" w:hAnsi="Times New Roman"/>
-                                <w:sz w:val="12"/>
-                              </w:rPr>
-                            </w:r>
-                          </w:p>
-                        </w:tc>
-                        <w:tc>
-                          <w:tcPr>
-                            <w:tcW w:w="527" w:type="dxa"/>
-                            <w:gridSpan w:val="2"/>
-                            <w:tcBorders>
-                              <w:top w:val="single" w:sz="2" w:space="0" w:color="000000"/>
-                              <w:left w:val="single" w:sz="2" w:space="0" w:color="000000"/>
-                              <w:bottom w:val="single" w:sz="2" w:space="0" w:color="000000"/>
-                              <w:right w:val="single" w:sz="2" w:space="0" w:color="000000"/>
-                            </w:tcBorders>
-                          </w:tcPr>
-                          <w:p>
-                            <w:pPr>
-                              <w:pStyle w:val="TableParagraph"/>
-                              <w:rPr>
-                                <w:rFonts w:ascii="Times New Roman" w:hAnsi="Times New Roman"/>
-                                <w:sz w:val="12"/>
-                              </w:rPr>
-                            </w:pPr>
-                            <w:r>
-                              <w:rPr>
-                                <w:rFonts w:ascii="Times New Roman" w:hAnsi="Times New Roman"/>
-                                <w:sz w:val="12"/>
-                              </w:rPr>
-                            </w:r>
-                          </w:p>
-                        </w:tc>
-                        <w:tc>
-                          <w:tcPr>
-                            <w:tcW w:w="434" w:type="dxa"/>
+                            <w:tcW w:w="422" w:type="dxa"/>
                             <w:gridSpan w:val="2"/>
                             <w:tcBorders>
                               <w:top w:val="single" w:sz="2" w:space="0" w:color="000000"/>
@@ -15626,7 +15626,10 @@
                               </w:rPr>
                             </w:pPr>
                             <w:r>
-                              <w:rPr/>
+                              <w:rPr>
+                                <w:rFonts w:ascii="Times New Roman" w:hAnsi="Times New Roman"/>
+                                <w:sz w:val="12"/>
+                              </w:rPr>
                             </w:r>
                           </w:p>
                         </w:tc>
@@ -15650,7 +15653,10 @@
                               </w:rPr>
                             </w:pPr>
                             <w:r>
-                              <w:rPr/>
+                              <w:rPr>
+                                <w:rFonts w:ascii="Times New Roman" w:hAnsi="Times New Roman"/>
+                                <w:sz w:val="12"/>
+                              </w:rPr>
                             </w:r>
                           </w:p>
                         </w:tc>
@@ -15673,7 +15679,10 @@
                               </w:rPr>
                             </w:pPr>
                             <w:r>
-                              <w:rPr/>
+                              <w:rPr>
+                                <w:rFonts w:ascii="Times New Roman" w:hAnsi="Times New Roman"/>
+                                <w:sz w:val="12"/>
+                              </w:rPr>
                             </w:r>
                           </w:p>
                         </w:tc>
@@ -15696,7 +15705,10 @@
                               </w:rPr>
                             </w:pPr>
                             <w:r>
-                              <w:rPr/>
+                              <w:rPr>
+                                <w:rFonts w:ascii="Times New Roman" w:hAnsi="Times New Roman"/>
+                                <w:sz w:val="12"/>
+                              </w:rPr>
                             </w:r>
                           </w:p>
                         </w:tc>
@@ -15833,7 +15845,7 @@
                         </w:tc>
                         <w:tc>
                           <w:tcPr>
-                            <w:tcW w:w="286" w:type="dxa"/>
+                            <w:tcW w:w="289" w:type="dxa"/>
                             <w:tcBorders>
                               <w:top w:val="single" w:sz="2" w:space="0" w:color="000000"/>
                               <w:left w:val="single" w:sz="2" w:space="0" w:color="000000"/>
@@ -15859,7 +15871,7 @@
                         </w:tc>
                         <w:tc>
                           <w:tcPr>
-                            <w:tcW w:w="256" w:type="dxa"/>
+                            <w:tcW w:w="253" w:type="dxa"/>
                             <w:tcBorders>
                               <w:top w:val="single" w:sz="2" w:space="0" w:color="000000"/>
                               <w:left w:val="single" w:sz="2" w:space="0" w:color="000000"/>
@@ -15937,7 +15949,7 @@
                         </w:tc>
                         <w:tc>
                           <w:tcPr>
-                            <w:tcW w:w="285" w:type="dxa"/>
+                            <w:tcW w:w="288" w:type="dxa"/>
                             <w:tcBorders>
                               <w:top w:val="single" w:sz="2" w:space="0" w:color="000000"/>
                               <w:left w:val="single" w:sz="2" w:space="0" w:color="000000"/>
@@ -15989,7 +16001,7 @@
                         </w:tc>
                         <w:tc>
                           <w:tcPr>
-                            <w:tcW w:w="265" w:type="dxa"/>
+                            <w:tcW w:w="268" w:type="dxa"/>
                             <w:tcBorders>
                               <w:top w:val="single" w:sz="2" w:space="0" w:color="000000"/>
                               <w:left w:val="single" w:sz="2" w:space="0" w:color="000000"/>
@@ -16015,7 +16027,7 @@
                         </w:tc>
                         <w:tc>
                           <w:tcPr>
-                            <w:tcW w:w="269" w:type="dxa"/>
+                            <w:tcW w:w="266" w:type="dxa"/>
                             <w:tcBorders>
                               <w:top w:val="single" w:sz="2" w:space="0" w:color="000000"/>
                               <w:left w:val="single" w:sz="2" w:space="0" w:color="000000"/>
@@ -16093,7 +16105,7 @@
                         </w:tc>
                         <w:tc>
                           <w:tcPr>
-                            <w:tcW w:w="265" w:type="dxa"/>
+                            <w:tcW w:w="268" w:type="dxa"/>
                             <w:tcBorders>
                               <w:top w:val="single" w:sz="2" w:space="0" w:color="000000"/>
                               <w:left w:val="single" w:sz="2" w:space="0" w:color="000000"/>
@@ -16145,7 +16157,7 @@
                         </w:tc>
                         <w:tc>
                           <w:tcPr>
-                            <w:tcW w:w="257" w:type="dxa"/>
+                            <w:tcW w:w="254" w:type="dxa"/>
                             <w:tcBorders>
                               <w:top w:val="single" w:sz="2" w:space="0" w:color="000000"/>
                               <w:left w:val="single" w:sz="2" w:space="0" w:color="000000"/>
@@ -16171,7 +16183,7 @@
                         </w:tc>
                         <w:tc>
                           <w:tcPr>
-                            <w:tcW w:w="261" w:type="dxa"/>
+                            <w:tcW w:w="264" w:type="dxa"/>
                             <w:tcBorders>
                               <w:top w:val="single" w:sz="2" w:space="0" w:color="000000"/>
                               <w:left w:val="single" w:sz="2" w:space="0" w:color="000000"/>
@@ -16249,7 +16261,7 @@
                         </w:tc>
                         <w:tc>
                           <w:tcPr>
-                            <w:tcW w:w="257" w:type="dxa"/>
+                            <w:tcW w:w="259" w:type="dxa"/>
                             <w:tcBorders>
                               <w:top w:val="single" w:sz="2" w:space="0" w:color="000000"/>
                               <w:left w:val="single" w:sz="2" w:space="0" w:color="000000"/>
@@ -16275,7 +16287,59 @@
                         </w:tc>
                         <w:tc>
                           <w:tcPr>
-                            <w:tcW w:w="269" w:type="dxa"/>
+                            <w:tcW w:w="268" w:type="dxa"/>
+                            <w:tcBorders>
+                              <w:top w:val="single" w:sz="2" w:space="0" w:color="000000"/>
+                              <w:left w:val="single" w:sz="2" w:space="0" w:color="000000"/>
+                              <w:bottom w:val="single" w:sz="2" w:space="0" w:color="000000"/>
+                              <w:right w:val="single" w:sz="2" w:space="0" w:color="000000"/>
+                            </w:tcBorders>
+                          </w:tcPr>
+                          <w:p>
+                            <w:pPr>
+                              <w:pStyle w:val="TableParagraph"/>
+                              <w:rPr>
+                                <w:rFonts w:ascii="Times New Roman" w:hAnsi="Times New Roman"/>
+                                <w:sz w:val="12"/>
+                              </w:rPr>
+                            </w:pPr>
+                            <w:r>
+                              <w:rPr>
+                                <w:rFonts w:ascii="Times New Roman" w:hAnsi="Times New Roman"/>
+                                <w:sz w:val="12"/>
+                              </w:rPr>
+                            </w:r>
+                          </w:p>
+                        </w:tc>
+                        <w:tc>
+                          <w:tcPr>
+                            <w:tcW w:w="263" w:type="dxa"/>
+                            <w:tcBorders>
+                              <w:top w:val="single" w:sz="2" w:space="0" w:color="000000"/>
+                              <w:left w:val="single" w:sz="2" w:space="0" w:color="000000"/>
+                              <w:bottom w:val="single" w:sz="2" w:space="0" w:color="000000"/>
+                              <w:right w:val="single" w:sz="2" w:space="0" w:color="000000"/>
+                            </w:tcBorders>
+                          </w:tcPr>
+                          <w:p>
+                            <w:pPr>
+                              <w:pStyle w:val="TableParagraph"/>
+                              <w:rPr>
+                                <w:rFonts w:ascii="Times New Roman" w:hAnsi="Times New Roman"/>
+                                <w:sz w:val="12"/>
+                              </w:rPr>
+                            </w:pPr>
+                            <w:r>
+                              <w:rPr>
+                                <w:rFonts w:ascii="Times New Roman" w:hAnsi="Times New Roman"/>
+                                <w:sz w:val="12"/>
+                              </w:rPr>
+                            </w:r>
+                          </w:p>
+                        </w:tc>
+                        <w:tc>
+                          <w:tcPr>
+                            <w:tcW w:w="260" w:type="dxa"/>
                             <w:tcBorders>
                               <w:top w:val="single" w:sz="2" w:space="0" w:color="000000"/>
                               <w:left w:val="single" w:sz="2" w:space="0" w:color="000000"/>
@@ -16327,7 +16391,7 @@
                         </w:tc>
                         <w:tc>
                           <w:tcPr>
-                            <w:tcW w:w="260" w:type="dxa"/>
+                            <w:tcW w:w="264" w:type="dxa"/>
                             <w:tcBorders>
                               <w:top w:val="single" w:sz="2" w:space="0" w:color="000000"/>
                               <w:left w:val="single" w:sz="2" w:space="0" w:color="000000"/>
@@ -16353,7 +16417,7 @@
                         </w:tc>
                         <w:tc>
                           <w:tcPr>
-                            <w:tcW w:w="261" w:type="dxa"/>
+                            <w:tcW w:w="263" w:type="dxa"/>
                             <w:tcBorders>
                               <w:top w:val="single" w:sz="2" w:space="0" w:color="000000"/>
                               <w:left w:val="single" w:sz="2" w:space="0" w:color="000000"/>
@@ -16405,6 +16469,32 @@
                         </w:tc>
                         <w:tc>
                           <w:tcPr>
+                            <w:tcW w:w="262" w:type="dxa"/>
+                            <w:tcBorders>
+                              <w:top w:val="single" w:sz="2" w:space="0" w:color="000000"/>
+                              <w:left w:val="single" w:sz="2" w:space="0" w:color="000000"/>
+                              <w:bottom w:val="single" w:sz="2" w:space="0" w:color="000000"/>
+                              <w:right w:val="single" w:sz="2" w:space="0" w:color="000000"/>
+                            </w:tcBorders>
+                          </w:tcPr>
+                          <w:p>
+                            <w:pPr>
+                              <w:pStyle w:val="TableParagraph"/>
+                              <w:rPr>
+                                <w:rFonts w:ascii="Times New Roman" w:hAnsi="Times New Roman"/>
+                                <w:sz w:val="12"/>
+                              </w:rPr>
+                            </w:pPr>
+                            <w:r>
+                              <w:rPr>
+                                <w:rFonts w:ascii="Times New Roman" w:hAnsi="Times New Roman"/>
+                                <w:sz w:val="12"/>
+                              </w:rPr>
+                            </w:r>
+                          </w:p>
+                        </w:tc>
+                        <w:tc>
+                          <w:tcPr>
                             <w:tcW w:w="264" w:type="dxa"/>
                             <w:tcBorders>
                               <w:top w:val="single" w:sz="2" w:space="0" w:color="000000"/>
@@ -16431,7 +16521,7 @@
                         </w:tc>
                         <w:tc>
                           <w:tcPr>
-                            <w:tcW w:w="263" w:type="dxa"/>
+                            <w:tcW w:w="266" w:type="dxa"/>
                             <w:tcBorders>
                               <w:top w:val="single" w:sz="2" w:space="0" w:color="000000"/>
                               <w:left w:val="single" w:sz="2" w:space="0" w:color="000000"/>
@@ -16483,85 +16573,7 @@
                         </w:tc>
                         <w:tc>
                           <w:tcPr>
-                            <w:tcW w:w="264" w:type="dxa"/>
-                            <w:tcBorders>
-                              <w:top w:val="single" w:sz="2" w:space="0" w:color="000000"/>
-                              <w:left w:val="single" w:sz="2" w:space="0" w:color="000000"/>
-                              <w:bottom w:val="single" w:sz="2" w:space="0" w:color="000000"/>
-                              <w:right w:val="single" w:sz="2" w:space="0" w:color="000000"/>
-                            </w:tcBorders>
-                          </w:tcPr>
-                          <w:p>
-                            <w:pPr>
-                              <w:pStyle w:val="TableParagraph"/>
-                              <w:rPr>
-                                <w:rFonts w:ascii="Times New Roman" w:hAnsi="Times New Roman"/>
-                                <w:sz w:val="12"/>
-                              </w:rPr>
-                            </w:pPr>
-                            <w:r>
-                              <w:rPr>
-                                <w:rFonts w:ascii="Times New Roman" w:hAnsi="Times New Roman"/>
-                                <w:sz w:val="12"/>
-                              </w:rPr>
-                            </w:r>
-                          </w:p>
-                        </w:tc>
-                        <w:tc>
-                          <w:tcPr>
-                            <w:tcW w:w="263" w:type="dxa"/>
-                            <w:tcBorders>
-                              <w:top w:val="single" w:sz="2" w:space="0" w:color="000000"/>
-                              <w:left w:val="single" w:sz="2" w:space="0" w:color="000000"/>
-                              <w:bottom w:val="single" w:sz="2" w:space="0" w:color="000000"/>
-                              <w:right w:val="single" w:sz="2" w:space="0" w:color="000000"/>
-                            </w:tcBorders>
-                          </w:tcPr>
-                          <w:p>
-                            <w:pPr>
-                              <w:pStyle w:val="TableParagraph"/>
-                              <w:rPr>
-                                <w:rFonts w:ascii="Times New Roman" w:hAnsi="Times New Roman"/>
-                                <w:sz w:val="12"/>
-                              </w:rPr>
-                            </w:pPr>
-                            <w:r>
-                              <w:rPr>
-                                <w:rFonts w:ascii="Times New Roman" w:hAnsi="Times New Roman"/>
-                                <w:sz w:val="12"/>
-                              </w:rPr>
-                            </w:r>
-                          </w:p>
-                        </w:tc>
-                        <w:tc>
-                          <w:tcPr>
-                            <w:tcW w:w="263" w:type="dxa"/>
-                            <w:tcBorders>
-                              <w:top w:val="single" w:sz="2" w:space="0" w:color="000000"/>
-                              <w:left w:val="single" w:sz="2" w:space="0" w:color="000000"/>
-                              <w:bottom w:val="single" w:sz="2" w:space="0" w:color="000000"/>
-                              <w:right w:val="single" w:sz="2" w:space="0" w:color="000000"/>
-                            </w:tcBorders>
-                          </w:tcPr>
-                          <w:p>
-                            <w:pPr>
-                              <w:pStyle w:val="TableParagraph"/>
-                              <w:rPr>
-                                <w:rFonts w:ascii="Times New Roman" w:hAnsi="Times New Roman"/>
-                                <w:sz w:val="12"/>
-                              </w:rPr>
-                            </w:pPr>
-                            <w:r>
-                              <w:rPr>
-                                <w:rFonts w:ascii="Times New Roman" w:hAnsi="Times New Roman"/>
-                                <w:sz w:val="12"/>
-                              </w:rPr>
-                            </w:r>
-                          </w:p>
-                        </w:tc>
-                        <w:tc>
-                          <w:tcPr>
-                            <w:tcW w:w="171" w:type="dxa"/>
+                            <w:tcW w:w="160" w:type="dxa"/>
                             <w:tcBorders>
                               <w:top w:val="single" w:sz="2" w:space="0" w:color="000000"/>
                               <w:left w:val="single" w:sz="2" w:space="0" w:color="000000"/>
@@ -16700,7 +16712,7 @@
                         </w:tc>
                         <w:tc>
                           <w:tcPr>
-                            <w:tcW w:w="547" w:type="dxa"/>
+                            <w:tcW w:w="550" w:type="dxa"/>
                             <w:gridSpan w:val="3"/>
                             <w:tcBorders>
                               <w:top w:val="single" w:sz="2" w:space="0" w:color="000000"/>
@@ -16727,7 +16739,7 @@
                         </w:tc>
                         <w:tc>
                           <w:tcPr>
-                            <w:tcW w:w="503" w:type="dxa"/>
+                            <w:tcW w:w="500" w:type="dxa"/>
                             <w:gridSpan w:val="2"/>
                             <w:tcBorders>
                               <w:top w:val="single" w:sz="2" w:space="0" w:color="000000"/>
@@ -16754,7 +16766,7 @@
                         </w:tc>
                         <w:tc>
                           <w:tcPr>
-                            <w:tcW w:w="535" w:type="dxa"/>
+                            <w:tcW w:w="538" w:type="dxa"/>
                             <w:gridSpan w:val="2"/>
                             <w:tcBorders>
                               <w:top w:val="single" w:sz="2" w:space="0" w:color="000000"/>
@@ -16781,7 +16793,7 @@
                         </w:tc>
                         <w:tc>
                           <w:tcPr>
-                            <w:tcW w:w="525" w:type="dxa"/>
+                            <w:tcW w:w="528" w:type="dxa"/>
                             <w:gridSpan w:val="2"/>
                             <w:tcBorders>
                               <w:top w:val="single" w:sz="2" w:space="0" w:color="000000"/>
@@ -16808,7 +16820,7 @@
                         </w:tc>
                         <w:tc>
                           <w:tcPr>
-                            <w:tcW w:w="523" w:type="dxa"/>
+                            <w:tcW w:w="520" w:type="dxa"/>
                             <w:gridSpan w:val="2"/>
                             <w:tcBorders>
                               <w:top w:val="single" w:sz="2" w:space="0" w:color="000000"/>
@@ -16835,7 +16847,7 @@
                         </w:tc>
                         <w:tc>
                           <w:tcPr>
-                            <w:tcW w:w="518" w:type="dxa"/>
+                            <w:tcW w:w="521" w:type="dxa"/>
                             <w:gridSpan w:val="2"/>
                             <w:tcBorders>
                               <w:top w:val="single" w:sz="2" w:space="0" w:color="000000"/>
@@ -16862,7 +16874,142 @@
                         </w:tc>
                         <w:tc>
                           <w:tcPr>
-                            <w:tcW w:w="536" w:type="dxa"/>
+                            <w:tcW w:w="533" w:type="dxa"/>
+                            <w:gridSpan w:val="2"/>
+                            <w:tcBorders>
+                              <w:top w:val="single" w:sz="2" w:space="0" w:color="000000"/>
+                              <w:left w:val="single" w:sz="2" w:space="0" w:color="000000"/>
+                              <w:bottom w:val="single" w:sz="2" w:space="0" w:color="000000"/>
+                              <w:right w:val="single" w:sz="2" w:space="0" w:color="000000"/>
+                            </w:tcBorders>
+                          </w:tcPr>
+                          <w:p>
+                            <w:pPr>
+                              <w:pStyle w:val="TableParagraph"/>
+                              <w:rPr>
+                                <w:rFonts w:ascii="Times New Roman" w:hAnsi="Times New Roman"/>
+                                <w:sz w:val="12"/>
+                              </w:rPr>
+                            </w:pPr>
+                            <w:r>
+                              <w:rPr>
+                                <w:rFonts w:ascii="Times New Roman" w:hAnsi="Times New Roman"/>
+                                <w:sz w:val="12"/>
+                              </w:rPr>
+                            </w:r>
+                          </w:p>
+                        </w:tc>
+                        <w:tc>
+                          <w:tcPr>
+                            <w:tcW w:w="529" w:type="dxa"/>
+                            <w:gridSpan w:val="2"/>
+                            <w:tcBorders>
+                              <w:top w:val="single" w:sz="2" w:space="0" w:color="000000"/>
+                              <w:left w:val="single" w:sz="2" w:space="0" w:color="000000"/>
+                              <w:bottom w:val="single" w:sz="2" w:space="0" w:color="000000"/>
+                              <w:right w:val="single" w:sz="2" w:space="0" w:color="000000"/>
+                            </w:tcBorders>
+                          </w:tcPr>
+                          <w:p>
+                            <w:pPr>
+                              <w:pStyle w:val="TableParagraph"/>
+                              <w:rPr>
+                                <w:rFonts w:ascii="Times New Roman" w:hAnsi="Times New Roman"/>
+                                <w:sz w:val="12"/>
+                              </w:rPr>
+                            </w:pPr>
+                            <w:r>
+                              <w:rPr>
+                                <w:rFonts w:ascii="Times New Roman" w:hAnsi="Times New Roman"/>
+                                <w:sz w:val="12"/>
+                              </w:rPr>
+                            </w:r>
+                          </w:p>
+                        </w:tc>
+                        <w:tc>
+                          <w:tcPr>
+                            <w:tcW w:w="519" w:type="dxa"/>
+                            <w:gridSpan w:val="2"/>
+                            <w:tcBorders>
+                              <w:top w:val="single" w:sz="2" w:space="0" w:color="000000"/>
+                              <w:left w:val="single" w:sz="2" w:space="0" w:color="000000"/>
+                              <w:bottom w:val="single" w:sz="2" w:space="0" w:color="000000"/>
+                              <w:right w:val="single" w:sz="2" w:space="0" w:color="000000"/>
+                            </w:tcBorders>
+                          </w:tcPr>
+                          <w:p>
+                            <w:pPr>
+                              <w:pStyle w:val="TableParagraph"/>
+                              <w:rPr>
+                                <w:rFonts w:ascii="Times New Roman" w:hAnsi="Times New Roman"/>
+                                <w:sz w:val="12"/>
+                              </w:rPr>
+                            </w:pPr>
+                            <w:r>
+                              <w:rPr>
+                                <w:rFonts w:ascii="Times New Roman" w:hAnsi="Times New Roman"/>
+                                <w:sz w:val="12"/>
+                              </w:rPr>
+                            </w:r>
+                          </w:p>
+                        </w:tc>
+                        <w:tc>
+                          <w:tcPr>
+                            <w:tcW w:w="531" w:type="dxa"/>
+                            <w:gridSpan w:val="2"/>
+                            <w:tcBorders>
+                              <w:top w:val="single" w:sz="2" w:space="0" w:color="000000"/>
+                              <w:left w:val="single" w:sz="2" w:space="0" w:color="000000"/>
+                              <w:bottom w:val="single" w:sz="2" w:space="0" w:color="000000"/>
+                              <w:right w:val="single" w:sz="2" w:space="0" w:color="000000"/>
+                            </w:tcBorders>
+                          </w:tcPr>
+                          <w:p>
+                            <w:pPr>
+                              <w:pStyle w:val="TableParagraph"/>
+                              <w:rPr>
+                                <w:rFonts w:ascii="Times New Roman" w:hAnsi="Times New Roman"/>
+                                <w:sz w:val="12"/>
+                              </w:rPr>
+                            </w:pPr>
+                            <w:r>
+                              <w:rPr>
+                                <w:rFonts w:ascii="Times New Roman" w:hAnsi="Times New Roman"/>
+                                <w:sz w:val="12"/>
+                              </w:rPr>
+                            </w:r>
+                          </w:p>
+                        </w:tc>
+                        <w:tc>
+                          <w:tcPr>
+                            <w:tcW w:w="524" w:type="dxa"/>
+                            <w:gridSpan w:val="2"/>
+                            <w:tcBorders>
+                              <w:top w:val="single" w:sz="2" w:space="0" w:color="000000"/>
+                              <w:left w:val="single" w:sz="2" w:space="0" w:color="000000"/>
+                              <w:bottom w:val="single" w:sz="2" w:space="0" w:color="000000"/>
+                              <w:right w:val="single" w:sz="2" w:space="0" w:color="000000"/>
+                            </w:tcBorders>
+                          </w:tcPr>
+                          <w:p>
+                            <w:pPr>
+                              <w:pStyle w:val="TableParagraph"/>
+                              <w:rPr>
+                                <w:rFonts w:ascii="Times New Roman" w:hAnsi="Times New Roman"/>
+                                <w:sz w:val="12"/>
+                              </w:rPr>
+                            </w:pPr>
+                            <w:r>
+                              <w:rPr>
+                                <w:rFonts w:ascii="Times New Roman" w:hAnsi="Times New Roman"/>
+                                <w:sz w:val="12"/>
+                              </w:rPr>
+                            </w:r>
+                          </w:p>
+                        </w:tc>
+                        <w:tc>
+                          <w:tcPr>
+                            <w:tcW w:w="527" w:type="dxa"/>
                             <w:gridSpan w:val="2"/>
                             <w:tcBorders>
                               <w:top w:val="single" w:sz="2" w:space="0" w:color="000000"/>
@@ -16916,7 +17063,7 @@
                         </w:tc>
                         <w:tc>
                           <w:tcPr>
-                            <w:tcW w:w="517" w:type="dxa"/>
+                            <w:tcW w:w="530" w:type="dxa"/>
                             <w:gridSpan w:val="2"/>
                             <w:tcBorders>
                               <w:top w:val="single" w:sz="2" w:space="0" w:color="000000"/>
@@ -16943,142 +17090,7 @@
                         </w:tc>
                         <w:tc>
                           <w:tcPr>
-                            <w:tcW w:w="533" w:type="dxa"/>
-                            <w:gridSpan w:val="2"/>
-                            <w:tcBorders>
-                              <w:top w:val="single" w:sz="2" w:space="0" w:color="000000"/>
-                              <w:left w:val="single" w:sz="2" w:space="0" w:color="000000"/>
-                              <w:bottom w:val="single" w:sz="2" w:space="0" w:color="000000"/>
-                              <w:right w:val="single" w:sz="2" w:space="0" w:color="000000"/>
-                            </w:tcBorders>
-                          </w:tcPr>
-                          <w:p>
-                            <w:pPr>
-                              <w:pStyle w:val="TableParagraph"/>
-                              <w:rPr>
-                                <w:rFonts w:ascii="Times New Roman" w:hAnsi="Times New Roman"/>
-                                <w:sz w:val="12"/>
-                              </w:rPr>
-                            </w:pPr>
-                            <w:r>
-                              <w:rPr>
-                                <w:rFonts w:ascii="Times New Roman" w:hAnsi="Times New Roman"/>
-                                <w:sz w:val="12"/>
-                              </w:rPr>
-                            </w:r>
-                          </w:p>
-                        </w:tc>
-                        <w:tc>
-                          <w:tcPr>
-                            <w:tcW w:w="521" w:type="dxa"/>
-                            <w:gridSpan w:val="2"/>
-                            <w:tcBorders>
-                              <w:top w:val="single" w:sz="2" w:space="0" w:color="000000"/>
-                              <w:left w:val="single" w:sz="2" w:space="0" w:color="000000"/>
-                              <w:bottom w:val="single" w:sz="2" w:space="0" w:color="000000"/>
-                              <w:right w:val="single" w:sz="2" w:space="0" w:color="000000"/>
-                            </w:tcBorders>
-                          </w:tcPr>
-                          <w:p>
-                            <w:pPr>
-                              <w:pStyle w:val="TableParagraph"/>
-                              <w:rPr>
-                                <w:rFonts w:ascii="Times New Roman" w:hAnsi="Times New Roman"/>
-                                <w:sz w:val="12"/>
-                              </w:rPr>
-                            </w:pPr>
-                            <w:r>
-                              <w:rPr>
-                                <w:rFonts w:ascii="Times New Roman" w:hAnsi="Times New Roman"/>
-                                <w:sz w:val="12"/>
-                              </w:rPr>
-                            </w:r>
-                          </w:p>
-                        </w:tc>
-                        <w:tc>
-                          <w:tcPr>
-                            <w:tcW w:w="528" w:type="dxa"/>
-                            <w:gridSpan w:val="2"/>
-                            <w:tcBorders>
-                              <w:top w:val="single" w:sz="2" w:space="0" w:color="000000"/>
-                              <w:left w:val="single" w:sz="2" w:space="0" w:color="000000"/>
-                              <w:bottom w:val="single" w:sz="2" w:space="0" w:color="000000"/>
-                              <w:right w:val="single" w:sz="2" w:space="0" w:color="000000"/>
-                            </w:tcBorders>
-                          </w:tcPr>
-                          <w:p>
-                            <w:pPr>
-                              <w:pStyle w:val="TableParagraph"/>
-                              <w:rPr>
-                                <w:rFonts w:ascii="Times New Roman" w:hAnsi="Times New Roman"/>
-                                <w:sz w:val="12"/>
-                              </w:rPr>
-                            </w:pPr>
-                            <w:r>
-                              <w:rPr>
-                                <w:rFonts w:ascii="Times New Roman" w:hAnsi="Times New Roman"/>
-                                <w:sz w:val="12"/>
-                              </w:rPr>
-                            </w:r>
-                          </w:p>
-                        </w:tc>
-                        <w:tc>
-                          <w:tcPr>
-                            <w:tcW w:w="525" w:type="dxa"/>
-                            <w:gridSpan w:val="2"/>
-                            <w:tcBorders>
-                              <w:top w:val="single" w:sz="2" w:space="0" w:color="000000"/>
-                              <w:left w:val="single" w:sz="2" w:space="0" w:color="000000"/>
-                              <w:bottom w:val="single" w:sz="2" w:space="0" w:color="000000"/>
-                              <w:right w:val="single" w:sz="2" w:space="0" w:color="000000"/>
-                            </w:tcBorders>
-                          </w:tcPr>
-                          <w:p>
-                            <w:pPr>
-                              <w:pStyle w:val="TableParagraph"/>
-                              <w:rPr>
-                                <w:rFonts w:ascii="Times New Roman" w:hAnsi="Times New Roman"/>
-                                <w:sz w:val="12"/>
-                              </w:rPr>
-                            </w:pPr>
-                            <w:r>
-                              <w:rPr>
-                                <w:rFonts w:ascii="Times New Roman" w:hAnsi="Times New Roman"/>
-                                <w:sz w:val="12"/>
-                              </w:rPr>
-                            </w:r>
-                          </w:p>
-                        </w:tc>
-                        <w:tc>
-                          <w:tcPr>
-                            <w:tcW w:w="527" w:type="dxa"/>
-                            <w:gridSpan w:val="2"/>
-                            <w:tcBorders>
-                              <w:top w:val="single" w:sz="2" w:space="0" w:color="000000"/>
-                              <w:left w:val="single" w:sz="2" w:space="0" w:color="000000"/>
-                              <w:bottom w:val="single" w:sz="2" w:space="0" w:color="000000"/>
-                              <w:right w:val="single" w:sz="2" w:space="0" w:color="000000"/>
-                            </w:tcBorders>
-                          </w:tcPr>
-                          <w:p>
-                            <w:pPr>
-                              <w:pStyle w:val="TableParagraph"/>
-                              <w:rPr>
-                                <w:rFonts w:ascii="Times New Roman" w:hAnsi="Times New Roman"/>
-                                <w:sz w:val="12"/>
-                              </w:rPr>
-                            </w:pPr>
-                            <w:r>
-                              <w:rPr>
-                                <w:rFonts w:ascii="Times New Roman" w:hAnsi="Times New Roman"/>
-                                <w:sz w:val="12"/>
-                              </w:rPr>
-                            </w:r>
-                          </w:p>
-                        </w:tc>
-                        <w:tc>
-                          <w:tcPr>
-                            <w:tcW w:w="434" w:type="dxa"/>
+                            <w:tcW w:w="422" w:type="dxa"/>
                             <w:gridSpan w:val="2"/>
                             <w:tcBorders>
                               <w:top w:val="single" w:sz="2" w:space="0" w:color="000000"/>
@@ -17504,11 +17516,11 @@
           <w:pgSz w:w="11906" w:h="16838"/>
           <w:pgMar w:left="280" w:right="280" w:gutter="0" w:header="0" w:top="360" w:footer="405" w:bottom="600"/>
           <w:cols w:num="5" w:equalWidth="false" w:sep="false">
-            <w:col w:w="1414" w:space="454"/>
-            <w:col w:w="1390" w:space="490"/>
-            <w:col w:w="903" w:space="886"/>
-            <w:col w:w="948" w:space="3800"/>
-            <w:col w:w="1059"/>
+            <w:col w:w="1412" w:space="454"/>
+            <w:col w:w="1389" w:space="490"/>
+            <w:col w:w="901" w:space="886"/>
+            <w:col w:w="946" w:space="3800"/>
+            <w:col w:w="1065"/>
           </w:cols>
           <w:formProt w:val="false"/>
           <w:textDirection w:val="lrTb"/>
@@ -17724,7 +17736,7 @@
         <w:pStyle w:val="BodyText"/>
         <w:widowControl w:val="false"/>
         <w:suppressAutoHyphens w:val="true"/>
-        <w:overflowPunct w:val="false"/>
+        <w:overflowPunct w:val="true"/>
         <w:bidi w:val="0"/>
         <w:spacing w:before="0" w:after="0"/>
         <w:ind w:hanging="0" w:left="720" w:right="0"/>
@@ -17754,7 +17766,7 @@
         <w:pStyle w:val="BodyText"/>
         <w:widowControl w:val="false"/>
         <w:suppressAutoHyphens w:val="true"/>
-        <w:overflowPunct w:val="false"/>
+        <w:overflowPunct w:val="true"/>
         <w:bidi w:val="0"/>
         <w:spacing w:before="0" w:after="0"/>
         <w:ind w:hanging="0" w:left="720" w:right="0"/>
@@ -18336,30 +18348,37 @@
       </w:pPr>
       <w:r>
         <w:rPr>
+          <w:b w:val="false"/>
+          <w:bCs w:val="false"/>
           <w:sz w:val="20"/>
           <w:lang w:val="mk-MK"/>
         </w:rPr>
-        <w:t xml:space="preserve">             </w:t>
-      </w:r>
-      <w:r>
-        <w:rPr>
+        <w:t xml:space="preserve">            </w:t>
+      </w:r>
+      <w:r>
+        <w:rPr>
+          <w:b/>
+          <w:bCs/>
           <w:sz w:val="20"/>
           <w:lang w:val="mk-MK"/>
         </w:rPr>
-        <w:t xml:space="preserve">Забелешка и потпис на главен судија: </w:t>
-      </w:r>
-    </w:p>
-    <w:p>
-      <w:pPr>
-        <w:pStyle w:val="BodyText"/>
-        <w:rPr>
+        <w:t xml:space="preserve"> </w:t>
+      </w:r>
+      <w:r>
+        <w:rPr>
+          <w:b/>
+          <w:bCs/>
           <w:sz w:val="20"/>
-        </w:rPr>
-      </w:pPr>
+          <w:lang w:val="mk-MK"/>
+        </w:rPr>
+        <w:t>Забелешка и потпис на главен судија</w:t>
+      </w:r>
       <w:r>
         <w:rPr>
           <w:sz w:val="20"/>
-        </w:rPr>
+          <w:lang w:val="mk-MK"/>
+        </w:rPr>
+        <w:t xml:space="preserve">: По чекање од 30 минути гостинската екипа од непознати причини не се појави на теренот. Домашната екипа и другите службени лица беа на теренот. </w:t>
       </w:r>
     </w:p>
     <w:p>
@@ -18846,11 +18865,11 @@
           <w:pgSz w:w="11906" w:h="16838"/>
           <w:pgMar w:left="280" w:right="280" w:gutter="0" w:header="0" w:top="1600" w:footer="405" w:bottom="600"/>
           <w:cols w:num="5" w:equalWidth="false" w:sep="false">
-            <w:col w:w="1414" w:space="454"/>
-            <w:col w:w="1390" w:space="490"/>
-            <w:col w:w="903" w:space="886"/>
-            <w:col w:w="948" w:space="3800"/>
-            <w:col w:w="1059"/>
+            <w:col w:w="1412" w:space="454"/>
+            <w:col w:w="1389" w:space="490"/>
+            <w:col w:w="901" w:space="886"/>
+            <w:col w:w="946" w:space="3800"/>
+            <w:col w:w="1065"/>
           </w:cols>
           <w:formProt w:val="false"/>
           <w:textDirection w:val="lrTb"/>
@@ -19135,9 +19154,9 @@
                         <a:avLst/>
                         <a:gdLst>
                           <a:gd name="textAreaLeft" fmla="*/ 0 w 3996000"/>
-                          <a:gd name="textAreaRight" fmla="*/ 4005720 w 3996000"/>
+                          <a:gd name="textAreaRight" fmla="*/ 4006800 w 3996000"/>
                           <a:gd name="textAreaTop" fmla="*/ 0 h 720"/>
-                          <a:gd name="textAreaBottom" fmla="*/ 33181200 h 720"/>
+                          <a:gd name="textAreaBottom" fmla="*/ 111986280 h 720"/>
                           <a:gd name="GluePoint1X" fmla=""/>
                           <a:gd name="GluePoint1Y" fmla=""/>
                           <a:gd name="GluePoint2X" fmla=""/>
@@ -19263,7 +19282,7 @@
                       <w:txbxContent>
                         <w:p>
                           <w:pPr>
-                            <w:pStyle w:val="FrameContents"/>
+                            <w:pStyle w:val="FrameContentsuser"/>
                             <w:spacing w:before="17" w:after="0"/>
                             <w:rPr>
                               <w:sz w:val="14"/>
@@ -19296,7 +19315,7 @@
                 <w:txbxContent>
                   <w:p>
                     <w:pPr>
-                      <w:pStyle w:val="FrameContents"/>
+                      <w:pStyle w:val="FrameContentsuser"/>
                       <w:spacing w:before="17" w:after="0"/>
                       <w:rPr>
                         <w:sz w:val="14"/>
@@ -19358,7 +19377,7 @@
                       <w:txbxContent>
                         <w:p>
                           <w:pPr>
-                            <w:pStyle w:val="FrameContents"/>
+                            <w:pStyle w:val="FrameContentsuser"/>
                             <w:spacing w:before="17" w:after="0"/>
                             <w:ind w:left="20"/>
                             <w:rPr>
@@ -19446,7 +19465,7 @@
                 <w:txbxContent>
                   <w:p>
                     <w:pPr>
-                      <w:pStyle w:val="FrameContents"/>
+                      <w:pStyle w:val="FrameContentsuser"/>
                       <w:spacing w:before="17" w:after="0"/>
                       <w:ind w:left="20"/>
                       <w:rPr>
@@ -19568,9 +19587,9 @@
                         <a:avLst/>
                         <a:gdLst>
                           <a:gd name="textAreaLeft" fmla="*/ 0 w 3996000"/>
-                          <a:gd name="textAreaRight" fmla="*/ 4005720 w 3996000"/>
+                          <a:gd name="textAreaRight" fmla="*/ 4006800 w 3996000"/>
                           <a:gd name="textAreaTop" fmla="*/ 0 h 720"/>
-                          <a:gd name="textAreaBottom" fmla="*/ 33181200 h 720"/>
+                          <a:gd name="textAreaBottom" fmla="*/ 111986280 h 720"/>
                           <a:gd name="GluePoint1X" fmla=""/>
                           <a:gd name="GluePoint1Y" fmla=""/>
                           <a:gd name="GluePoint2X" fmla=""/>
@@ -19696,7 +19715,7 @@
                       <w:txbxContent>
                         <w:p>
                           <w:pPr>
-                            <w:pStyle w:val="FrameContents"/>
+                            <w:pStyle w:val="FrameContentsuser"/>
                             <w:spacing w:before="17" w:after="0"/>
                             <w:rPr>
                               <w:sz w:val="14"/>
@@ -19729,7 +19748,7 @@
                 <w:txbxContent>
                   <w:p>
                     <w:pPr>
-                      <w:pStyle w:val="FrameContents"/>
+                      <w:pStyle w:val="FrameContentsuser"/>
                       <w:spacing w:before="17" w:after="0"/>
                       <w:rPr>
                         <w:sz w:val="14"/>
@@ -19791,7 +19810,7 @@
                       <w:txbxContent>
                         <w:p>
                           <w:pPr>
-                            <w:pStyle w:val="FrameContents"/>
+                            <w:pStyle w:val="FrameContentsuser"/>
                             <w:spacing w:before="17" w:after="0"/>
                             <w:ind w:left="20"/>
                             <w:rPr>
@@ -19879,7 +19898,7 @@
                 <w:txbxContent>
                   <w:p>
                     <w:pPr>
-                      <w:pStyle w:val="FrameContents"/>
+                      <w:pStyle w:val="FrameContentsuser"/>
                       <w:spacing w:before="17" w:after="0"/>
                       <w:ind w:left="20"/>
                       <w:rPr>
@@ -20015,9 +20034,9 @@
                         <a:avLst/>
                         <a:gdLst>
                           <a:gd name="textAreaLeft" fmla="*/ 0 w 3996000"/>
-                          <a:gd name="textAreaRight" fmla="*/ 4005720 w 3996000"/>
+                          <a:gd name="textAreaRight" fmla="*/ 4006800 w 3996000"/>
                           <a:gd name="textAreaTop" fmla="*/ 0 h 720"/>
-                          <a:gd name="textAreaBottom" fmla="*/ 33181200 h 720"/>
+                          <a:gd name="textAreaBottom" fmla="*/ 111986280 h 720"/>
                           <a:gd name="GluePoint1X" fmla=""/>
                           <a:gd name="GluePoint1Y" fmla=""/>
                           <a:gd name="GluePoint2X" fmla=""/>
@@ -20143,7 +20162,7 @@
                       <w:txbxContent>
                         <w:p>
                           <w:pPr>
-                            <w:pStyle w:val="FrameContents"/>
+                            <w:pStyle w:val="FrameContentsuser"/>
                             <w:spacing w:before="17" w:after="0"/>
                             <w:rPr>
                               <w:sz w:val="14"/>
@@ -20176,7 +20195,7 @@
                 <w:txbxContent>
                   <w:p>
                     <w:pPr>
-                      <w:pStyle w:val="FrameContents"/>
+                      <w:pStyle w:val="FrameContentsuser"/>
                       <w:spacing w:before="17" w:after="0"/>
                       <w:rPr>
                         <w:sz w:val="14"/>
@@ -20238,7 +20257,7 @@
                       <w:txbxContent>
                         <w:p>
                           <w:pPr>
-                            <w:pStyle w:val="FrameContents"/>
+                            <w:pStyle w:val="FrameContentsuser"/>
                             <w:spacing w:before="17" w:after="0"/>
                             <w:ind w:left="20"/>
                             <w:rPr>
@@ -20326,7 +20345,7 @@
                 <w:txbxContent>
                   <w:p>
                     <w:pPr>
-                      <w:pStyle w:val="FrameContents"/>
+                      <w:pStyle w:val="FrameContentsuser"/>
                       <w:spacing w:before="17" w:after="0"/>
                       <w:ind w:left="20"/>
                       <w:rPr>
@@ -20448,9 +20467,9 @@
                         <a:avLst/>
                         <a:gdLst>
                           <a:gd name="textAreaLeft" fmla="*/ 0 w 3996000"/>
-                          <a:gd name="textAreaRight" fmla="*/ 4005720 w 3996000"/>
+                          <a:gd name="textAreaRight" fmla="*/ 4006800 w 3996000"/>
                           <a:gd name="textAreaTop" fmla="*/ 0 h 720"/>
-                          <a:gd name="textAreaBottom" fmla="*/ 33181200 h 720"/>
+                          <a:gd name="textAreaBottom" fmla="*/ 111986280 h 720"/>
                           <a:gd name="GluePoint1X" fmla=""/>
                           <a:gd name="GluePoint1Y" fmla=""/>
                           <a:gd name="GluePoint2X" fmla=""/>
@@ -20576,7 +20595,7 @@
                       <w:txbxContent>
                         <w:p>
                           <w:pPr>
-                            <w:pStyle w:val="FrameContents"/>
+                            <w:pStyle w:val="FrameContentsuser"/>
                             <w:spacing w:before="17" w:after="0"/>
                             <w:rPr>
                               <w:sz w:val="14"/>
@@ -20609,7 +20628,7 @@
                 <w:txbxContent>
                   <w:p>
                     <w:pPr>
-                      <w:pStyle w:val="FrameContents"/>
+                      <w:pStyle w:val="FrameContentsuser"/>
                       <w:spacing w:before="17" w:after="0"/>
                       <w:rPr>
                         <w:sz w:val="14"/>
@@ -20671,7 +20690,7 @@
                       <w:txbxContent>
                         <w:p>
                           <w:pPr>
-                            <w:pStyle w:val="FrameContents"/>
+                            <w:pStyle w:val="FrameContentsuser"/>
                             <w:spacing w:before="17" w:after="0"/>
                             <w:ind w:left="20"/>
                             <w:rPr>
@@ -20759,7 +20778,7 @@
                 <w:txbxContent>
                   <w:p>
                     <w:pPr>
-                      <w:pStyle w:val="FrameContents"/>
+                      <w:pStyle w:val="FrameContentsuser"/>
                       <w:spacing w:before="17" w:after="0"/>
                       <w:ind w:left="20"/>
                       <w:rPr>
@@ -21142,7 +21161,7 @@
     <w:pPr>
       <w:widowControl w:val="false"/>
       <w:suppressAutoHyphens w:val="true"/>
-      <w:overflowPunct w:val="false"/>
+      <w:overflowPunct w:val="true"/>
       <w:bidi w:val="0"/>
       <w:spacing w:before="0" w:after="0"/>
       <w:jc w:val="left"/>
@@ -21320,15 +21339,15 @@
     </w:pPr>
     <w:rPr/>
   </w:style>
-  <w:style w:type="paragraph" w:styleId="FrameContents">
-    <w:name w:val="Frame Contents"/>
+  <w:style w:type="paragraph" w:styleId="FrameContentsuser">
+    <w:name w:val="Frame Contents (user)"/>
     <w:basedOn w:val="Normal"/>
     <w:qFormat/>
     <w:pPr/>
     <w:rPr/>
   </w:style>
-  <w:style w:type="paragraph" w:styleId="FrameContentsuser">
-    <w:name w:val="Frame Contents (user)"/>
+  <w:style w:type="paragraph" w:styleId="FrameContents">
+    <w:name w:val="Frame Contents"/>
     <w:basedOn w:val="Normal"/>
     <w:qFormat/>
     <w:pPr/>

</xml_diff>

<commit_message>
Add matches of Kup semifinal
</commit_message>
<xml_diff>
--- a/zapisnik-komet.docx
+++ b/zapisnik-komet.docx
@@ -44,9 +44,9 @@
                           <a:avLst/>
                           <a:gdLst>
                             <a:gd name="textAreaLeft" fmla="*/ 0 w 3996000"/>
-                            <a:gd name="textAreaRight" fmla="*/ 4006800 w 3996000"/>
+                            <a:gd name="textAreaRight" fmla="*/ 4007520 w 3996000"/>
                             <a:gd name="textAreaTop" fmla="*/ 0 h 720"/>
-                            <a:gd name="textAreaBottom" fmla="*/ 111986280 h 720"/>
+                            <a:gd name="textAreaBottom" fmla="*/ 251968680 h 720"/>
                             <a:gd name="GluePoint1X" fmla=""/>
                             <a:gd name="GluePoint1Y" fmla=""/>
                             <a:gd name="GluePoint2X" fmla=""/>
@@ -231,7 +231,7 @@
           <w:szCs w:val="20"/>
           <w:lang w:val="mk-MK"/>
         </w:rPr>
-        <w:t>Младинска Женска Фудбалска Лига 25/26</w:t>
+        <w:t>Втора ЖФЛ 25/26</w:t>
       </w:r>
       <w:r>
         <w:rPr>
@@ -294,7 +294,7 @@
       </w:pPr>
       <w:r>
         <w:rPr>
-          <w:rFonts w:ascii="Arial" w:hAnsi="Arial"/>
+          <w:rFonts w:ascii="system-ui;apple-system;Segoe UI;Roboto;Helvetica;Arial;sans-serif;Apple Color Emoji;Segoe UI Emoji" w:hAnsi="system-ui;apple-system;Segoe UI;Roboto;Helvetica;Arial;sans-serif;Apple Color Emoji;Segoe UI Emoji"/>
           <w:b/>
           <w:bCs/>
           <w:i w:val="false"/>
@@ -302,11 +302,11 @@
           <w:smallCaps w:val="false"/>
           <w:color w:val="212121"/>
           <w:spacing w:val="0"/>
-          <w:sz w:val="28"/>
+          <w:sz w:val="26"/>
           <w:szCs w:val="20"/>
           <w:lang w:val="mk-MK"/>
         </w:rPr>
-        <w:t>ЖФК КАМЕНИЦА САСА - ЖФК ЉУБОТЕН</w:t>
+        <w:t>ЖФК БОРЕЦ - ЖФК ПОРЕЧЕ 2015</w:t>
       </w:r>
     </w:p>
     <w:p>
@@ -388,15 +388,7 @@
       </w:r>
       <w:r>
         <w:rPr/>
-        <w:t>Датум/време: 28.03.2026 1</w:t>
-      </w:r>
-      <w:r>
-        <w:rPr/>
-        <w:t>5:0</w:t>
-      </w:r>
-      <w:r>
-        <w:rPr/>
-        <w:t>0 CEST</w:t>
+        <w:t>Датум/време: 19.04.2026 13:00 CEST</w:t>
       </w:r>
     </w:p>
     <w:p>
@@ -414,7 +406,7 @@
       </w:r>
       <w:r>
         <w:rPr/>
-        <w:t>Игралиште: Градски стадион Македонска</w:t>
+        <w:t>Игралиште: Градски стадион Велес / Велес </w:t>
       </w:r>
     </w:p>
     <w:p>
@@ -447,7 +439,15 @@
           <w:sz w:val="10"/>
           <w:szCs w:val="10"/>
         </w:rPr>
-        <w:t>Коло: 15</w:t>
+        <w:t>Коло: 1</w:t>
+      </w:r>
+      <w:r>
+        <w:rPr>
+          <w:spacing w:val="-1"/>
+          <w:sz w:val="10"/>
+          <w:szCs w:val="10"/>
+        </w:rPr>
+        <w:t>0</w:t>
       </w:r>
     </w:p>
     <w:p>
@@ -493,7 +493,7 @@
           <w:spacing w:val="40"/>
           <w:w w:val="95"/>
         </w:rPr>
-        <w:t>Младинци</w:t>
+        <w:t>Сениори</w:t>
       </w:r>
     </w:p>
     <w:p>
@@ -516,8 +516,8 @@
           <w:pgMar w:left="280" w:right="280" w:gutter="0" w:header="0" w:top="360" w:footer="405" w:bottom="600"/>
           <w:cols w:num="3" w:equalWidth="false" w:sep="false">
             <w:col w:w="4741" w:space="40"/>
-            <w:col w:w="1248" w:space="708"/>
-            <w:col w:w="4607"/>
+            <w:col w:w="1247" w:space="708"/>
+            <w:col w:w="4609"/>
           </w:cols>
           <w:formProt w:val="false"/>
           <w:textDirection w:val="lrTb"/>
@@ -561,7 +561,7 @@
         <w:rPr>
           <w:u w:val="none"/>
         </w:rPr>
-        <w:t>: Ѓеоргиевски Мики (Македонска Каменица)</w:t>
+        <w:t>: Димовски Николче (Велес)</w:t>
       </w:r>
       <w:r>
         <w:rPr/>
@@ -614,7 +614,7 @@
         <w:rPr>
           <w:sz w:val="16"/>
         </w:rPr>
-        <w:t>помошен: Ананиев Александар (Нас.Оризари,Кочани)</w:t>
+        <w:t>помошен: Костов Методија (Велес)</w:t>
         <w:tab/>
       </w:r>
       <w:r>
@@ -683,7 +683,7 @@
           <w:sz w:val="16"/>
           <w:lang w:val="mk-MK"/>
         </w:rPr>
-        <w:t xml:space="preserve"> Велиновски Мартин (Македонска Каменица)</w:t>
+        <w:t xml:space="preserve"> Најдов Мирко (Велес)</w:t>
       </w:r>
       <w:r>
         <w:rPr>
@@ -792,9 +792,9 @@
                           <a:avLst/>
                           <a:gdLst>
                             <a:gd name="textAreaLeft" fmla="*/ 0 w 3996000"/>
-                            <a:gd name="textAreaRight" fmla="*/ 4006800 w 3996000"/>
+                            <a:gd name="textAreaRight" fmla="*/ 4007520 w 3996000"/>
                             <a:gd name="textAreaTop" fmla="*/ 0 h 720"/>
-                            <a:gd name="textAreaBottom" fmla="*/ 111986280 h 720"/>
+                            <a:gd name="textAreaBottom" fmla="*/ 251968680 h 720"/>
                             <a:gd name="GluePoint1X" fmla=""/>
                             <a:gd name="GluePoint1Y" fmla=""/>
                             <a:gd name="GluePoint2X" fmla=""/>
@@ -853,7 +853,7 @@
           <w:u w:val="none"/>
           <w:lang w:val="mk-MK"/>
         </w:rPr>
-        <w:t xml:space="preserve"> Јаневски Драган (Кочани)</w:t>
+        <w:t xml:space="preserve"> Јанушев Бранислав (Скопје)</w:t>
       </w:r>
     </w:p>
     <w:p>
@@ -12897,35 +12897,35 @@
                               <w:gridCol w:w="259"/>
                               <w:gridCol w:w="1"/>
                               <w:gridCol w:w="260"/>
-                              <w:gridCol w:w="289"/>
-                              <w:gridCol w:w="253"/>
+                              <w:gridCol w:w="291"/>
+                              <w:gridCol w:w="251"/>
                               <w:gridCol w:w="247"/>
                               <w:gridCol w:w="250"/>
-                              <w:gridCol w:w="288"/>
+                              <w:gridCol w:w="290"/>
                               <w:gridCol w:w="260"/>
-                              <w:gridCol w:w="268"/>
-                              <w:gridCol w:w="266"/>
+                              <w:gridCol w:w="270"/>
+                              <w:gridCol w:w="264"/>
                               <w:gridCol w:w="254"/>
                               <w:gridCol w:w="253"/>
-                              <w:gridCol w:w="268"/>
-                              <w:gridCol w:w="279"/>
-                              <w:gridCol w:w="254"/>
-                              <w:gridCol w:w="264"/>
+                              <w:gridCol w:w="270"/>
+                              <w:gridCol w:w="278"/>
+                              <w:gridCol w:w="253"/>
+                              <w:gridCol w:w="266"/>
                               <w:gridCol w:w="265"/>
                               <w:gridCol w:w="260"/>
-                              <w:gridCol w:w="259"/>
-                              <w:gridCol w:w="268"/>
+                              <w:gridCol w:w="261"/>
+                              <w:gridCol w:w="266"/>
                               <w:gridCol w:w="263"/>
-                              <w:gridCol w:w="260"/>
+                              <w:gridCol w:w="262"/>
                               <w:gridCol w:w="264"/>
                               <w:gridCol w:w="264"/>
-                              <w:gridCol w:w="263"/>
-                              <w:gridCol w:w="264"/>
+                              <w:gridCol w:w="261"/>
+                              <w:gridCol w:w="266"/>
                               <w:gridCol w:w="262"/>
                               <w:gridCol w:w="264"/>
-                              <w:gridCol w:w="266"/>
-                              <w:gridCol w:w="262"/>
-                              <w:gridCol w:w="160"/>
+                              <w:gridCol w:w="268"/>
+                              <w:gridCol w:w="260"/>
+                              <w:gridCol w:w="154"/>
                             </w:tblGrid>
                             <w:tr>
                               <w:trPr>
@@ -13049,7 +13049,7 @@
                               </w:tc>
                               <w:tc>
                                 <w:tcPr>
-                                  <w:tcW w:w="550" w:type="dxa"/>
+                                  <w:tcW w:w="552" w:type="dxa"/>
                                   <w:gridSpan w:val="3"/>
                                   <w:tcBorders>
                                     <w:top w:val="single" w:sz="2" w:space="0" w:color="000000"/>
@@ -13078,7 +13078,7 @@
                               </w:tc>
                               <w:tc>
                                 <w:tcPr>
-                                  <w:tcW w:w="500" w:type="dxa"/>
+                                  <w:tcW w:w="498" w:type="dxa"/>
                                   <w:gridSpan w:val="2"/>
                                   <w:tcBorders>
                                     <w:top w:val="single" w:sz="2" w:space="0" w:color="000000"/>
@@ -13107,7 +13107,7 @@
                               </w:tc>
                               <w:tc>
                                 <w:tcPr>
-                                  <w:tcW w:w="538" w:type="dxa"/>
+                                  <w:tcW w:w="540" w:type="dxa"/>
                                   <w:gridSpan w:val="2"/>
                                   <w:tcBorders>
                                     <w:top w:val="single" w:sz="2" w:space="0" w:color="000000"/>
@@ -13130,6 +13130,255 @@
                                       <w:rFonts w:ascii="Times New Roman" w:hAnsi="Times New Roman"/>
                                       <w:sz w:val="12"/>
                                       <w:szCs w:val="12"/>
+                                    </w:rPr>
+                                  </w:r>
+                                </w:p>
+                              </w:tc>
+                              <w:tc>
+                                <w:tcPr>
+                                  <w:tcW w:w="530" w:type="dxa"/>
+                                  <w:gridSpan w:val="2"/>
+                                  <w:tcBorders>
+                                    <w:top w:val="single" w:sz="2" w:space="0" w:color="000000"/>
+                                    <w:left w:val="single" w:sz="2" w:space="0" w:color="000000"/>
+                                    <w:bottom w:val="single" w:sz="2" w:space="0" w:color="000000"/>
+                                    <w:right w:val="single" w:sz="2" w:space="0" w:color="000000"/>
+                                  </w:tcBorders>
+                                </w:tcPr>
+                                <w:p>
+                                  <w:pPr>
+                                    <w:pStyle w:val="TableParagraph"/>
+                                    <w:rPr>
+                                      <w:rFonts w:ascii="Times New Roman" w:hAnsi="Times New Roman"/>
+                                      <w:sz w:val="12"/>
+                                      <w:szCs w:val="12"/>
+                                    </w:rPr>
+                                  </w:pPr>
+                                  <w:r>
+                                    <w:rPr>
+                                      <w:rFonts w:ascii="Times New Roman" w:hAnsi="Times New Roman"/>
+                                      <w:sz w:val="12"/>
+                                      <w:szCs w:val="12"/>
+                                    </w:rPr>
+                                  </w:r>
+                                </w:p>
+                              </w:tc>
+                              <w:tc>
+                                <w:tcPr>
+                                  <w:tcW w:w="518" w:type="dxa"/>
+                                  <w:gridSpan w:val="2"/>
+                                  <w:tcBorders>
+                                    <w:top w:val="single" w:sz="2" w:space="0" w:color="000000"/>
+                                    <w:left w:val="single" w:sz="2" w:space="0" w:color="000000"/>
+                                    <w:bottom w:val="single" w:sz="2" w:space="0" w:color="000000"/>
+                                    <w:right w:val="single" w:sz="2" w:space="0" w:color="000000"/>
+                                  </w:tcBorders>
+                                </w:tcPr>
+                                <w:p>
+                                  <w:pPr>
+                                    <w:pStyle w:val="TableParagraph"/>
+                                    <w:rPr>
+                                      <w:rFonts w:ascii="Times New Roman" w:hAnsi="Times New Roman"/>
+                                      <w:sz w:val="12"/>
+                                      <w:szCs w:val="12"/>
+                                    </w:rPr>
+                                  </w:pPr>
+                                  <w:r>
+                                    <w:rPr>
+                                      <w:rFonts w:ascii="Times New Roman" w:hAnsi="Times New Roman"/>
+                                      <w:sz w:val="12"/>
+                                      <w:szCs w:val="12"/>
+                                    </w:rPr>
+                                  </w:r>
+                                </w:p>
+                              </w:tc>
+                              <w:tc>
+                                <w:tcPr>
+                                  <w:tcW w:w="523" w:type="dxa"/>
+                                  <w:gridSpan w:val="2"/>
+                                  <w:tcBorders>
+                                    <w:top w:val="single" w:sz="2" w:space="0" w:color="000000"/>
+                                    <w:left w:val="single" w:sz="2" w:space="0" w:color="000000"/>
+                                    <w:bottom w:val="single" w:sz="2" w:space="0" w:color="000000"/>
+                                    <w:right w:val="single" w:sz="2" w:space="0" w:color="000000"/>
+                                  </w:tcBorders>
+                                </w:tcPr>
+                                <w:p>
+                                  <w:pPr>
+                                    <w:pStyle w:val="TableParagraph"/>
+                                    <w:rPr>
+                                      <w:rFonts w:ascii="Times New Roman" w:hAnsi="Times New Roman"/>
+                                      <w:sz w:val="12"/>
+                                      <w:szCs w:val="12"/>
+                                    </w:rPr>
+                                  </w:pPr>
+                                  <w:r>
+                                    <w:rPr>
+                                      <w:rFonts w:ascii="Times New Roman" w:hAnsi="Times New Roman"/>
+                                      <w:sz w:val="12"/>
+                                      <w:szCs w:val="12"/>
+                                    </w:rPr>
+                                  </w:r>
+                                </w:p>
+                              </w:tc>
+                              <w:tc>
+                                <w:tcPr>
+                                  <w:tcW w:w="531" w:type="dxa"/>
+                                  <w:gridSpan w:val="2"/>
+                                  <w:tcBorders>
+                                    <w:top w:val="single" w:sz="2" w:space="0" w:color="000000"/>
+                                    <w:left w:val="single" w:sz="2" w:space="0" w:color="000000"/>
+                                    <w:bottom w:val="single" w:sz="2" w:space="0" w:color="000000"/>
+                                    <w:right w:val="single" w:sz="2" w:space="0" w:color="000000"/>
+                                  </w:tcBorders>
+                                </w:tcPr>
+                                <w:p>
+                                  <w:pPr>
+                                    <w:pStyle w:val="TableParagraph"/>
+                                    <w:rPr>
+                                      <w:rFonts w:ascii="Times New Roman" w:hAnsi="Times New Roman"/>
+                                      <w:sz w:val="12"/>
+                                    </w:rPr>
+                                  </w:pPr>
+                                  <w:r>
+                                    <w:rPr>
+                                      <w:rFonts w:ascii="Times New Roman" w:hAnsi="Times New Roman"/>
+                                      <w:sz w:val="12"/>
+                                    </w:rPr>
+                                  </w:r>
+                                </w:p>
+                              </w:tc>
+                              <w:tc>
+                                <w:tcPr>
+                                  <w:tcW w:w="531" w:type="dxa"/>
+                                  <w:gridSpan w:val="2"/>
+                                  <w:tcBorders>
+                                    <w:top w:val="single" w:sz="2" w:space="0" w:color="000000"/>
+                                    <w:left w:val="single" w:sz="2" w:space="0" w:color="000000"/>
+                                    <w:bottom w:val="single" w:sz="2" w:space="0" w:color="000000"/>
+                                    <w:right w:val="single" w:sz="2" w:space="0" w:color="000000"/>
+                                  </w:tcBorders>
+                                </w:tcPr>
+                                <w:p>
+                                  <w:pPr>
+                                    <w:pStyle w:val="TableParagraph"/>
+                                    <w:rPr>
+                                      <w:rFonts w:ascii="Times New Roman" w:hAnsi="Times New Roman"/>
+                                      <w:sz w:val="12"/>
+                                    </w:rPr>
+                                  </w:pPr>
+                                  <w:r>
+                                    <w:rPr>
+                                      <w:rFonts w:ascii="Times New Roman" w:hAnsi="Times New Roman"/>
+                                      <w:sz w:val="12"/>
+                                    </w:rPr>
+                                  </w:r>
+                                </w:p>
+                              </w:tc>
+                              <w:tc>
+                                <w:tcPr>
+                                  <w:tcW w:w="521" w:type="dxa"/>
+                                  <w:gridSpan w:val="2"/>
+                                  <w:tcBorders>
+                                    <w:top w:val="single" w:sz="2" w:space="0" w:color="000000"/>
+                                    <w:left w:val="single" w:sz="2" w:space="0" w:color="000000"/>
+                                    <w:bottom w:val="single" w:sz="2" w:space="0" w:color="000000"/>
+                                    <w:right w:val="single" w:sz="2" w:space="0" w:color="000000"/>
+                                  </w:tcBorders>
+                                </w:tcPr>
+                                <w:p>
+                                  <w:pPr>
+                                    <w:pStyle w:val="TableParagraph"/>
+                                    <w:rPr>
+                                      <w:rFonts w:ascii="Times New Roman" w:hAnsi="Times New Roman"/>
+                                      <w:sz w:val="12"/>
+                                    </w:rPr>
+                                  </w:pPr>
+                                  <w:r>
+                                    <w:rPr>
+                                      <w:rFonts w:ascii="Times New Roman" w:hAnsi="Times New Roman"/>
+                                      <w:sz w:val="12"/>
+                                    </w:rPr>
+                                  </w:r>
+                                </w:p>
+                              </w:tc>
+                              <w:tc>
+                                <w:tcPr>
+                                  <w:tcW w:w="529" w:type="dxa"/>
+                                  <w:gridSpan w:val="2"/>
+                                  <w:tcBorders>
+                                    <w:top w:val="single" w:sz="2" w:space="0" w:color="000000"/>
+                                    <w:left w:val="single" w:sz="2" w:space="0" w:color="000000"/>
+                                    <w:bottom w:val="single" w:sz="2" w:space="0" w:color="000000"/>
+                                    <w:right w:val="single" w:sz="2" w:space="0" w:color="000000"/>
+                                  </w:tcBorders>
+                                </w:tcPr>
+                                <w:p>
+                                  <w:pPr>
+                                    <w:pStyle w:val="TableParagraph"/>
+                                    <w:rPr>
+                                      <w:rFonts w:ascii="Times New Roman" w:hAnsi="Times New Roman"/>
+                                      <w:sz w:val="12"/>
+                                    </w:rPr>
+                                  </w:pPr>
+                                  <w:r>
+                                    <w:rPr>
+                                      <w:rFonts w:ascii="Times New Roman" w:hAnsi="Times New Roman"/>
+                                      <w:sz w:val="12"/>
+                                    </w:rPr>
+                                  </w:r>
+                                </w:p>
+                              </w:tc>
+                              <w:tc>
+                                <w:tcPr>
+                                  <w:tcW w:w="526" w:type="dxa"/>
+                                  <w:gridSpan w:val="2"/>
+                                  <w:tcBorders>
+                                    <w:top w:val="single" w:sz="2" w:space="0" w:color="000000"/>
+                                    <w:left w:val="single" w:sz="2" w:space="0" w:color="000000"/>
+                                    <w:bottom w:val="single" w:sz="2" w:space="0" w:color="000000"/>
+                                    <w:right w:val="single" w:sz="2" w:space="0" w:color="000000"/>
+                                  </w:tcBorders>
+                                </w:tcPr>
+                                <w:p>
+                                  <w:pPr>
+                                    <w:pStyle w:val="TableParagraph"/>
+                                    <w:rPr>
+                                      <w:rFonts w:ascii="Times New Roman" w:hAnsi="Times New Roman"/>
+                                      <w:sz w:val="12"/>
+                                    </w:rPr>
+                                  </w:pPr>
+                                  <w:r>
+                                    <w:rPr>
+                                      <w:rFonts w:ascii="Times New Roman" w:hAnsi="Times New Roman"/>
+                                      <w:sz w:val="12"/>
+                                    </w:rPr>
+                                  </w:r>
+                                </w:p>
+                              </w:tc>
+                              <w:tc>
+                                <w:tcPr>
+                                  <w:tcW w:w="525" w:type="dxa"/>
+                                  <w:gridSpan w:val="2"/>
+                                  <w:tcBorders>
+                                    <w:top w:val="single" w:sz="2" w:space="0" w:color="000000"/>
+                                    <w:left w:val="single" w:sz="2" w:space="0" w:color="000000"/>
+                                    <w:bottom w:val="single" w:sz="2" w:space="0" w:color="000000"/>
+                                    <w:right w:val="single" w:sz="2" w:space="0" w:color="000000"/>
+                                  </w:tcBorders>
+                                </w:tcPr>
+                                <w:p>
+                                  <w:pPr>
+                                    <w:pStyle w:val="TableParagraph"/>
+                                    <w:rPr>
+                                      <w:rFonts w:ascii="Times New Roman" w:hAnsi="Times New Roman"/>
+                                      <w:sz w:val="12"/>
+                                    </w:rPr>
+                                  </w:pPr>
+                                  <w:r>
+                                    <w:rPr>
+                                      <w:rFonts w:ascii="Times New Roman" w:hAnsi="Times New Roman"/>
+                                      <w:sz w:val="12"/>
                                     </w:rPr>
                                   </w:r>
                                 </w:p>
@@ -13151,21 +13400,19 @@
                                     <w:rPr>
                                       <w:rFonts w:ascii="Times New Roman" w:hAnsi="Times New Roman"/>
                                       <w:sz w:val="12"/>
-                                      <w:szCs w:val="12"/>
                                     </w:rPr>
                                   </w:pPr>
                                   <w:r>
                                     <w:rPr>
                                       <w:rFonts w:ascii="Times New Roman" w:hAnsi="Times New Roman"/>
                                       <w:sz w:val="12"/>
-                                      <w:szCs w:val="12"/>
                                     </w:rPr>
                                   </w:r>
                                 </w:p>
                               </w:tc>
                               <w:tc>
                                 <w:tcPr>
-                                  <w:tcW w:w="520" w:type="dxa"/>
+                                  <w:tcW w:w="532" w:type="dxa"/>
                                   <w:gridSpan w:val="2"/>
                                   <w:tcBorders>
                                     <w:top w:val="single" w:sz="2" w:space="0" w:color="000000"/>
@@ -13180,266 +13427,19 @@
                                     <w:rPr>
                                       <w:rFonts w:ascii="Times New Roman" w:hAnsi="Times New Roman"/>
                                       <w:sz w:val="12"/>
-                                      <w:szCs w:val="12"/>
                                     </w:rPr>
                                   </w:pPr>
                                   <w:r>
                                     <w:rPr>
                                       <w:rFonts w:ascii="Times New Roman" w:hAnsi="Times New Roman"/>
                                       <w:sz w:val="12"/>
-                                      <w:szCs w:val="12"/>
                                     </w:rPr>
                                   </w:r>
                                 </w:p>
                               </w:tc>
                               <w:tc>
                                 <w:tcPr>
-                                  <w:tcW w:w="521" w:type="dxa"/>
-                                  <w:gridSpan w:val="2"/>
-                                  <w:tcBorders>
-                                    <w:top w:val="single" w:sz="2" w:space="0" w:color="000000"/>
-                                    <w:left w:val="single" w:sz="2" w:space="0" w:color="000000"/>
-                                    <w:bottom w:val="single" w:sz="2" w:space="0" w:color="000000"/>
-                                    <w:right w:val="single" w:sz="2" w:space="0" w:color="000000"/>
-                                  </w:tcBorders>
-                                </w:tcPr>
-                                <w:p>
-                                  <w:pPr>
-                                    <w:pStyle w:val="TableParagraph"/>
-                                    <w:rPr>
-                                      <w:rFonts w:ascii="Times New Roman" w:hAnsi="Times New Roman"/>
-                                      <w:sz w:val="12"/>
-                                      <w:szCs w:val="12"/>
-                                    </w:rPr>
-                                  </w:pPr>
-                                  <w:r>
-                                    <w:rPr>
-                                      <w:rFonts w:ascii="Times New Roman" w:hAnsi="Times New Roman"/>
-                                      <w:sz w:val="12"/>
-                                      <w:szCs w:val="12"/>
-                                    </w:rPr>
-                                  </w:r>
-                                </w:p>
-                              </w:tc>
-                              <w:tc>
-                                <w:tcPr>
-                                  <w:tcW w:w="533" w:type="dxa"/>
-                                  <w:gridSpan w:val="2"/>
-                                  <w:tcBorders>
-                                    <w:top w:val="single" w:sz="2" w:space="0" w:color="000000"/>
-                                    <w:left w:val="single" w:sz="2" w:space="0" w:color="000000"/>
-                                    <w:bottom w:val="single" w:sz="2" w:space="0" w:color="000000"/>
-                                    <w:right w:val="single" w:sz="2" w:space="0" w:color="000000"/>
-                                  </w:tcBorders>
-                                </w:tcPr>
-                                <w:p>
-                                  <w:pPr>
-                                    <w:pStyle w:val="TableParagraph"/>
-                                    <w:rPr>
-                                      <w:rFonts w:ascii="Times New Roman" w:hAnsi="Times New Roman"/>
-                                      <w:sz w:val="12"/>
-                                    </w:rPr>
-                                  </w:pPr>
-                                  <w:r>
-                                    <w:rPr>
-                                      <w:rFonts w:ascii="Times New Roman" w:hAnsi="Times New Roman"/>
-                                      <w:sz w:val="12"/>
-                                    </w:rPr>
-                                  </w:r>
-                                </w:p>
-                              </w:tc>
-                              <w:tc>
-                                <w:tcPr>
-                                  <w:tcW w:w="529" w:type="dxa"/>
-                                  <w:gridSpan w:val="2"/>
-                                  <w:tcBorders>
-                                    <w:top w:val="single" w:sz="2" w:space="0" w:color="000000"/>
-                                    <w:left w:val="single" w:sz="2" w:space="0" w:color="000000"/>
-                                    <w:bottom w:val="single" w:sz="2" w:space="0" w:color="000000"/>
-                                    <w:right w:val="single" w:sz="2" w:space="0" w:color="000000"/>
-                                  </w:tcBorders>
-                                </w:tcPr>
-                                <w:p>
-                                  <w:pPr>
-                                    <w:pStyle w:val="TableParagraph"/>
-                                    <w:rPr>
-                                      <w:rFonts w:ascii="Times New Roman" w:hAnsi="Times New Roman"/>
-                                      <w:sz w:val="12"/>
-                                    </w:rPr>
-                                  </w:pPr>
-                                  <w:r>
-                                    <w:rPr>
-                                      <w:rFonts w:ascii="Times New Roman" w:hAnsi="Times New Roman"/>
-                                      <w:sz w:val="12"/>
-                                    </w:rPr>
-                                  </w:r>
-                                </w:p>
-                              </w:tc>
-                              <w:tc>
-                                <w:tcPr>
-                                  <w:tcW w:w="519" w:type="dxa"/>
-                                  <w:gridSpan w:val="2"/>
-                                  <w:tcBorders>
-                                    <w:top w:val="single" w:sz="2" w:space="0" w:color="000000"/>
-                                    <w:left w:val="single" w:sz="2" w:space="0" w:color="000000"/>
-                                    <w:bottom w:val="single" w:sz="2" w:space="0" w:color="000000"/>
-                                    <w:right w:val="single" w:sz="2" w:space="0" w:color="000000"/>
-                                  </w:tcBorders>
-                                </w:tcPr>
-                                <w:p>
-                                  <w:pPr>
-                                    <w:pStyle w:val="TableParagraph"/>
-                                    <w:rPr>
-                                      <w:rFonts w:ascii="Times New Roman" w:hAnsi="Times New Roman"/>
-                                      <w:sz w:val="12"/>
-                                    </w:rPr>
-                                  </w:pPr>
-                                  <w:r>
-                                    <w:rPr>
-                                      <w:rFonts w:ascii="Times New Roman" w:hAnsi="Times New Roman"/>
-                                      <w:sz w:val="12"/>
-                                    </w:rPr>
-                                  </w:r>
-                                </w:p>
-                              </w:tc>
-                              <w:tc>
-                                <w:tcPr>
-                                  <w:tcW w:w="531" w:type="dxa"/>
-                                  <w:gridSpan w:val="2"/>
-                                  <w:tcBorders>
-                                    <w:top w:val="single" w:sz="2" w:space="0" w:color="000000"/>
-                                    <w:left w:val="single" w:sz="2" w:space="0" w:color="000000"/>
-                                    <w:bottom w:val="single" w:sz="2" w:space="0" w:color="000000"/>
-                                    <w:right w:val="single" w:sz="2" w:space="0" w:color="000000"/>
-                                  </w:tcBorders>
-                                </w:tcPr>
-                                <w:p>
-                                  <w:pPr>
-                                    <w:pStyle w:val="TableParagraph"/>
-                                    <w:rPr>
-                                      <w:rFonts w:ascii="Times New Roman" w:hAnsi="Times New Roman"/>
-                                      <w:sz w:val="12"/>
-                                    </w:rPr>
-                                  </w:pPr>
-                                  <w:r>
-                                    <w:rPr>
-                                      <w:rFonts w:ascii="Times New Roman" w:hAnsi="Times New Roman"/>
-                                      <w:sz w:val="12"/>
-                                    </w:rPr>
-                                  </w:r>
-                                </w:p>
-                              </w:tc>
-                              <w:tc>
-                                <w:tcPr>
-                                  <w:tcW w:w="524" w:type="dxa"/>
-                                  <w:gridSpan w:val="2"/>
-                                  <w:tcBorders>
-                                    <w:top w:val="single" w:sz="2" w:space="0" w:color="000000"/>
-                                    <w:left w:val="single" w:sz="2" w:space="0" w:color="000000"/>
-                                    <w:bottom w:val="single" w:sz="2" w:space="0" w:color="000000"/>
-                                    <w:right w:val="single" w:sz="2" w:space="0" w:color="000000"/>
-                                  </w:tcBorders>
-                                </w:tcPr>
-                                <w:p>
-                                  <w:pPr>
-                                    <w:pStyle w:val="TableParagraph"/>
-                                    <w:rPr>
-                                      <w:rFonts w:ascii="Times New Roman" w:hAnsi="Times New Roman"/>
-                                      <w:sz w:val="12"/>
-                                    </w:rPr>
-                                  </w:pPr>
-                                  <w:r>
-                                    <w:rPr>
-                                      <w:rFonts w:ascii="Times New Roman" w:hAnsi="Times New Roman"/>
-                                      <w:sz w:val="12"/>
-                                    </w:rPr>
-                                  </w:r>
-                                </w:p>
-                              </w:tc>
-                              <w:tc>
-                                <w:tcPr>
-                                  <w:tcW w:w="527" w:type="dxa"/>
-                                  <w:gridSpan w:val="2"/>
-                                  <w:tcBorders>
-                                    <w:top w:val="single" w:sz="2" w:space="0" w:color="000000"/>
-                                    <w:left w:val="single" w:sz="2" w:space="0" w:color="000000"/>
-                                    <w:bottom w:val="single" w:sz="2" w:space="0" w:color="000000"/>
-                                    <w:right w:val="single" w:sz="2" w:space="0" w:color="000000"/>
-                                  </w:tcBorders>
-                                </w:tcPr>
-                                <w:p>
-                                  <w:pPr>
-                                    <w:pStyle w:val="TableParagraph"/>
-                                    <w:rPr>
-                                      <w:rFonts w:ascii="Times New Roman" w:hAnsi="Times New Roman"/>
-                                      <w:sz w:val="12"/>
-                                    </w:rPr>
-                                  </w:pPr>
-                                  <w:r>
-                                    <w:rPr>
-                                      <w:rFonts w:ascii="Times New Roman" w:hAnsi="Times New Roman"/>
-                                      <w:sz w:val="12"/>
-                                    </w:rPr>
-                                  </w:r>
-                                </w:p>
-                              </w:tc>
-                              <w:tc>
-                                <w:tcPr>
-                                  <w:tcW w:w="526" w:type="dxa"/>
-                                  <w:gridSpan w:val="2"/>
-                                  <w:tcBorders>
-                                    <w:top w:val="single" w:sz="2" w:space="0" w:color="000000"/>
-                                    <w:left w:val="single" w:sz="2" w:space="0" w:color="000000"/>
-                                    <w:bottom w:val="single" w:sz="2" w:space="0" w:color="000000"/>
-                                    <w:right w:val="single" w:sz="2" w:space="0" w:color="000000"/>
-                                  </w:tcBorders>
-                                </w:tcPr>
-                                <w:p>
-                                  <w:pPr>
-                                    <w:pStyle w:val="TableParagraph"/>
-                                    <w:rPr>
-                                      <w:rFonts w:ascii="Times New Roman" w:hAnsi="Times New Roman"/>
-                                      <w:sz w:val="12"/>
-                                    </w:rPr>
-                                  </w:pPr>
-                                  <w:r>
-                                    <w:rPr>
-                                      <w:rFonts w:ascii="Times New Roman" w:hAnsi="Times New Roman"/>
-                                      <w:sz w:val="12"/>
-                                    </w:rPr>
-                                  </w:r>
-                                </w:p>
-                              </w:tc>
-                              <w:tc>
-                                <w:tcPr>
-                                  <w:tcW w:w="530" w:type="dxa"/>
-                                  <w:gridSpan w:val="2"/>
-                                  <w:tcBorders>
-                                    <w:top w:val="single" w:sz="2" w:space="0" w:color="000000"/>
-                                    <w:left w:val="single" w:sz="2" w:space="0" w:color="000000"/>
-                                    <w:bottom w:val="single" w:sz="2" w:space="0" w:color="000000"/>
-                                    <w:right w:val="single" w:sz="2" w:space="0" w:color="000000"/>
-                                  </w:tcBorders>
-                                </w:tcPr>
-                                <w:p>
-                                  <w:pPr>
-                                    <w:pStyle w:val="TableParagraph"/>
-                                    <w:rPr>
-                                      <w:rFonts w:ascii="Times New Roman" w:hAnsi="Times New Roman"/>
-                                      <w:sz w:val="12"/>
-                                    </w:rPr>
-                                  </w:pPr>
-                                  <w:r>
-                                    <w:rPr>
-                                      <w:rFonts w:ascii="Times New Roman" w:hAnsi="Times New Roman"/>
-                                      <w:sz w:val="12"/>
-                                    </w:rPr>
-                                  </w:r>
-                                </w:p>
-                              </w:tc>
-                              <w:tc>
-                                <w:tcPr>
-                                  <w:tcW w:w="422" w:type="dxa"/>
+                                  <w:tcW w:w="414" w:type="dxa"/>
                                   <w:gridSpan w:val="2"/>
                                   <w:tcBorders>
                                     <w:top w:val="single" w:sz="2" w:space="0" w:color="000000"/>
@@ -13707,7 +13707,215 @@
                               </w:tc>
                               <w:tc>
                                 <w:tcPr>
-                                  <w:tcW w:w="289" w:type="dxa"/>
+                                  <w:tcW w:w="291" w:type="dxa"/>
+                                  <w:tcBorders>
+                                    <w:top w:val="single" w:sz="2" w:space="0" w:color="000000"/>
+                                    <w:left w:val="single" w:sz="2" w:space="0" w:color="000000"/>
+                                    <w:bottom w:val="single" w:sz="2" w:space="0" w:color="000000"/>
+                                    <w:right w:val="single" w:sz="2" w:space="0" w:color="000000"/>
+                                  </w:tcBorders>
+                                </w:tcPr>
+                                <w:p>
+                                  <w:pPr>
+                                    <w:pStyle w:val="TableParagraph"/>
+                                    <w:rPr>
+                                      <w:rFonts w:ascii="Times New Roman" w:hAnsi="Times New Roman"/>
+                                      <w:sz w:val="12"/>
+                                    </w:rPr>
+                                  </w:pPr>
+                                  <w:r>
+                                    <w:rPr>
+                                      <w:rFonts w:ascii="Times New Roman" w:hAnsi="Times New Roman"/>
+                                      <w:sz w:val="12"/>
+                                    </w:rPr>
+                                  </w:r>
+                                </w:p>
+                              </w:tc>
+                              <w:tc>
+                                <w:tcPr>
+                                  <w:tcW w:w="251" w:type="dxa"/>
+                                  <w:tcBorders>
+                                    <w:top w:val="single" w:sz="2" w:space="0" w:color="000000"/>
+                                    <w:left w:val="single" w:sz="2" w:space="0" w:color="000000"/>
+                                    <w:bottom w:val="single" w:sz="2" w:space="0" w:color="000000"/>
+                                    <w:right w:val="single" w:sz="2" w:space="0" w:color="000000"/>
+                                  </w:tcBorders>
+                                </w:tcPr>
+                                <w:p>
+                                  <w:pPr>
+                                    <w:pStyle w:val="TableParagraph"/>
+                                    <w:rPr>
+                                      <w:rFonts w:ascii="Times New Roman" w:hAnsi="Times New Roman"/>
+                                      <w:sz w:val="12"/>
+                                    </w:rPr>
+                                  </w:pPr>
+                                  <w:r>
+                                    <w:rPr>
+                                      <w:rFonts w:ascii="Times New Roman" w:hAnsi="Times New Roman"/>
+                                      <w:sz w:val="12"/>
+                                    </w:rPr>
+                                  </w:r>
+                                </w:p>
+                              </w:tc>
+                              <w:tc>
+                                <w:tcPr>
+                                  <w:tcW w:w="247" w:type="dxa"/>
+                                  <w:tcBorders>
+                                    <w:top w:val="single" w:sz="2" w:space="0" w:color="000000"/>
+                                    <w:left w:val="single" w:sz="2" w:space="0" w:color="000000"/>
+                                    <w:bottom w:val="single" w:sz="2" w:space="0" w:color="000000"/>
+                                    <w:right w:val="single" w:sz="2" w:space="0" w:color="000000"/>
+                                  </w:tcBorders>
+                                </w:tcPr>
+                                <w:p>
+                                  <w:pPr>
+                                    <w:pStyle w:val="TableParagraph"/>
+                                    <w:rPr>
+                                      <w:rFonts w:ascii="Times New Roman" w:hAnsi="Times New Roman"/>
+                                      <w:sz w:val="12"/>
+                                    </w:rPr>
+                                  </w:pPr>
+                                  <w:r>
+                                    <w:rPr>
+                                      <w:rFonts w:ascii="Times New Roman" w:hAnsi="Times New Roman"/>
+                                      <w:sz w:val="12"/>
+                                    </w:rPr>
+                                  </w:r>
+                                </w:p>
+                              </w:tc>
+                              <w:tc>
+                                <w:tcPr>
+                                  <w:tcW w:w="250" w:type="dxa"/>
+                                  <w:tcBorders>
+                                    <w:top w:val="single" w:sz="2" w:space="0" w:color="000000"/>
+                                    <w:left w:val="single" w:sz="2" w:space="0" w:color="000000"/>
+                                    <w:bottom w:val="single" w:sz="2" w:space="0" w:color="000000"/>
+                                    <w:right w:val="single" w:sz="2" w:space="0" w:color="000000"/>
+                                  </w:tcBorders>
+                                </w:tcPr>
+                                <w:p>
+                                  <w:pPr>
+                                    <w:pStyle w:val="TableParagraph"/>
+                                    <w:rPr>
+                                      <w:rFonts w:ascii="Times New Roman" w:hAnsi="Times New Roman"/>
+                                      <w:sz w:val="12"/>
+                                    </w:rPr>
+                                  </w:pPr>
+                                  <w:r>
+                                    <w:rPr>
+                                      <w:rFonts w:ascii="Times New Roman" w:hAnsi="Times New Roman"/>
+                                      <w:sz w:val="12"/>
+                                    </w:rPr>
+                                  </w:r>
+                                </w:p>
+                              </w:tc>
+                              <w:tc>
+                                <w:tcPr>
+                                  <w:tcW w:w="290" w:type="dxa"/>
+                                  <w:tcBorders>
+                                    <w:top w:val="single" w:sz="2" w:space="0" w:color="000000"/>
+                                    <w:left w:val="single" w:sz="2" w:space="0" w:color="000000"/>
+                                    <w:bottom w:val="single" w:sz="2" w:space="0" w:color="000000"/>
+                                    <w:right w:val="single" w:sz="2" w:space="0" w:color="000000"/>
+                                  </w:tcBorders>
+                                </w:tcPr>
+                                <w:p>
+                                  <w:pPr>
+                                    <w:pStyle w:val="TableParagraph"/>
+                                    <w:rPr>
+                                      <w:rFonts w:ascii="Times New Roman" w:hAnsi="Times New Roman"/>
+                                      <w:sz w:val="12"/>
+                                    </w:rPr>
+                                  </w:pPr>
+                                  <w:r>
+                                    <w:rPr>
+                                      <w:rFonts w:ascii="Times New Roman" w:hAnsi="Times New Roman"/>
+                                      <w:sz w:val="12"/>
+                                    </w:rPr>
+                                  </w:r>
+                                </w:p>
+                              </w:tc>
+                              <w:tc>
+                                <w:tcPr>
+                                  <w:tcW w:w="260" w:type="dxa"/>
+                                  <w:tcBorders>
+                                    <w:top w:val="single" w:sz="2" w:space="0" w:color="000000"/>
+                                    <w:left w:val="single" w:sz="2" w:space="0" w:color="000000"/>
+                                    <w:bottom w:val="single" w:sz="2" w:space="0" w:color="000000"/>
+                                    <w:right w:val="single" w:sz="2" w:space="0" w:color="000000"/>
+                                  </w:tcBorders>
+                                </w:tcPr>
+                                <w:p>
+                                  <w:pPr>
+                                    <w:pStyle w:val="TableParagraph"/>
+                                    <w:rPr>
+                                      <w:rFonts w:ascii="Times New Roman" w:hAnsi="Times New Roman"/>
+                                      <w:sz w:val="12"/>
+                                    </w:rPr>
+                                  </w:pPr>
+                                  <w:r>
+                                    <w:rPr>
+                                      <w:rFonts w:ascii="Times New Roman" w:hAnsi="Times New Roman"/>
+                                      <w:sz w:val="12"/>
+                                    </w:rPr>
+                                  </w:r>
+                                </w:p>
+                              </w:tc>
+                              <w:tc>
+                                <w:tcPr>
+                                  <w:tcW w:w="270" w:type="dxa"/>
+                                  <w:tcBorders>
+                                    <w:top w:val="single" w:sz="2" w:space="0" w:color="000000"/>
+                                    <w:left w:val="single" w:sz="2" w:space="0" w:color="000000"/>
+                                    <w:bottom w:val="single" w:sz="2" w:space="0" w:color="000000"/>
+                                    <w:right w:val="single" w:sz="2" w:space="0" w:color="000000"/>
+                                  </w:tcBorders>
+                                </w:tcPr>
+                                <w:p>
+                                  <w:pPr>
+                                    <w:pStyle w:val="TableParagraph"/>
+                                    <w:rPr>
+                                      <w:rFonts w:ascii="Times New Roman" w:hAnsi="Times New Roman"/>
+                                      <w:sz w:val="12"/>
+                                    </w:rPr>
+                                  </w:pPr>
+                                  <w:r>
+                                    <w:rPr>
+                                      <w:rFonts w:ascii="Times New Roman" w:hAnsi="Times New Roman"/>
+                                      <w:sz w:val="12"/>
+                                    </w:rPr>
+                                  </w:r>
+                                </w:p>
+                              </w:tc>
+                              <w:tc>
+                                <w:tcPr>
+                                  <w:tcW w:w="264" w:type="dxa"/>
+                                  <w:tcBorders>
+                                    <w:top w:val="single" w:sz="2" w:space="0" w:color="000000"/>
+                                    <w:left w:val="single" w:sz="2" w:space="0" w:color="000000"/>
+                                    <w:bottom w:val="single" w:sz="2" w:space="0" w:color="000000"/>
+                                    <w:right w:val="single" w:sz="2" w:space="0" w:color="000000"/>
+                                  </w:tcBorders>
+                                </w:tcPr>
+                                <w:p>
+                                  <w:pPr>
+                                    <w:pStyle w:val="TableParagraph"/>
+                                    <w:rPr>
+                                      <w:rFonts w:ascii="Times New Roman" w:hAnsi="Times New Roman"/>
+                                      <w:sz w:val="12"/>
+                                    </w:rPr>
+                                  </w:pPr>
+                                  <w:r>
+                                    <w:rPr>
+                                      <w:rFonts w:ascii="Times New Roman" w:hAnsi="Times New Roman"/>
+                                      <w:sz w:val="12"/>
+                                    </w:rPr>
+                                  </w:r>
+                                </w:p>
+                              </w:tc>
+                              <w:tc>
+                                <w:tcPr>
+                                  <w:tcW w:w="254" w:type="dxa"/>
                                   <w:tcBorders>
                                     <w:top w:val="single" w:sz="2" w:space="0" w:color="000000"/>
                                     <w:left w:val="single" w:sz="2" w:space="0" w:color="000000"/>
@@ -13759,7 +13967,7 @@
                               </w:tc>
                               <w:tc>
                                 <w:tcPr>
-                                  <w:tcW w:w="247" w:type="dxa"/>
+                                  <w:tcW w:w="270" w:type="dxa"/>
                                   <w:tcBorders>
                                     <w:top w:val="single" w:sz="2" w:space="0" w:color="000000"/>
                                     <w:left w:val="single" w:sz="2" w:space="0" w:color="000000"/>
@@ -13785,7 +13993,7 @@
                               </w:tc>
                               <w:tc>
                                 <w:tcPr>
-                                  <w:tcW w:w="250" w:type="dxa"/>
+                                  <w:tcW w:w="278" w:type="dxa"/>
                                   <w:tcBorders>
                                     <w:top w:val="single" w:sz="2" w:space="0" w:color="000000"/>
                                     <w:left w:val="single" w:sz="2" w:space="0" w:color="000000"/>
@@ -13811,7 +14019,59 @@
                               </w:tc>
                               <w:tc>
                                 <w:tcPr>
-                                  <w:tcW w:w="288" w:type="dxa"/>
+                                  <w:tcW w:w="253" w:type="dxa"/>
+                                  <w:tcBorders>
+                                    <w:top w:val="single" w:sz="2" w:space="0" w:color="000000"/>
+                                    <w:left w:val="single" w:sz="2" w:space="0" w:color="000000"/>
+                                    <w:bottom w:val="single" w:sz="2" w:space="0" w:color="000000"/>
+                                    <w:right w:val="single" w:sz="2" w:space="0" w:color="000000"/>
+                                  </w:tcBorders>
+                                </w:tcPr>
+                                <w:p>
+                                  <w:pPr>
+                                    <w:pStyle w:val="TableParagraph"/>
+                                    <w:rPr>
+                                      <w:rFonts w:ascii="Times New Roman" w:hAnsi="Times New Roman"/>
+                                      <w:sz w:val="12"/>
+                                    </w:rPr>
+                                  </w:pPr>
+                                  <w:r>
+                                    <w:rPr>
+                                      <w:rFonts w:ascii="Times New Roman" w:hAnsi="Times New Roman"/>
+                                      <w:sz w:val="12"/>
+                                    </w:rPr>
+                                  </w:r>
+                                </w:p>
+                              </w:tc>
+                              <w:tc>
+                                <w:tcPr>
+                                  <w:tcW w:w="266" w:type="dxa"/>
+                                  <w:tcBorders>
+                                    <w:top w:val="single" w:sz="2" w:space="0" w:color="000000"/>
+                                    <w:left w:val="single" w:sz="2" w:space="0" w:color="000000"/>
+                                    <w:bottom w:val="single" w:sz="2" w:space="0" w:color="000000"/>
+                                    <w:right w:val="single" w:sz="2" w:space="0" w:color="000000"/>
+                                  </w:tcBorders>
+                                </w:tcPr>
+                                <w:p>
+                                  <w:pPr>
+                                    <w:pStyle w:val="TableParagraph"/>
+                                    <w:rPr>
+                                      <w:rFonts w:ascii="Times New Roman" w:hAnsi="Times New Roman"/>
+                                      <w:sz w:val="12"/>
+                                    </w:rPr>
+                                  </w:pPr>
+                                  <w:r>
+                                    <w:rPr>
+                                      <w:rFonts w:ascii="Times New Roman" w:hAnsi="Times New Roman"/>
+                                      <w:sz w:val="12"/>
+                                    </w:rPr>
+                                  </w:r>
+                                </w:p>
+                              </w:tc>
+                              <w:tc>
+                                <w:tcPr>
+                                  <w:tcW w:w="265" w:type="dxa"/>
                                   <w:tcBorders>
                                     <w:top w:val="single" w:sz="2" w:space="0" w:color="000000"/>
                                     <w:left w:val="single" w:sz="2" w:space="0" w:color="000000"/>
@@ -13863,7 +14123,7 @@
                               </w:tc>
                               <w:tc>
                                 <w:tcPr>
-                                  <w:tcW w:w="268" w:type="dxa"/>
+                                  <w:tcW w:w="261" w:type="dxa"/>
                                   <w:tcBorders>
                                     <w:top w:val="single" w:sz="2" w:space="0" w:color="000000"/>
                                     <w:left w:val="single" w:sz="2" w:space="0" w:color="000000"/>
@@ -13915,7 +14175,7 @@
                               </w:tc>
                               <w:tc>
                                 <w:tcPr>
-                                  <w:tcW w:w="254" w:type="dxa"/>
+                                  <w:tcW w:w="263" w:type="dxa"/>
                                   <w:tcBorders>
                                     <w:top w:val="single" w:sz="2" w:space="0" w:color="000000"/>
                                     <w:left w:val="single" w:sz="2" w:space="0" w:color="000000"/>
@@ -13941,7 +14201,163 @@
                               </w:tc>
                               <w:tc>
                                 <w:tcPr>
-                                  <w:tcW w:w="253" w:type="dxa"/>
+                                  <w:tcW w:w="262" w:type="dxa"/>
+                                  <w:tcBorders>
+                                    <w:top w:val="single" w:sz="2" w:space="0" w:color="000000"/>
+                                    <w:left w:val="single" w:sz="2" w:space="0" w:color="000000"/>
+                                    <w:bottom w:val="single" w:sz="2" w:space="0" w:color="000000"/>
+                                    <w:right w:val="single" w:sz="2" w:space="0" w:color="000000"/>
+                                  </w:tcBorders>
+                                </w:tcPr>
+                                <w:p>
+                                  <w:pPr>
+                                    <w:pStyle w:val="TableParagraph"/>
+                                    <w:rPr>
+                                      <w:rFonts w:ascii="Times New Roman" w:hAnsi="Times New Roman"/>
+                                      <w:sz w:val="12"/>
+                                    </w:rPr>
+                                  </w:pPr>
+                                  <w:r>
+                                    <w:rPr>
+                                      <w:rFonts w:ascii="Times New Roman" w:hAnsi="Times New Roman"/>
+                                      <w:sz w:val="12"/>
+                                    </w:rPr>
+                                  </w:r>
+                                </w:p>
+                              </w:tc>
+                              <w:tc>
+                                <w:tcPr>
+                                  <w:tcW w:w="264" w:type="dxa"/>
+                                  <w:tcBorders>
+                                    <w:top w:val="single" w:sz="2" w:space="0" w:color="000000"/>
+                                    <w:left w:val="single" w:sz="2" w:space="0" w:color="000000"/>
+                                    <w:bottom w:val="single" w:sz="2" w:space="0" w:color="000000"/>
+                                    <w:right w:val="single" w:sz="2" w:space="0" w:color="000000"/>
+                                  </w:tcBorders>
+                                </w:tcPr>
+                                <w:p>
+                                  <w:pPr>
+                                    <w:pStyle w:val="TableParagraph"/>
+                                    <w:rPr>
+                                      <w:rFonts w:ascii="Times New Roman" w:hAnsi="Times New Roman"/>
+                                      <w:sz w:val="12"/>
+                                    </w:rPr>
+                                  </w:pPr>
+                                  <w:r>
+                                    <w:rPr>
+                                      <w:rFonts w:ascii="Times New Roman" w:hAnsi="Times New Roman"/>
+                                      <w:sz w:val="12"/>
+                                    </w:rPr>
+                                  </w:r>
+                                </w:p>
+                              </w:tc>
+                              <w:tc>
+                                <w:tcPr>
+                                  <w:tcW w:w="264" w:type="dxa"/>
+                                  <w:tcBorders>
+                                    <w:top w:val="single" w:sz="2" w:space="0" w:color="000000"/>
+                                    <w:left w:val="single" w:sz="2" w:space="0" w:color="000000"/>
+                                    <w:bottom w:val="single" w:sz="2" w:space="0" w:color="000000"/>
+                                    <w:right w:val="single" w:sz="2" w:space="0" w:color="000000"/>
+                                  </w:tcBorders>
+                                </w:tcPr>
+                                <w:p>
+                                  <w:pPr>
+                                    <w:pStyle w:val="TableParagraph"/>
+                                    <w:rPr>
+                                      <w:rFonts w:ascii="Times New Roman" w:hAnsi="Times New Roman"/>
+                                      <w:sz w:val="12"/>
+                                    </w:rPr>
+                                  </w:pPr>
+                                  <w:r>
+                                    <w:rPr>
+                                      <w:rFonts w:ascii="Times New Roman" w:hAnsi="Times New Roman"/>
+                                      <w:sz w:val="12"/>
+                                    </w:rPr>
+                                  </w:r>
+                                </w:p>
+                              </w:tc>
+                              <w:tc>
+                                <w:tcPr>
+                                  <w:tcW w:w="261" w:type="dxa"/>
+                                  <w:tcBorders>
+                                    <w:top w:val="single" w:sz="2" w:space="0" w:color="000000"/>
+                                    <w:left w:val="single" w:sz="2" w:space="0" w:color="000000"/>
+                                    <w:bottom w:val="single" w:sz="2" w:space="0" w:color="000000"/>
+                                    <w:right w:val="single" w:sz="2" w:space="0" w:color="000000"/>
+                                  </w:tcBorders>
+                                </w:tcPr>
+                                <w:p>
+                                  <w:pPr>
+                                    <w:pStyle w:val="TableParagraph"/>
+                                    <w:rPr>
+                                      <w:rFonts w:ascii="Times New Roman" w:hAnsi="Times New Roman"/>
+                                      <w:sz w:val="12"/>
+                                    </w:rPr>
+                                  </w:pPr>
+                                  <w:r>
+                                    <w:rPr>
+                                      <w:rFonts w:ascii="Times New Roman" w:hAnsi="Times New Roman"/>
+                                      <w:sz w:val="12"/>
+                                    </w:rPr>
+                                  </w:r>
+                                </w:p>
+                              </w:tc>
+                              <w:tc>
+                                <w:tcPr>
+                                  <w:tcW w:w="266" w:type="dxa"/>
+                                  <w:tcBorders>
+                                    <w:top w:val="single" w:sz="2" w:space="0" w:color="000000"/>
+                                    <w:left w:val="single" w:sz="2" w:space="0" w:color="000000"/>
+                                    <w:bottom w:val="single" w:sz="2" w:space="0" w:color="000000"/>
+                                    <w:right w:val="single" w:sz="2" w:space="0" w:color="000000"/>
+                                  </w:tcBorders>
+                                </w:tcPr>
+                                <w:p>
+                                  <w:pPr>
+                                    <w:pStyle w:val="TableParagraph"/>
+                                    <w:rPr>
+                                      <w:rFonts w:ascii="Times New Roman" w:hAnsi="Times New Roman"/>
+                                      <w:sz w:val="12"/>
+                                    </w:rPr>
+                                  </w:pPr>
+                                  <w:r>
+                                    <w:rPr>
+                                      <w:rFonts w:ascii="Times New Roman" w:hAnsi="Times New Roman"/>
+                                      <w:sz w:val="12"/>
+                                    </w:rPr>
+                                  </w:r>
+                                </w:p>
+                              </w:tc>
+                              <w:tc>
+                                <w:tcPr>
+                                  <w:tcW w:w="262" w:type="dxa"/>
+                                  <w:tcBorders>
+                                    <w:top w:val="single" w:sz="2" w:space="0" w:color="000000"/>
+                                    <w:left w:val="single" w:sz="2" w:space="0" w:color="000000"/>
+                                    <w:bottom w:val="single" w:sz="2" w:space="0" w:color="000000"/>
+                                    <w:right w:val="single" w:sz="2" w:space="0" w:color="000000"/>
+                                  </w:tcBorders>
+                                </w:tcPr>
+                                <w:p>
+                                  <w:pPr>
+                                    <w:pStyle w:val="TableParagraph"/>
+                                    <w:rPr>
+                                      <w:rFonts w:ascii="Times New Roman" w:hAnsi="Times New Roman"/>
+                                      <w:sz w:val="12"/>
+                                    </w:rPr>
+                                  </w:pPr>
+                                  <w:r>
+                                    <w:rPr>
+                                      <w:rFonts w:ascii="Times New Roman" w:hAnsi="Times New Roman"/>
+                                      <w:sz w:val="12"/>
+                                    </w:rPr>
+                                  </w:r>
+                                </w:p>
+                              </w:tc>
+                              <w:tc>
+                                <w:tcPr>
+                                  <w:tcW w:w="264" w:type="dxa"/>
                                   <w:tcBorders>
                                     <w:top w:val="single" w:sz="2" w:space="0" w:color="000000"/>
                                     <w:left w:val="single" w:sz="2" w:space="0" w:color="000000"/>
@@ -13993,110 +14409,6 @@
                               </w:tc>
                               <w:tc>
                                 <w:tcPr>
-                                  <w:tcW w:w="279" w:type="dxa"/>
-                                  <w:tcBorders>
-                                    <w:top w:val="single" w:sz="2" w:space="0" w:color="000000"/>
-                                    <w:left w:val="single" w:sz="2" w:space="0" w:color="000000"/>
-                                    <w:bottom w:val="single" w:sz="2" w:space="0" w:color="000000"/>
-                                    <w:right w:val="single" w:sz="2" w:space="0" w:color="000000"/>
-                                  </w:tcBorders>
-                                </w:tcPr>
-                                <w:p>
-                                  <w:pPr>
-                                    <w:pStyle w:val="TableParagraph"/>
-                                    <w:rPr>
-                                      <w:rFonts w:ascii="Times New Roman" w:hAnsi="Times New Roman"/>
-                                      <w:sz w:val="12"/>
-                                    </w:rPr>
-                                  </w:pPr>
-                                  <w:r>
-                                    <w:rPr>
-                                      <w:rFonts w:ascii="Times New Roman" w:hAnsi="Times New Roman"/>
-                                      <w:sz w:val="12"/>
-                                    </w:rPr>
-                                  </w:r>
-                                </w:p>
-                              </w:tc>
-                              <w:tc>
-                                <w:tcPr>
-                                  <w:tcW w:w="254" w:type="dxa"/>
-                                  <w:tcBorders>
-                                    <w:top w:val="single" w:sz="2" w:space="0" w:color="000000"/>
-                                    <w:left w:val="single" w:sz="2" w:space="0" w:color="000000"/>
-                                    <w:bottom w:val="single" w:sz="2" w:space="0" w:color="000000"/>
-                                    <w:right w:val="single" w:sz="2" w:space="0" w:color="000000"/>
-                                  </w:tcBorders>
-                                </w:tcPr>
-                                <w:p>
-                                  <w:pPr>
-                                    <w:pStyle w:val="TableParagraph"/>
-                                    <w:rPr>
-                                      <w:rFonts w:ascii="Times New Roman" w:hAnsi="Times New Roman"/>
-                                      <w:sz w:val="12"/>
-                                    </w:rPr>
-                                  </w:pPr>
-                                  <w:r>
-                                    <w:rPr>
-                                      <w:rFonts w:ascii="Times New Roman" w:hAnsi="Times New Roman"/>
-                                      <w:sz w:val="12"/>
-                                    </w:rPr>
-                                  </w:r>
-                                </w:p>
-                              </w:tc>
-                              <w:tc>
-                                <w:tcPr>
-                                  <w:tcW w:w="264" w:type="dxa"/>
-                                  <w:tcBorders>
-                                    <w:top w:val="single" w:sz="2" w:space="0" w:color="000000"/>
-                                    <w:left w:val="single" w:sz="2" w:space="0" w:color="000000"/>
-                                    <w:bottom w:val="single" w:sz="2" w:space="0" w:color="000000"/>
-                                    <w:right w:val="single" w:sz="2" w:space="0" w:color="000000"/>
-                                  </w:tcBorders>
-                                </w:tcPr>
-                                <w:p>
-                                  <w:pPr>
-                                    <w:pStyle w:val="TableParagraph"/>
-                                    <w:rPr>
-                                      <w:rFonts w:ascii="Times New Roman" w:hAnsi="Times New Roman"/>
-                                      <w:sz w:val="12"/>
-                                    </w:rPr>
-                                  </w:pPr>
-                                  <w:r>
-                                    <w:rPr>
-                                      <w:rFonts w:ascii="Times New Roman" w:hAnsi="Times New Roman"/>
-                                      <w:sz w:val="12"/>
-                                    </w:rPr>
-                                  </w:r>
-                                </w:p>
-                              </w:tc>
-                              <w:tc>
-                                <w:tcPr>
-                                  <w:tcW w:w="265" w:type="dxa"/>
-                                  <w:tcBorders>
-                                    <w:top w:val="single" w:sz="2" w:space="0" w:color="000000"/>
-                                    <w:left w:val="single" w:sz="2" w:space="0" w:color="000000"/>
-                                    <w:bottom w:val="single" w:sz="2" w:space="0" w:color="000000"/>
-                                    <w:right w:val="single" w:sz="2" w:space="0" w:color="000000"/>
-                                  </w:tcBorders>
-                                </w:tcPr>
-                                <w:p>
-                                  <w:pPr>
-                                    <w:pStyle w:val="TableParagraph"/>
-                                    <w:rPr>
-                                      <w:rFonts w:ascii="Times New Roman" w:hAnsi="Times New Roman"/>
-                                      <w:sz w:val="12"/>
-                                    </w:rPr>
-                                  </w:pPr>
-                                  <w:r>
-                                    <w:rPr>
-                                      <w:rFonts w:ascii="Times New Roman" w:hAnsi="Times New Roman"/>
-                                      <w:sz w:val="12"/>
-                                    </w:rPr>
-                                  </w:r>
-                                </w:p>
-                              </w:tc>
-                              <w:tc>
-                                <w:tcPr>
                                   <w:tcW w:w="260" w:type="dxa"/>
                                   <w:tcBorders>
                                     <w:top w:val="single" w:sz="2" w:space="0" w:color="000000"/>
@@ -14123,319 +14435,7 @@
                               </w:tc>
                               <w:tc>
                                 <w:tcPr>
-                                  <w:tcW w:w="259" w:type="dxa"/>
-                                  <w:tcBorders>
-                                    <w:top w:val="single" w:sz="2" w:space="0" w:color="000000"/>
-                                    <w:left w:val="single" w:sz="2" w:space="0" w:color="000000"/>
-                                    <w:bottom w:val="single" w:sz="2" w:space="0" w:color="000000"/>
-                                    <w:right w:val="single" w:sz="2" w:space="0" w:color="000000"/>
-                                  </w:tcBorders>
-                                </w:tcPr>
-                                <w:p>
-                                  <w:pPr>
-                                    <w:pStyle w:val="TableParagraph"/>
-                                    <w:rPr>
-                                      <w:rFonts w:ascii="Times New Roman" w:hAnsi="Times New Roman"/>
-                                      <w:sz w:val="12"/>
-                                    </w:rPr>
-                                  </w:pPr>
-                                  <w:r>
-                                    <w:rPr>
-                                      <w:rFonts w:ascii="Times New Roman" w:hAnsi="Times New Roman"/>
-                                      <w:sz w:val="12"/>
-                                    </w:rPr>
-                                  </w:r>
-                                </w:p>
-                              </w:tc>
-                              <w:tc>
-                                <w:tcPr>
-                                  <w:tcW w:w="268" w:type="dxa"/>
-                                  <w:tcBorders>
-                                    <w:top w:val="single" w:sz="2" w:space="0" w:color="000000"/>
-                                    <w:left w:val="single" w:sz="2" w:space="0" w:color="000000"/>
-                                    <w:bottom w:val="single" w:sz="2" w:space="0" w:color="000000"/>
-                                    <w:right w:val="single" w:sz="2" w:space="0" w:color="000000"/>
-                                  </w:tcBorders>
-                                </w:tcPr>
-                                <w:p>
-                                  <w:pPr>
-                                    <w:pStyle w:val="TableParagraph"/>
-                                    <w:rPr>
-                                      <w:rFonts w:ascii="Times New Roman" w:hAnsi="Times New Roman"/>
-                                      <w:sz w:val="12"/>
-                                    </w:rPr>
-                                  </w:pPr>
-                                  <w:r>
-                                    <w:rPr>
-                                      <w:rFonts w:ascii="Times New Roman" w:hAnsi="Times New Roman"/>
-                                      <w:sz w:val="12"/>
-                                    </w:rPr>
-                                  </w:r>
-                                </w:p>
-                              </w:tc>
-                              <w:tc>
-                                <w:tcPr>
-                                  <w:tcW w:w="263" w:type="dxa"/>
-                                  <w:tcBorders>
-                                    <w:top w:val="single" w:sz="2" w:space="0" w:color="000000"/>
-                                    <w:left w:val="single" w:sz="2" w:space="0" w:color="000000"/>
-                                    <w:bottom w:val="single" w:sz="2" w:space="0" w:color="000000"/>
-                                    <w:right w:val="single" w:sz="2" w:space="0" w:color="000000"/>
-                                  </w:tcBorders>
-                                </w:tcPr>
-                                <w:p>
-                                  <w:pPr>
-                                    <w:pStyle w:val="TableParagraph"/>
-                                    <w:rPr>
-                                      <w:rFonts w:ascii="Times New Roman" w:hAnsi="Times New Roman"/>
-                                      <w:sz w:val="12"/>
-                                    </w:rPr>
-                                  </w:pPr>
-                                  <w:r>
-                                    <w:rPr>
-                                      <w:rFonts w:ascii="Times New Roman" w:hAnsi="Times New Roman"/>
-                                      <w:sz w:val="12"/>
-                                    </w:rPr>
-                                  </w:r>
-                                </w:p>
-                              </w:tc>
-                              <w:tc>
-                                <w:tcPr>
-                                  <w:tcW w:w="260" w:type="dxa"/>
-                                  <w:tcBorders>
-                                    <w:top w:val="single" w:sz="2" w:space="0" w:color="000000"/>
-                                    <w:left w:val="single" w:sz="2" w:space="0" w:color="000000"/>
-                                    <w:bottom w:val="single" w:sz="2" w:space="0" w:color="000000"/>
-                                    <w:right w:val="single" w:sz="2" w:space="0" w:color="000000"/>
-                                  </w:tcBorders>
-                                </w:tcPr>
-                                <w:p>
-                                  <w:pPr>
-                                    <w:pStyle w:val="TableParagraph"/>
-                                    <w:rPr>
-                                      <w:rFonts w:ascii="Times New Roman" w:hAnsi="Times New Roman"/>
-                                      <w:sz w:val="12"/>
-                                    </w:rPr>
-                                  </w:pPr>
-                                  <w:r>
-                                    <w:rPr>
-                                      <w:rFonts w:ascii="Times New Roman" w:hAnsi="Times New Roman"/>
-                                      <w:sz w:val="12"/>
-                                    </w:rPr>
-                                  </w:r>
-                                </w:p>
-                              </w:tc>
-                              <w:tc>
-                                <w:tcPr>
-                                  <w:tcW w:w="264" w:type="dxa"/>
-                                  <w:tcBorders>
-                                    <w:top w:val="single" w:sz="2" w:space="0" w:color="000000"/>
-                                    <w:left w:val="single" w:sz="2" w:space="0" w:color="000000"/>
-                                    <w:bottom w:val="single" w:sz="2" w:space="0" w:color="000000"/>
-                                    <w:right w:val="single" w:sz="2" w:space="0" w:color="000000"/>
-                                  </w:tcBorders>
-                                </w:tcPr>
-                                <w:p>
-                                  <w:pPr>
-                                    <w:pStyle w:val="TableParagraph"/>
-                                    <w:rPr>
-                                      <w:rFonts w:ascii="Times New Roman" w:hAnsi="Times New Roman"/>
-                                      <w:sz w:val="12"/>
-                                    </w:rPr>
-                                  </w:pPr>
-                                  <w:r>
-                                    <w:rPr>
-                                      <w:rFonts w:ascii="Times New Roman" w:hAnsi="Times New Roman"/>
-                                      <w:sz w:val="12"/>
-                                    </w:rPr>
-                                  </w:r>
-                                </w:p>
-                              </w:tc>
-                              <w:tc>
-                                <w:tcPr>
-                                  <w:tcW w:w="264" w:type="dxa"/>
-                                  <w:tcBorders>
-                                    <w:top w:val="single" w:sz="2" w:space="0" w:color="000000"/>
-                                    <w:left w:val="single" w:sz="2" w:space="0" w:color="000000"/>
-                                    <w:bottom w:val="single" w:sz="2" w:space="0" w:color="000000"/>
-                                    <w:right w:val="single" w:sz="2" w:space="0" w:color="000000"/>
-                                  </w:tcBorders>
-                                </w:tcPr>
-                                <w:p>
-                                  <w:pPr>
-                                    <w:pStyle w:val="TableParagraph"/>
-                                    <w:rPr>
-                                      <w:rFonts w:ascii="Times New Roman" w:hAnsi="Times New Roman"/>
-                                      <w:sz w:val="12"/>
-                                    </w:rPr>
-                                  </w:pPr>
-                                  <w:r>
-                                    <w:rPr>
-                                      <w:rFonts w:ascii="Times New Roman" w:hAnsi="Times New Roman"/>
-                                      <w:sz w:val="12"/>
-                                    </w:rPr>
-                                  </w:r>
-                                </w:p>
-                              </w:tc>
-                              <w:tc>
-                                <w:tcPr>
-                                  <w:tcW w:w="263" w:type="dxa"/>
-                                  <w:tcBorders>
-                                    <w:top w:val="single" w:sz="2" w:space="0" w:color="000000"/>
-                                    <w:left w:val="single" w:sz="2" w:space="0" w:color="000000"/>
-                                    <w:bottom w:val="single" w:sz="2" w:space="0" w:color="000000"/>
-                                    <w:right w:val="single" w:sz="2" w:space="0" w:color="000000"/>
-                                  </w:tcBorders>
-                                </w:tcPr>
-                                <w:p>
-                                  <w:pPr>
-                                    <w:pStyle w:val="TableParagraph"/>
-                                    <w:rPr>
-                                      <w:rFonts w:ascii="Times New Roman" w:hAnsi="Times New Roman"/>
-                                      <w:sz w:val="12"/>
-                                    </w:rPr>
-                                  </w:pPr>
-                                  <w:r>
-                                    <w:rPr>
-                                      <w:rFonts w:ascii="Times New Roman" w:hAnsi="Times New Roman"/>
-                                      <w:sz w:val="12"/>
-                                    </w:rPr>
-                                  </w:r>
-                                </w:p>
-                              </w:tc>
-                              <w:tc>
-                                <w:tcPr>
-                                  <w:tcW w:w="264" w:type="dxa"/>
-                                  <w:tcBorders>
-                                    <w:top w:val="single" w:sz="2" w:space="0" w:color="000000"/>
-                                    <w:left w:val="single" w:sz="2" w:space="0" w:color="000000"/>
-                                    <w:bottom w:val="single" w:sz="2" w:space="0" w:color="000000"/>
-                                    <w:right w:val="single" w:sz="2" w:space="0" w:color="000000"/>
-                                  </w:tcBorders>
-                                </w:tcPr>
-                                <w:p>
-                                  <w:pPr>
-                                    <w:pStyle w:val="TableParagraph"/>
-                                    <w:rPr>
-                                      <w:rFonts w:ascii="Times New Roman" w:hAnsi="Times New Roman"/>
-                                      <w:sz w:val="12"/>
-                                    </w:rPr>
-                                  </w:pPr>
-                                  <w:r>
-                                    <w:rPr>
-                                      <w:rFonts w:ascii="Times New Roman" w:hAnsi="Times New Roman"/>
-                                      <w:sz w:val="12"/>
-                                    </w:rPr>
-                                  </w:r>
-                                </w:p>
-                              </w:tc>
-                              <w:tc>
-                                <w:tcPr>
-                                  <w:tcW w:w="262" w:type="dxa"/>
-                                  <w:tcBorders>
-                                    <w:top w:val="single" w:sz="2" w:space="0" w:color="000000"/>
-                                    <w:left w:val="single" w:sz="2" w:space="0" w:color="000000"/>
-                                    <w:bottom w:val="single" w:sz="2" w:space="0" w:color="000000"/>
-                                    <w:right w:val="single" w:sz="2" w:space="0" w:color="000000"/>
-                                  </w:tcBorders>
-                                </w:tcPr>
-                                <w:p>
-                                  <w:pPr>
-                                    <w:pStyle w:val="TableParagraph"/>
-                                    <w:rPr>
-                                      <w:rFonts w:ascii="Times New Roman" w:hAnsi="Times New Roman"/>
-                                      <w:sz w:val="12"/>
-                                    </w:rPr>
-                                  </w:pPr>
-                                  <w:r>
-                                    <w:rPr>
-                                      <w:rFonts w:ascii="Times New Roman" w:hAnsi="Times New Roman"/>
-                                      <w:sz w:val="12"/>
-                                    </w:rPr>
-                                  </w:r>
-                                </w:p>
-                              </w:tc>
-                              <w:tc>
-                                <w:tcPr>
-                                  <w:tcW w:w="264" w:type="dxa"/>
-                                  <w:tcBorders>
-                                    <w:top w:val="single" w:sz="2" w:space="0" w:color="000000"/>
-                                    <w:left w:val="single" w:sz="2" w:space="0" w:color="000000"/>
-                                    <w:bottom w:val="single" w:sz="2" w:space="0" w:color="000000"/>
-                                    <w:right w:val="single" w:sz="2" w:space="0" w:color="000000"/>
-                                  </w:tcBorders>
-                                </w:tcPr>
-                                <w:p>
-                                  <w:pPr>
-                                    <w:pStyle w:val="TableParagraph"/>
-                                    <w:rPr>
-                                      <w:rFonts w:ascii="Times New Roman" w:hAnsi="Times New Roman"/>
-                                      <w:sz w:val="12"/>
-                                    </w:rPr>
-                                  </w:pPr>
-                                  <w:r>
-                                    <w:rPr>
-                                      <w:rFonts w:ascii="Times New Roman" w:hAnsi="Times New Roman"/>
-                                      <w:sz w:val="12"/>
-                                    </w:rPr>
-                                  </w:r>
-                                </w:p>
-                              </w:tc>
-                              <w:tc>
-                                <w:tcPr>
-                                  <w:tcW w:w="266" w:type="dxa"/>
-                                  <w:tcBorders>
-                                    <w:top w:val="single" w:sz="2" w:space="0" w:color="000000"/>
-                                    <w:left w:val="single" w:sz="2" w:space="0" w:color="000000"/>
-                                    <w:bottom w:val="single" w:sz="2" w:space="0" w:color="000000"/>
-                                    <w:right w:val="single" w:sz="2" w:space="0" w:color="000000"/>
-                                  </w:tcBorders>
-                                </w:tcPr>
-                                <w:p>
-                                  <w:pPr>
-                                    <w:pStyle w:val="TableParagraph"/>
-                                    <w:rPr>
-                                      <w:rFonts w:ascii="Times New Roman" w:hAnsi="Times New Roman"/>
-                                      <w:sz w:val="12"/>
-                                    </w:rPr>
-                                  </w:pPr>
-                                  <w:r>
-                                    <w:rPr>
-                                      <w:rFonts w:ascii="Times New Roman" w:hAnsi="Times New Roman"/>
-                                      <w:sz w:val="12"/>
-                                    </w:rPr>
-                                  </w:r>
-                                </w:p>
-                              </w:tc>
-                              <w:tc>
-                                <w:tcPr>
-                                  <w:tcW w:w="262" w:type="dxa"/>
-                                  <w:tcBorders>
-                                    <w:top w:val="single" w:sz="2" w:space="0" w:color="000000"/>
-                                    <w:left w:val="single" w:sz="2" w:space="0" w:color="000000"/>
-                                    <w:bottom w:val="single" w:sz="2" w:space="0" w:color="000000"/>
-                                    <w:right w:val="single" w:sz="2" w:space="0" w:color="000000"/>
-                                  </w:tcBorders>
-                                </w:tcPr>
-                                <w:p>
-                                  <w:pPr>
-                                    <w:pStyle w:val="TableParagraph"/>
-                                    <w:rPr>
-                                      <w:rFonts w:ascii="Times New Roman" w:hAnsi="Times New Roman"/>
-                                      <w:sz w:val="12"/>
-                                    </w:rPr>
-                                  </w:pPr>
-                                  <w:r>
-                                    <w:rPr>
-                                      <w:rFonts w:ascii="Times New Roman" w:hAnsi="Times New Roman"/>
-                                      <w:sz w:val="12"/>
-                                    </w:rPr>
-                                  </w:r>
-                                </w:p>
-                              </w:tc>
-                              <w:tc>
-                                <w:tcPr>
-                                  <w:tcW w:w="160" w:type="dxa"/>
+                                  <w:tcW w:w="154" w:type="dxa"/>
                                   <w:tcBorders>
                                     <w:top w:val="single" w:sz="2" w:space="0" w:color="000000"/>
                                     <w:left w:val="single" w:sz="2" w:space="0" w:color="000000"/>
@@ -14574,7 +14574,7 @@
                               </w:tc>
                               <w:tc>
                                 <w:tcPr>
-                                  <w:tcW w:w="550" w:type="dxa"/>
+                                  <w:tcW w:w="552" w:type="dxa"/>
                                   <w:gridSpan w:val="3"/>
                                   <w:tcBorders>
                                     <w:top w:val="single" w:sz="2" w:space="0" w:color="000000"/>
@@ -14601,7 +14601,7 @@
                               </w:tc>
                               <w:tc>
                                 <w:tcPr>
-                                  <w:tcW w:w="500" w:type="dxa"/>
+                                  <w:tcW w:w="498" w:type="dxa"/>
                                   <w:gridSpan w:val="2"/>
                                   <w:tcBorders>
                                     <w:top w:val="single" w:sz="2" w:space="0" w:color="000000"/>
@@ -14628,7 +14628,250 @@
                               </w:tc>
                               <w:tc>
                                 <w:tcPr>
-                                  <w:tcW w:w="538" w:type="dxa"/>
+                                  <w:tcW w:w="540" w:type="dxa"/>
+                                  <w:gridSpan w:val="2"/>
+                                  <w:tcBorders>
+                                    <w:top w:val="single" w:sz="2" w:space="0" w:color="000000"/>
+                                    <w:left w:val="single" w:sz="2" w:space="0" w:color="000000"/>
+                                    <w:bottom w:val="single" w:sz="2" w:space="0" w:color="000000"/>
+                                    <w:right w:val="single" w:sz="2" w:space="0" w:color="000000"/>
+                                  </w:tcBorders>
+                                </w:tcPr>
+                                <w:p>
+                                  <w:pPr>
+                                    <w:pStyle w:val="TableParagraph"/>
+                                    <w:rPr>
+                                      <w:rFonts w:ascii="Times New Roman" w:hAnsi="Times New Roman"/>
+                                      <w:sz w:val="12"/>
+                                    </w:rPr>
+                                  </w:pPr>
+                                  <w:r>
+                                    <w:rPr>
+                                      <w:rFonts w:ascii="Times New Roman" w:hAnsi="Times New Roman"/>
+                                      <w:sz w:val="12"/>
+                                    </w:rPr>
+                                  </w:r>
+                                </w:p>
+                              </w:tc>
+                              <w:tc>
+                                <w:tcPr>
+                                  <w:tcW w:w="530" w:type="dxa"/>
+                                  <w:gridSpan w:val="2"/>
+                                  <w:tcBorders>
+                                    <w:top w:val="single" w:sz="2" w:space="0" w:color="000000"/>
+                                    <w:left w:val="single" w:sz="2" w:space="0" w:color="000000"/>
+                                    <w:bottom w:val="single" w:sz="2" w:space="0" w:color="000000"/>
+                                    <w:right w:val="single" w:sz="2" w:space="0" w:color="000000"/>
+                                  </w:tcBorders>
+                                </w:tcPr>
+                                <w:p>
+                                  <w:pPr>
+                                    <w:pStyle w:val="TableParagraph"/>
+                                    <w:rPr>
+                                      <w:rFonts w:ascii="Times New Roman" w:hAnsi="Times New Roman"/>
+                                      <w:sz w:val="12"/>
+                                    </w:rPr>
+                                  </w:pPr>
+                                  <w:r>
+                                    <w:rPr>
+                                      <w:rFonts w:ascii="Times New Roman" w:hAnsi="Times New Roman"/>
+                                      <w:sz w:val="12"/>
+                                    </w:rPr>
+                                  </w:r>
+                                </w:p>
+                              </w:tc>
+                              <w:tc>
+                                <w:tcPr>
+                                  <w:tcW w:w="518" w:type="dxa"/>
+                                  <w:gridSpan w:val="2"/>
+                                  <w:tcBorders>
+                                    <w:top w:val="single" w:sz="2" w:space="0" w:color="000000"/>
+                                    <w:left w:val="single" w:sz="2" w:space="0" w:color="000000"/>
+                                    <w:bottom w:val="single" w:sz="2" w:space="0" w:color="000000"/>
+                                    <w:right w:val="single" w:sz="2" w:space="0" w:color="000000"/>
+                                  </w:tcBorders>
+                                </w:tcPr>
+                                <w:p>
+                                  <w:pPr>
+                                    <w:pStyle w:val="TableParagraph"/>
+                                    <w:rPr>
+                                      <w:rFonts w:ascii="Times New Roman" w:hAnsi="Times New Roman"/>
+                                      <w:sz w:val="12"/>
+                                    </w:rPr>
+                                  </w:pPr>
+                                  <w:r>
+                                    <w:rPr>
+                                      <w:rFonts w:ascii="Times New Roman" w:hAnsi="Times New Roman"/>
+                                      <w:sz w:val="12"/>
+                                    </w:rPr>
+                                  </w:r>
+                                </w:p>
+                              </w:tc>
+                              <w:tc>
+                                <w:tcPr>
+                                  <w:tcW w:w="523" w:type="dxa"/>
+                                  <w:gridSpan w:val="2"/>
+                                  <w:tcBorders>
+                                    <w:top w:val="single" w:sz="2" w:space="0" w:color="000000"/>
+                                    <w:left w:val="single" w:sz="2" w:space="0" w:color="000000"/>
+                                    <w:bottom w:val="single" w:sz="2" w:space="0" w:color="000000"/>
+                                    <w:right w:val="single" w:sz="2" w:space="0" w:color="000000"/>
+                                  </w:tcBorders>
+                                </w:tcPr>
+                                <w:p>
+                                  <w:pPr>
+                                    <w:pStyle w:val="TableParagraph"/>
+                                    <w:rPr>
+                                      <w:rFonts w:ascii="Times New Roman" w:hAnsi="Times New Roman"/>
+                                      <w:sz w:val="12"/>
+                                    </w:rPr>
+                                  </w:pPr>
+                                  <w:r>
+                                    <w:rPr>
+                                      <w:rFonts w:ascii="Times New Roman" w:hAnsi="Times New Roman"/>
+                                      <w:sz w:val="12"/>
+                                    </w:rPr>
+                                  </w:r>
+                                </w:p>
+                              </w:tc>
+                              <w:tc>
+                                <w:tcPr>
+                                  <w:tcW w:w="531" w:type="dxa"/>
+                                  <w:gridSpan w:val="2"/>
+                                  <w:tcBorders>
+                                    <w:top w:val="single" w:sz="2" w:space="0" w:color="000000"/>
+                                    <w:left w:val="single" w:sz="2" w:space="0" w:color="000000"/>
+                                    <w:bottom w:val="single" w:sz="2" w:space="0" w:color="000000"/>
+                                    <w:right w:val="single" w:sz="2" w:space="0" w:color="000000"/>
+                                  </w:tcBorders>
+                                </w:tcPr>
+                                <w:p>
+                                  <w:pPr>
+                                    <w:pStyle w:val="TableParagraph"/>
+                                    <w:rPr>
+                                      <w:rFonts w:ascii="Times New Roman" w:hAnsi="Times New Roman"/>
+                                      <w:sz w:val="12"/>
+                                    </w:rPr>
+                                  </w:pPr>
+                                  <w:r>
+                                    <w:rPr>
+                                      <w:rFonts w:ascii="Times New Roman" w:hAnsi="Times New Roman"/>
+                                      <w:sz w:val="12"/>
+                                    </w:rPr>
+                                  </w:r>
+                                </w:p>
+                              </w:tc>
+                              <w:tc>
+                                <w:tcPr>
+                                  <w:tcW w:w="531" w:type="dxa"/>
+                                  <w:gridSpan w:val="2"/>
+                                  <w:tcBorders>
+                                    <w:top w:val="single" w:sz="2" w:space="0" w:color="000000"/>
+                                    <w:left w:val="single" w:sz="2" w:space="0" w:color="000000"/>
+                                    <w:bottom w:val="single" w:sz="2" w:space="0" w:color="000000"/>
+                                    <w:right w:val="single" w:sz="2" w:space="0" w:color="000000"/>
+                                  </w:tcBorders>
+                                </w:tcPr>
+                                <w:p>
+                                  <w:pPr>
+                                    <w:pStyle w:val="TableParagraph"/>
+                                    <w:rPr>
+                                      <w:rFonts w:ascii="Times New Roman" w:hAnsi="Times New Roman"/>
+                                      <w:sz w:val="12"/>
+                                    </w:rPr>
+                                  </w:pPr>
+                                  <w:r>
+                                    <w:rPr>
+                                      <w:rFonts w:ascii="Times New Roman" w:hAnsi="Times New Roman"/>
+                                      <w:sz w:val="12"/>
+                                    </w:rPr>
+                                  </w:r>
+                                </w:p>
+                              </w:tc>
+                              <w:tc>
+                                <w:tcPr>
+                                  <w:tcW w:w="521" w:type="dxa"/>
+                                  <w:gridSpan w:val="2"/>
+                                  <w:tcBorders>
+                                    <w:top w:val="single" w:sz="2" w:space="0" w:color="000000"/>
+                                    <w:left w:val="single" w:sz="2" w:space="0" w:color="000000"/>
+                                    <w:bottom w:val="single" w:sz="2" w:space="0" w:color="000000"/>
+                                    <w:right w:val="single" w:sz="2" w:space="0" w:color="000000"/>
+                                  </w:tcBorders>
+                                </w:tcPr>
+                                <w:p>
+                                  <w:pPr>
+                                    <w:pStyle w:val="TableParagraph"/>
+                                    <w:rPr>
+                                      <w:rFonts w:ascii="Times New Roman" w:hAnsi="Times New Roman"/>
+                                      <w:sz w:val="12"/>
+                                    </w:rPr>
+                                  </w:pPr>
+                                  <w:r>
+                                    <w:rPr>
+                                      <w:rFonts w:ascii="Times New Roman" w:hAnsi="Times New Roman"/>
+                                      <w:sz w:val="12"/>
+                                    </w:rPr>
+                                  </w:r>
+                                </w:p>
+                              </w:tc>
+                              <w:tc>
+                                <w:tcPr>
+                                  <w:tcW w:w="529" w:type="dxa"/>
+                                  <w:gridSpan w:val="2"/>
+                                  <w:tcBorders>
+                                    <w:top w:val="single" w:sz="2" w:space="0" w:color="000000"/>
+                                    <w:left w:val="single" w:sz="2" w:space="0" w:color="000000"/>
+                                    <w:bottom w:val="single" w:sz="2" w:space="0" w:color="000000"/>
+                                    <w:right w:val="single" w:sz="2" w:space="0" w:color="000000"/>
+                                  </w:tcBorders>
+                                </w:tcPr>
+                                <w:p>
+                                  <w:pPr>
+                                    <w:pStyle w:val="TableParagraph"/>
+                                    <w:rPr>
+                                      <w:rFonts w:ascii="Times New Roman" w:hAnsi="Times New Roman"/>
+                                      <w:sz w:val="12"/>
+                                    </w:rPr>
+                                  </w:pPr>
+                                  <w:r>
+                                    <w:rPr>
+                                      <w:rFonts w:ascii="Times New Roman" w:hAnsi="Times New Roman"/>
+                                      <w:sz w:val="12"/>
+                                    </w:rPr>
+                                  </w:r>
+                                </w:p>
+                              </w:tc>
+                              <w:tc>
+                                <w:tcPr>
+                                  <w:tcW w:w="526" w:type="dxa"/>
+                                  <w:gridSpan w:val="2"/>
+                                  <w:tcBorders>
+                                    <w:top w:val="single" w:sz="2" w:space="0" w:color="000000"/>
+                                    <w:left w:val="single" w:sz="2" w:space="0" w:color="000000"/>
+                                    <w:bottom w:val="single" w:sz="2" w:space="0" w:color="000000"/>
+                                    <w:right w:val="single" w:sz="2" w:space="0" w:color="000000"/>
+                                  </w:tcBorders>
+                                </w:tcPr>
+                                <w:p>
+                                  <w:pPr>
+                                    <w:pStyle w:val="TableParagraph"/>
+                                    <w:rPr>
+                                      <w:rFonts w:ascii="Times New Roman" w:hAnsi="Times New Roman"/>
+                                      <w:sz w:val="12"/>
+                                    </w:rPr>
+                                  </w:pPr>
+                                  <w:r>
+                                    <w:rPr>
+                                      <w:rFonts w:ascii="Times New Roman" w:hAnsi="Times New Roman"/>
+                                      <w:sz w:val="12"/>
+                                    </w:rPr>
+                                  </w:r>
+                                </w:p>
+                              </w:tc>
+                              <w:tc>
+                                <w:tcPr>
+                                  <w:tcW w:w="525" w:type="dxa"/>
                                   <w:gridSpan w:val="2"/>
                                   <w:tcBorders>
                                     <w:top w:val="single" w:sz="2" w:space="0" w:color="000000"/>
@@ -14682,7 +14925,7 @@
                               </w:tc>
                               <w:tc>
                                 <w:tcPr>
-                                  <w:tcW w:w="520" w:type="dxa"/>
+                                  <w:tcW w:w="532" w:type="dxa"/>
                                   <w:gridSpan w:val="2"/>
                                   <w:tcBorders>
                                     <w:top w:val="single" w:sz="2" w:space="0" w:color="000000"/>
@@ -14709,250 +14952,7 @@
                               </w:tc>
                               <w:tc>
                                 <w:tcPr>
-                                  <w:tcW w:w="521" w:type="dxa"/>
-                                  <w:gridSpan w:val="2"/>
-                                  <w:tcBorders>
-                                    <w:top w:val="single" w:sz="2" w:space="0" w:color="000000"/>
-                                    <w:left w:val="single" w:sz="2" w:space="0" w:color="000000"/>
-                                    <w:bottom w:val="single" w:sz="2" w:space="0" w:color="000000"/>
-                                    <w:right w:val="single" w:sz="2" w:space="0" w:color="000000"/>
-                                  </w:tcBorders>
-                                </w:tcPr>
-                                <w:p>
-                                  <w:pPr>
-                                    <w:pStyle w:val="TableParagraph"/>
-                                    <w:rPr>
-                                      <w:rFonts w:ascii="Times New Roman" w:hAnsi="Times New Roman"/>
-                                      <w:sz w:val="12"/>
-                                    </w:rPr>
-                                  </w:pPr>
-                                  <w:r>
-                                    <w:rPr>
-                                      <w:rFonts w:ascii="Times New Roman" w:hAnsi="Times New Roman"/>
-                                      <w:sz w:val="12"/>
-                                    </w:rPr>
-                                  </w:r>
-                                </w:p>
-                              </w:tc>
-                              <w:tc>
-                                <w:tcPr>
-                                  <w:tcW w:w="533" w:type="dxa"/>
-                                  <w:gridSpan w:val="2"/>
-                                  <w:tcBorders>
-                                    <w:top w:val="single" w:sz="2" w:space="0" w:color="000000"/>
-                                    <w:left w:val="single" w:sz="2" w:space="0" w:color="000000"/>
-                                    <w:bottom w:val="single" w:sz="2" w:space="0" w:color="000000"/>
-                                    <w:right w:val="single" w:sz="2" w:space="0" w:color="000000"/>
-                                  </w:tcBorders>
-                                </w:tcPr>
-                                <w:p>
-                                  <w:pPr>
-                                    <w:pStyle w:val="TableParagraph"/>
-                                    <w:rPr>
-                                      <w:rFonts w:ascii="Times New Roman" w:hAnsi="Times New Roman"/>
-                                      <w:sz w:val="12"/>
-                                    </w:rPr>
-                                  </w:pPr>
-                                  <w:r>
-                                    <w:rPr>
-                                      <w:rFonts w:ascii="Times New Roman" w:hAnsi="Times New Roman"/>
-                                      <w:sz w:val="12"/>
-                                    </w:rPr>
-                                  </w:r>
-                                </w:p>
-                              </w:tc>
-                              <w:tc>
-                                <w:tcPr>
-                                  <w:tcW w:w="529" w:type="dxa"/>
-                                  <w:gridSpan w:val="2"/>
-                                  <w:tcBorders>
-                                    <w:top w:val="single" w:sz="2" w:space="0" w:color="000000"/>
-                                    <w:left w:val="single" w:sz="2" w:space="0" w:color="000000"/>
-                                    <w:bottom w:val="single" w:sz="2" w:space="0" w:color="000000"/>
-                                    <w:right w:val="single" w:sz="2" w:space="0" w:color="000000"/>
-                                  </w:tcBorders>
-                                </w:tcPr>
-                                <w:p>
-                                  <w:pPr>
-                                    <w:pStyle w:val="TableParagraph"/>
-                                    <w:rPr>
-                                      <w:rFonts w:ascii="Times New Roman" w:hAnsi="Times New Roman"/>
-                                      <w:sz w:val="12"/>
-                                    </w:rPr>
-                                  </w:pPr>
-                                  <w:r>
-                                    <w:rPr>
-                                      <w:rFonts w:ascii="Times New Roman" w:hAnsi="Times New Roman"/>
-                                      <w:sz w:val="12"/>
-                                    </w:rPr>
-                                  </w:r>
-                                </w:p>
-                              </w:tc>
-                              <w:tc>
-                                <w:tcPr>
-                                  <w:tcW w:w="519" w:type="dxa"/>
-                                  <w:gridSpan w:val="2"/>
-                                  <w:tcBorders>
-                                    <w:top w:val="single" w:sz="2" w:space="0" w:color="000000"/>
-                                    <w:left w:val="single" w:sz="2" w:space="0" w:color="000000"/>
-                                    <w:bottom w:val="single" w:sz="2" w:space="0" w:color="000000"/>
-                                    <w:right w:val="single" w:sz="2" w:space="0" w:color="000000"/>
-                                  </w:tcBorders>
-                                </w:tcPr>
-                                <w:p>
-                                  <w:pPr>
-                                    <w:pStyle w:val="TableParagraph"/>
-                                    <w:rPr>
-                                      <w:rFonts w:ascii="Times New Roman" w:hAnsi="Times New Roman"/>
-                                      <w:sz w:val="12"/>
-                                    </w:rPr>
-                                  </w:pPr>
-                                  <w:r>
-                                    <w:rPr>
-                                      <w:rFonts w:ascii="Times New Roman" w:hAnsi="Times New Roman"/>
-                                      <w:sz w:val="12"/>
-                                    </w:rPr>
-                                  </w:r>
-                                </w:p>
-                              </w:tc>
-                              <w:tc>
-                                <w:tcPr>
-                                  <w:tcW w:w="531" w:type="dxa"/>
-                                  <w:gridSpan w:val="2"/>
-                                  <w:tcBorders>
-                                    <w:top w:val="single" w:sz="2" w:space="0" w:color="000000"/>
-                                    <w:left w:val="single" w:sz="2" w:space="0" w:color="000000"/>
-                                    <w:bottom w:val="single" w:sz="2" w:space="0" w:color="000000"/>
-                                    <w:right w:val="single" w:sz="2" w:space="0" w:color="000000"/>
-                                  </w:tcBorders>
-                                </w:tcPr>
-                                <w:p>
-                                  <w:pPr>
-                                    <w:pStyle w:val="TableParagraph"/>
-                                    <w:rPr>
-                                      <w:rFonts w:ascii="Times New Roman" w:hAnsi="Times New Roman"/>
-                                      <w:sz w:val="12"/>
-                                    </w:rPr>
-                                  </w:pPr>
-                                  <w:r>
-                                    <w:rPr>
-                                      <w:rFonts w:ascii="Times New Roman" w:hAnsi="Times New Roman"/>
-                                      <w:sz w:val="12"/>
-                                    </w:rPr>
-                                  </w:r>
-                                </w:p>
-                              </w:tc>
-                              <w:tc>
-                                <w:tcPr>
-                                  <w:tcW w:w="524" w:type="dxa"/>
-                                  <w:gridSpan w:val="2"/>
-                                  <w:tcBorders>
-                                    <w:top w:val="single" w:sz="2" w:space="0" w:color="000000"/>
-                                    <w:left w:val="single" w:sz="2" w:space="0" w:color="000000"/>
-                                    <w:bottom w:val="single" w:sz="2" w:space="0" w:color="000000"/>
-                                    <w:right w:val="single" w:sz="2" w:space="0" w:color="000000"/>
-                                  </w:tcBorders>
-                                </w:tcPr>
-                                <w:p>
-                                  <w:pPr>
-                                    <w:pStyle w:val="TableParagraph"/>
-                                    <w:rPr>
-                                      <w:rFonts w:ascii="Times New Roman" w:hAnsi="Times New Roman"/>
-                                      <w:sz w:val="12"/>
-                                    </w:rPr>
-                                  </w:pPr>
-                                  <w:r>
-                                    <w:rPr>
-                                      <w:rFonts w:ascii="Times New Roman" w:hAnsi="Times New Roman"/>
-                                      <w:sz w:val="12"/>
-                                    </w:rPr>
-                                  </w:r>
-                                </w:p>
-                              </w:tc>
-                              <w:tc>
-                                <w:tcPr>
-                                  <w:tcW w:w="527" w:type="dxa"/>
-                                  <w:gridSpan w:val="2"/>
-                                  <w:tcBorders>
-                                    <w:top w:val="single" w:sz="2" w:space="0" w:color="000000"/>
-                                    <w:left w:val="single" w:sz="2" w:space="0" w:color="000000"/>
-                                    <w:bottom w:val="single" w:sz="2" w:space="0" w:color="000000"/>
-                                    <w:right w:val="single" w:sz="2" w:space="0" w:color="000000"/>
-                                  </w:tcBorders>
-                                </w:tcPr>
-                                <w:p>
-                                  <w:pPr>
-                                    <w:pStyle w:val="TableParagraph"/>
-                                    <w:rPr>
-                                      <w:rFonts w:ascii="Times New Roman" w:hAnsi="Times New Roman"/>
-                                      <w:sz w:val="12"/>
-                                    </w:rPr>
-                                  </w:pPr>
-                                  <w:r>
-                                    <w:rPr>
-                                      <w:rFonts w:ascii="Times New Roman" w:hAnsi="Times New Roman"/>
-                                      <w:sz w:val="12"/>
-                                    </w:rPr>
-                                  </w:r>
-                                </w:p>
-                              </w:tc>
-                              <w:tc>
-                                <w:tcPr>
-                                  <w:tcW w:w="526" w:type="dxa"/>
-                                  <w:gridSpan w:val="2"/>
-                                  <w:tcBorders>
-                                    <w:top w:val="single" w:sz="2" w:space="0" w:color="000000"/>
-                                    <w:left w:val="single" w:sz="2" w:space="0" w:color="000000"/>
-                                    <w:bottom w:val="single" w:sz="2" w:space="0" w:color="000000"/>
-                                    <w:right w:val="single" w:sz="2" w:space="0" w:color="000000"/>
-                                  </w:tcBorders>
-                                </w:tcPr>
-                                <w:p>
-                                  <w:pPr>
-                                    <w:pStyle w:val="TableParagraph"/>
-                                    <w:rPr>
-                                      <w:rFonts w:ascii="Times New Roman" w:hAnsi="Times New Roman"/>
-                                      <w:sz w:val="12"/>
-                                    </w:rPr>
-                                  </w:pPr>
-                                  <w:r>
-                                    <w:rPr>
-                                      <w:rFonts w:ascii="Times New Roman" w:hAnsi="Times New Roman"/>
-                                      <w:sz w:val="12"/>
-                                    </w:rPr>
-                                  </w:r>
-                                </w:p>
-                              </w:tc>
-                              <w:tc>
-                                <w:tcPr>
-                                  <w:tcW w:w="530" w:type="dxa"/>
-                                  <w:gridSpan w:val="2"/>
-                                  <w:tcBorders>
-                                    <w:top w:val="single" w:sz="2" w:space="0" w:color="000000"/>
-                                    <w:left w:val="single" w:sz="2" w:space="0" w:color="000000"/>
-                                    <w:bottom w:val="single" w:sz="2" w:space="0" w:color="000000"/>
-                                    <w:right w:val="single" w:sz="2" w:space="0" w:color="000000"/>
-                                  </w:tcBorders>
-                                </w:tcPr>
-                                <w:p>
-                                  <w:pPr>
-                                    <w:pStyle w:val="TableParagraph"/>
-                                    <w:rPr>
-                                      <w:rFonts w:ascii="Times New Roman" w:hAnsi="Times New Roman"/>
-                                      <w:sz w:val="12"/>
-                                    </w:rPr>
-                                  </w:pPr>
-                                  <w:r>
-                                    <w:rPr>
-                                      <w:rFonts w:ascii="Times New Roman" w:hAnsi="Times New Roman"/>
-                                      <w:sz w:val="12"/>
-                                    </w:rPr>
-                                  </w:r>
-                                </w:p>
-                              </w:tc>
-                              <w:tc>
-                                <w:tcPr>
-                                  <w:tcW w:w="422" w:type="dxa"/>
+                                  <w:tcW w:w="414" w:type="dxa"/>
                                   <w:gridSpan w:val="2"/>
                                   <w:tcBorders>
                                     <w:top w:val="single" w:sz="2" w:space="0" w:color="000000"/>
@@ -15035,35 +15035,35 @@
                         <w:gridCol w:w="259"/>
                         <w:gridCol w:w="1"/>
                         <w:gridCol w:w="260"/>
-                        <w:gridCol w:w="289"/>
-                        <w:gridCol w:w="253"/>
+                        <w:gridCol w:w="291"/>
+                        <w:gridCol w:w="251"/>
                         <w:gridCol w:w="247"/>
                         <w:gridCol w:w="250"/>
-                        <w:gridCol w:w="288"/>
+                        <w:gridCol w:w="290"/>
                         <w:gridCol w:w="260"/>
-                        <w:gridCol w:w="268"/>
-                        <w:gridCol w:w="266"/>
+                        <w:gridCol w:w="270"/>
+                        <w:gridCol w:w="264"/>
                         <w:gridCol w:w="254"/>
                         <w:gridCol w:w="253"/>
-                        <w:gridCol w:w="268"/>
-                        <w:gridCol w:w="279"/>
-                        <w:gridCol w:w="254"/>
-                        <w:gridCol w:w="264"/>
+                        <w:gridCol w:w="270"/>
+                        <w:gridCol w:w="278"/>
+                        <w:gridCol w:w="253"/>
+                        <w:gridCol w:w="266"/>
                         <w:gridCol w:w="265"/>
                         <w:gridCol w:w="260"/>
-                        <w:gridCol w:w="259"/>
-                        <w:gridCol w:w="268"/>
+                        <w:gridCol w:w="261"/>
+                        <w:gridCol w:w="266"/>
                         <w:gridCol w:w="263"/>
-                        <w:gridCol w:w="260"/>
+                        <w:gridCol w:w="262"/>
                         <w:gridCol w:w="264"/>
                         <w:gridCol w:w="264"/>
-                        <w:gridCol w:w="263"/>
-                        <w:gridCol w:w="264"/>
+                        <w:gridCol w:w="261"/>
+                        <w:gridCol w:w="266"/>
                         <w:gridCol w:w="262"/>
                         <w:gridCol w:w="264"/>
-                        <w:gridCol w:w="266"/>
-                        <w:gridCol w:w="262"/>
-                        <w:gridCol w:w="160"/>
+                        <w:gridCol w:w="268"/>
+                        <w:gridCol w:w="260"/>
+                        <w:gridCol w:w="154"/>
                       </w:tblGrid>
                       <w:tr>
                         <w:trPr>
@@ -15187,7 +15187,7 @@
                         </w:tc>
                         <w:tc>
                           <w:tcPr>
-                            <w:tcW w:w="550" w:type="dxa"/>
+                            <w:tcW w:w="552" w:type="dxa"/>
                             <w:gridSpan w:val="3"/>
                             <w:tcBorders>
                               <w:top w:val="single" w:sz="2" w:space="0" w:color="000000"/>
@@ -15216,7 +15216,7 @@
                         </w:tc>
                         <w:tc>
                           <w:tcPr>
-                            <w:tcW w:w="500" w:type="dxa"/>
+                            <w:tcW w:w="498" w:type="dxa"/>
                             <w:gridSpan w:val="2"/>
                             <w:tcBorders>
                               <w:top w:val="single" w:sz="2" w:space="0" w:color="000000"/>
@@ -15245,7 +15245,7 @@
                         </w:tc>
                         <w:tc>
                           <w:tcPr>
-                            <w:tcW w:w="538" w:type="dxa"/>
+                            <w:tcW w:w="540" w:type="dxa"/>
                             <w:gridSpan w:val="2"/>
                             <w:tcBorders>
                               <w:top w:val="single" w:sz="2" w:space="0" w:color="000000"/>
@@ -15268,6 +15268,255 @@
                                 <w:rFonts w:ascii="Times New Roman" w:hAnsi="Times New Roman"/>
                                 <w:sz w:val="12"/>
                                 <w:szCs w:val="12"/>
+                              </w:rPr>
+                            </w:r>
+                          </w:p>
+                        </w:tc>
+                        <w:tc>
+                          <w:tcPr>
+                            <w:tcW w:w="530" w:type="dxa"/>
+                            <w:gridSpan w:val="2"/>
+                            <w:tcBorders>
+                              <w:top w:val="single" w:sz="2" w:space="0" w:color="000000"/>
+                              <w:left w:val="single" w:sz="2" w:space="0" w:color="000000"/>
+                              <w:bottom w:val="single" w:sz="2" w:space="0" w:color="000000"/>
+                              <w:right w:val="single" w:sz="2" w:space="0" w:color="000000"/>
+                            </w:tcBorders>
+                          </w:tcPr>
+                          <w:p>
+                            <w:pPr>
+                              <w:pStyle w:val="TableParagraph"/>
+                              <w:rPr>
+                                <w:rFonts w:ascii="Times New Roman" w:hAnsi="Times New Roman"/>
+                                <w:sz w:val="12"/>
+                                <w:szCs w:val="12"/>
+                              </w:rPr>
+                            </w:pPr>
+                            <w:r>
+                              <w:rPr>
+                                <w:rFonts w:ascii="Times New Roman" w:hAnsi="Times New Roman"/>
+                                <w:sz w:val="12"/>
+                                <w:szCs w:val="12"/>
+                              </w:rPr>
+                            </w:r>
+                          </w:p>
+                        </w:tc>
+                        <w:tc>
+                          <w:tcPr>
+                            <w:tcW w:w="518" w:type="dxa"/>
+                            <w:gridSpan w:val="2"/>
+                            <w:tcBorders>
+                              <w:top w:val="single" w:sz="2" w:space="0" w:color="000000"/>
+                              <w:left w:val="single" w:sz="2" w:space="0" w:color="000000"/>
+                              <w:bottom w:val="single" w:sz="2" w:space="0" w:color="000000"/>
+                              <w:right w:val="single" w:sz="2" w:space="0" w:color="000000"/>
+                            </w:tcBorders>
+                          </w:tcPr>
+                          <w:p>
+                            <w:pPr>
+                              <w:pStyle w:val="TableParagraph"/>
+                              <w:rPr>
+                                <w:rFonts w:ascii="Times New Roman" w:hAnsi="Times New Roman"/>
+                                <w:sz w:val="12"/>
+                                <w:szCs w:val="12"/>
+                              </w:rPr>
+                            </w:pPr>
+                            <w:r>
+                              <w:rPr>
+                                <w:rFonts w:ascii="Times New Roman" w:hAnsi="Times New Roman"/>
+                                <w:sz w:val="12"/>
+                                <w:szCs w:val="12"/>
+                              </w:rPr>
+                            </w:r>
+                          </w:p>
+                        </w:tc>
+                        <w:tc>
+                          <w:tcPr>
+                            <w:tcW w:w="523" w:type="dxa"/>
+                            <w:gridSpan w:val="2"/>
+                            <w:tcBorders>
+                              <w:top w:val="single" w:sz="2" w:space="0" w:color="000000"/>
+                              <w:left w:val="single" w:sz="2" w:space="0" w:color="000000"/>
+                              <w:bottom w:val="single" w:sz="2" w:space="0" w:color="000000"/>
+                              <w:right w:val="single" w:sz="2" w:space="0" w:color="000000"/>
+                            </w:tcBorders>
+                          </w:tcPr>
+                          <w:p>
+                            <w:pPr>
+                              <w:pStyle w:val="TableParagraph"/>
+                              <w:rPr>
+                                <w:rFonts w:ascii="Times New Roman" w:hAnsi="Times New Roman"/>
+                                <w:sz w:val="12"/>
+                                <w:szCs w:val="12"/>
+                              </w:rPr>
+                            </w:pPr>
+                            <w:r>
+                              <w:rPr>
+                                <w:rFonts w:ascii="Times New Roman" w:hAnsi="Times New Roman"/>
+                                <w:sz w:val="12"/>
+                                <w:szCs w:val="12"/>
+                              </w:rPr>
+                            </w:r>
+                          </w:p>
+                        </w:tc>
+                        <w:tc>
+                          <w:tcPr>
+                            <w:tcW w:w="531" w:type="dxa"/>
+                            <w:gridSpan w:val="2"/>
+                            <w:tcBorders>
+                              <w:top w:val="single" w:sz="2" w:space="0" w:color="000000"/>
+                              <w:left w:val="single" w:sz="2" w:space="0" w:color="000000"/>
+                              <w:bottom w:val="single" w:sz="2" w:space="0" w:color="000000"/>
+                              <w:right w:val="single" w:sz="2" w:space="0" w:color="000000"/>
+                            </w:tcBorders>
+                          </w:tcPr>
+                          <w:p>
+                            <w:pPr>
+                              <w:pStyle w:val="TableParagraph"/>
+                              <w:rPr>
+                                <w:rFonts w:ascii="Times New Roman" w:hAnsi="Times New Roman"/>
+                                <w:sz w:val="12"/>
+                              </w:rPr>
+                            </w:pPr>
+                            <w:r>
+                              <w:rPr>
+                                <w:rFonts w:ascii="Times New Roman" w:hAnsi="Times New Roman"/>
+                                <w:sz w:val="12"/>
+                              </w:rPr>
+                            </w:r>
+                          </w:p>
+                        </w:tc>
+                        <w:tc>
+                          <w:tcPr>
+                            <w:tcW w:w="531" w:type="dxa"/>
+                            <w:gridSpan w:val="2"/>
+                            <w:tcBorders>
+                              <w:top w:val="single" w:sz="2" w:space="0" w:color="000000"/>
+                              <w:left w:val="single" w:sz="2" w:space="0" w:color="000000"/>
+                              <w:bottom w:val="single" w:sz="2" w:space="0" w:color="000000"/>
+                              <w:right w:val="single" w:sz="2" w:space="0" w:color="000000"/>
+                            </w:tcBorders>
+                          </w:tcPr>
+                          <w:p>
+                            <w:pPr>
+                              <w:pStyle w:val="TableParagraph"/>
+                              <w:rPr>
+                                <w:rFonts w:ascii="Times New Roman" w:hAnsi="Times New Roman"/>
+                                <w:sz w:val="12"/>
+                              </w:rPr>
+                            </w:pPr>
+                            <w:r>
+                              <w:rPr>
+                                <w:rFonts w:ascii="Times New Roman" w:hAnsi="Times New Roman"/>
+                                <w:sz w:val="12"/>
+                              </w:rPr>
+                            </w:r>
+                          </w:p>
+                        </w:tc>
+                        <w:tc>
+                          <w:tcPr>
+                            <w:tcW w:w="521" w:type="dxa"/>
+                            <w:gridSpan w:val="2"/>
+                            <w:tcBorders>
+                              <w:top w:val="single" w:sz="2" w:space="0" w:color="000000"/>
+                              <w:left w:val="single" w:sz="2" w:space="0" w:color="000000"/>
+                              <w:bottom w:val="single" w:sz="2" w:space="0" w:color="000000"/>
+                              <w:right w:val="single" w:sz="2" w:space="0" w:color="000000"/>
+                            </w:tcBorders>
+                          </w:tcPr>
+                          <w:p>
+                            <w:pPr>
+                              <w:pStyle w:val="TableParagraph"/>
+                              <w:rPr>
+                                <w:rFonts w:ascii="Times New Roman" w:hAnsi="Times New Roman"/>
+                                <w:sz w:val="12"/>
+                              </w:rPr>
+                            </w:pPr>
+                            <w:r>
+                              <w:rPr>
+                                <w:rFonts w:ascii="Times New Roman" w:hAnsi="Times New Roman"/>
+                                <w:sz w:val="12"/>
+                              </w:rPr>
+                            </w:r>
+                          </w:p>
+                        </w:tc>
+                        <w:tc>
+                          <w:tcPr>
+                            <w:tcW w:w="529" w:type="dxa"/>
+                            <w:gridSpan w:val="2"/>
+                            <w:tcBorders>
+                              <w:top w:val="single" w:sz="2" w:space="0" w:color="000000"/>
+                              <w:left w:val="single" w:sz="2" w:space="0" w:color="000000"/>
+                              <w:bottom w:val="single" w:sz="2" w:space="0" w:color="000000"/>
+                              <w:right w:val="single" w:sz="2" w:space="0" w:color="000000"/>
+                            </w:tcBorders>
+                          </w:tcPr>
+                          <w:p>
+                            <w:pPr>
+                              <w:pStyle w:val="TableParagraph"/>
+                              <w:rPr>
+                                <w:rFonts w:ascii="Times New Roman" w:hAnsi="Times New Roman"/>
+                                <w:sz w:val="12"/>
+                              </w:rPr>
+                            </w:pPr>
+                            <w:r>
+                              <w:rPr>
+                                <w:rFonts w:ascii="Times New Roman" w:hAnsi="Times New Roman"/>
+                                <w:sz w:val="12"/>
+                              </w:rPr>
+                            </w:r>
+                          </w:p>
+                        </w:tc>
+                        <w:tc>
+                          <w:tcPr>
+                            <w:tcW w:w="526" w:type="dxa"/>
+                            <w:gridSpan w:val="2"/>
+                            <w:tcBorders>
+                              <w:top w:val="single" w:sz="2" w:space="0" w:color="000000"/>
+                              <w:left w:val="single" w:sz="2" w:space="0" w:color="000000"/>
+                              <w:bottom w:val="single" w:sz="2" w:space="0" w:color="000000"/>
+                              <w:right w:val="single" w:sz="2" w:space="0" w:color="000000"/>
+                            </w:tcBorders>
+                          </w:tcPr>
+                          <w:p>
+                            <w:pPr>
+                              <w:pStyle w:val="TableParagraph"/>
+                              <w:rPr>
+                                <w:rFonts w:ascii="Times New Roman" w:hAnsi="Times New Roman"/>
+                                <w:sz w:val="12"/>
+                              </w:rPr>
+                            </w:pPr>
+                            <w:r>
+                              <w:rPr>
+                                <w:rFonts w:ascii="Times New Roman" w:hAnsi="Times New Roman"/>
+                                <w:sz w:val="12"/>
+                              </w:rPr>
+                            </w:r>
+                          </w:p>
+                        </w:tc>
+                        <w:tc>
+                          <w:tcPr>
+                            <w:tcW w:w="525" w:type="dxa"/>
+                            <w:gridSpan w:val="2"/>
+                            <w:tcBorders>
+                              <w:top w:val="single" w:sz="2" w:space="0" w:color="000000"/>
+                              <w:left w:val="single" w:sz="2" w:space="0" w:color="000000"/>
+                              <w:bottom w:val="single" w:sz="2" w:space="0" w:color="000000"/>
+                              <w:right w:val="single" w:sz="2" w:space="0" w:color="000000"/>
+                            </w:tcBorders>
+                          </w:tcPr>
+                          <w:p>
+                            <w:pPr>
+                              <w:pStyle w:val="TableParagraph"/>
+                              <w:rPr>
+                                <w:rFonts w:ascii="Times New Roman" w:hAnsi="Times New Roman"/>
+                                <w:sz w:val="12"/>
+                              </w:rPr>
+                            </w:pPr>
+                            <w:r>
+                              <w:rPr>
+                                <w:rFonts w:ascii="Times New Roman" w:hAnsi="Times New Roman"/>
+                                <w:sz w:val="12"/>
                               </w:rPr>
                             </w:r>
                           </w:p>
@@ -15289,21 +15538,19 @@
                               <w:rPr>
                                 <w:rFonts w:ascii="Times New Roman" w:hAnsi="Times New Roman"/>
                                 <w:sz w:val="12"/>
-                                <w:szCs w:val="12"/>
                               </w:rPr>
                             </w:pPr>
                             <w:r>
                               <w:rPr>
                                 <w:rFonts w:ascii="Times New Roman" w:hAnsi="Times New Roman"/>
                                 <w:sz w:val="12"/>
-                                <w:szCs w:val="12"/>
                               </w:rPr>
                             </w:r>
                           </w:p>
                         </w:tc>
                         <w:tc>
                           <w:tcPr>
-                            <w:tcW w:w="520" w:type="dxa"/>
+                            <w:tcW w:w="532" w:type="dxa"/>
                             <w:gridSpan w:val="2"/>
                             <w:tcBorders>
                               <w:top w:val="single" w:sz="2" w:space="0" w:color="000000"/>
@@ -15318,266 +15565,19 @@
                               <w:rPr>
                                 <w:rFonts w:ascii="Times New Roman" w:hAnsi="Times New Roman"/>
                                 <w:sz w:val="12"/>
-                                <w:szCs w:val="12"/>
                               </w:rPr>
                             </w:pPr>
                             <w:r>
                               <w:rPr>
                                 <w:rFonts w:ascii="Times New Roman" w:hAnsi="Times New Roman"/>
                                 <w:sz w:val="12"/>
-                                <w:szCs w:val="12"/>
                               </w:rPr>
                             </w:r>
                           </w:p>
                         </w:tc>
                         <w:tc>
                           <w:tcPr>
-                            <w:tcW w:w="521" w:type="dxa"/>
-                            <w:gridSpan w:val="2"/>
-                            <w:tcBorders>
-                              <w:top w:val="single" w:sz="2" w:space="0" w:color="000000"/>
-                              <w:left w:val="single" w:sz="2" w:space="0" w:color="000000"/>
-                              <w:bottom w:val="single" w:sz="2" w:space="0" w:color="000000"/>
-                              <w:right w:val="single" w:sz="2" w:space="0" w:color="000000"/>
-                            </w:tcBorders>
-                          </w:tcPr>
-                          <w:p>
-                            <w:pPr>
-                              <w:pStyle w:val="TableParagraph"/>
-                              <w:rPr>
-                                <w:rFonts w:ascii="Times New Roman" w:hAnsi="Times New Roman"/>
-                                <w:sz w:val="12"/>
-                                <w:szCs w:val="12"/>
-                              </w:rPr>
-                            </w:pPr>
-                            <w:r>
-                              <w:rPr>
-                                <w:rFonts w:ascii="Times New Roman" w:hAnsi="Times New Roman"/>
-                                <w:sz w:val="12"/>
-                                <w:szCs w:val="12"/>
-                              </w:rPr>
-                            </w:r>
-                          </w:p>
-                        </w:tc>
-                        <w:tc>
-                          <w:tcPr>
-                            <w:tcW w:w="533" w:type="dxa"/>
-                            <w:gridSpan w:val="2"/>
-                            <w:tcBorders>
-                              <w:top w:val="single" w:sz="2" w:space="0" w:color="000000"/>
-                              <w:left w:val="single" w:sz="2" w:space="0" w:color="000000"/>
-                              <w:bottom w:val="single" w:sz="2" w:space="0" w:color="000000"/>
-                              <w:right w:val="single" w:sz="2" w:space="0" w:color="000000"/>
-                            </w:tcBorders>
-                          </w:tcPr>
-                          <w:p>
-                            <w:pPr>
-                              <w:pStyle w:val="TableParagraph"/>
-                              <w:rPr>
-                                <w:rFonts w:ascii="Times New Roman" w:hAnsi="Times New Roman"/>
-                                <w:sz w:val="12"/>
-                              </w:rPr>
-                            </w:pPr>
-                            <w:r>
-                              <w:rPr>
-                                <w:rFonts w:ascii="Times New Roman" w:hAnsi="Times New Roman"/>
-                                <w:sz w:val="12"/>
-                              </w:rPr>
-                            </w:r>
-                          </w:p>
-                        </w:tc>
-                        <w:tc>
-                          <w:tcPr>
-                            <w:tcW w:w="529" w:type="dxa"/>
-                            <w:gridSpan w:val="2"/>
-                            <w:tcBorders>
-                              <w:top w:val="single" w:sz="2" w:space="0" w:color="000000"/>
-                              <w:left w:val="single" w:sz="2" w:space="0" w:color="000000"/>
-                              <w:bottom w:val="single" w:sz="2" w:space="0" w:color="000000"/>
-                              <w:right w:val="single" w:sz="2" w:space="0" w:color="000000"/>
-                            </w:tcBorders>
-                          </w:tcPr>
-                          <w:p>
-                            <w:pPr>
-                              <w:pStyle w:val="TableParagraph"/>
-                              <w:rPr>
-                                <w:rFonts w:ascii="Times New Roman" w:hAnsi="Times New Roman"/>
-                                <w:sz w:val="12"/>
-                              </w:rPr>
-                            </w:pPr>
-                            <w:r>
-                              <w:rPr>
-                                <w:rFonts w:ascii="Times New Roman" w:hAnsi="Times New Roman"/>
-                                <w:sz w:val="12"/>
-                              </w:rPr>
-                            </w:r>
-                          </w:p>
-                        </w:tc>
-                        <w:tc>
-                          <w:tcPr>
-                            <w:tcW w:w="519" w:type="dxa"/>
-                            <w:gridSpan w:val="2"/>
-                            <w:tcBorders>
-                              <w:top w:val="single" w:sz="2" w:space="0" w:color="000000"/>
-                              <w:left w:val="single" w:sz="2" w:space="0" w:color="000000"/>
-                              <w:bottom w:val="single" w:sz="2" w:space="0" w:color="000000"/>
-                              <w:right w:val="single" w:sz="2" w:space="0" w:color="000000"/>
-                            </w:tcBorders>
-                          </w:tcPr>
-                          <w:p>
-                            <w:pPr>
-                              <w:pStyle w:val="TableParagraph"/>
-                              <w:rPr>
-                                <w:rFonts w:ascii="Times New Roman" w:hAnsi="Times New Roman"/>
-                                <w:sz w:val="12"/>
-                              </w:rPr>
-                            </w:pPr>
-                            <w:r>
-                              <w:rPr>
-                                <w:rFonts w:ascii="Times New Roman" w:hAnsi="Times New Roman"/>
-                                <w:sz w:val="12"/>
-                              </w:rPr>
-                            </w:r>
-                          </w:p>
-                        </w:tc>
-                        <w:tc>
-                          <w:tcPr>
-                            <w:tcW w:w="531" w:type="dxa"/>
-                            <w:gridSpan w:val="2"/>
-                            <w:tcBorders>
-                              <w:top w:val="single" w:sz="2" w:space="0" w:color="000000"/>
-                              <w:left w:val="single" w:sz="2" w:space="0" w:color="000000"/>
-                              <w:bottom w:val="single" w:sz="2" w:space="0" w:color="000000"/>
-                              <w:right w:val="single" w:sz="2" w:space="0" w:color="000000"/>
-                            </w:tcBorders>
-                          </w:tcPr>
-                          <w:p>
-                            <w:pPr>
-                              <w:pStyle w:val="TableParagraph"/>
-                              <w:rPr>
-                                <w:rFonts w:ascii="Times New Roman" w:hAnsi="Times New Roman"/>
-                                <w:sz w:val="12"/>
-                              </w:rPr>
-                            </w:pPr>
-                            <w:r>
-                              <w:rPr>
-                                <w:rFonts w:ascii="Times New Roman" w:hAnsi="Times New Roman"/>
-                                <w:sz w:val="12"/>
-                              </w:rPr>
-                            </w:r>
-                          </w:p>
-                        </w:tc>
-                        <w:tc>
-                          <w:tcPr>
-                            <w:tcW w:w="524" w:type="dxa"/>
-                            <w:gridSpan w:val="2"/>
-                            <w:tcBorders>
-                              <w:top w:val="single" w:sz="2" w:space="0" w:color="000000"/>
-                              <w:left w:val="single" w:sz="2" w:space="0" w:color="000000"/>
-                              <w:bottom w:val="single" w:sz="2" w:space="0" w:color="000000"/>
-                              <w:right w:val="single" w:sz="2" w:space="0" w:color="000000"/>
-                            </w:tcBorders>
-                          </w:tcPr>
-                          <w:p>
-                            <w:pPr>
-                              <w:pStyle w:val="TableParagraph"/>
-                              <w:rPr>
-                                <w:rFonts w:ascii="Times New Roman" w:hAnsi="Times New Roman"/>
-                                <w:sz w:val="12"/>
-                              </w:rPr>
-                            </w:pPr>
-                            <w:r>
-                              <w:rPr>
-                                <w:rFonts w:ascii="Times New Roman" w:hAnsi="Times New Roman"/>
-                                <w:sz w:val="12"/>
-                              </w:rPr>
-                            </w:r>
-                          </w:p>
-                        </w:tc>
-                        <w:tc>
-                          <w:tcPr>
-                            <w:tcW w:w="527" w:type="dxa"/>
-                            <w:gridSpan w:val="2"/>
-                            <w:tcBorders>
-                              <w:top w:val="single" w:sz="2" w:space="0" w:color="000000"/>
-                              <w:left w:val="single" w:sz="2" w:space="0" w:color="000000"/>
-                              <w:bottom w:val="single" w:sz="2" w:space="0" w:color="000000"/>
-                              <w:right w:val="single" w:sz="2" w:space="0" w:color="000000"/>
-                            </w:tcBorders>
-                          </w:tcPr>
-                          <w:p>
-                            <w:pPr>
-                              <w:pStyle w:val="TableParagraph"/>
-                              <w:rPr>
-                                <w:rFonts w:ascii="Times New Roman" w:hAnsi="Times New Roman"/>
-                                <w:sz w:val="12"/>
-                              </w:rPr>
-                            </w:pPr>
-                            <w:r>
-                              <w:rPr>
-                                <w:rFonts w:ascii="Times New Roman" w:hAnsi="Times New Roman"/>
-                                <w:sz w:val="12"/>
-                              </w:rPr>
-                            </w:r>
-                          </w:p>
-                        </w:tc>
-                        <w:tc>
-                          <w:tcPr>
-                            <w:tcW w:w="526" w:type="dxa"/>
-                            <w:gridSpan w:val="2"/>
-                            <w:tcBorders>
-                              <w:top w:val="single" w:sz="2" w:space="0" w:color="000000"/>
-                              <w:left w:val="single" w:sz="2" w:space="0" w:color="000000"/>
-                              <w:bottom w:val="single" w:sz="2" w:space="0" w:color="000000"/>
-                              <w:right w:val="single" w:sz="2" w:space="0" w:color="000000"/>
-                            </w:tcBorders>
-                          </w:tcPr>
-                          <w:p>
-                            <w:pPr>
-                              <w:pStyle w:val="TableParagraph"/>
-                              <w:rPr>
-                                <w:rFonts w:ascii="Times New Roman" w:hAnsi="Times New Roman"/>
-                                <w:sz w:val="12"/>
-                              </w:rPr>
-                            </w:pPr>
-                            <w:r>
-                              <w:rPr>
-                                <w:rFonts w:ascii="Times New Roman" w:hAnsi="Times New Roman"/>
-                                <w:sz w:val="12"/>
-                              </w:rPr>
-                            </w:r>
-                          </w:p>
-                        </w:tc>
-                        <w:tc>
-                          <w:tcPr>
-                            <w:tcW w:w="530" w:type="dxa"/>
-                            <w:gridSpan w:val="2"/>
-                            <w:tcBorders>
-                              <w:top w:val="single" w:sz="2" w:space="0" w:color="000000"/>
-                              <w:left w:val="single" w:sz="2" w:space="0" w:color="000000"/>
-                              <w:bottom w:val="single" w:sz="2" w:space="0" w:color="000000"/>
-                              <w:right w:val="single" w:sz="2" w:space="0" w:color="000000"/>
-                            </w:tcBorders>
-                          </w:tcPr>
-                          <w:p>
-                            <w:pPr>
-                              <w:pStyle w:val="TableParagraph"/>
-                              <w:rPr>
-                                <w:rFonts w:ascii="Times New Roman" w:hAnsi="Times New Roman"/>
-                                <w:sz w:val="12"/>
-                              </w:rPr>
-                            </w:pPr>
-                            <w:r>
-                              <w:rPr>
-                                <w:rFonts w:ascii="Times New Roman" w:hAnsi="Times New Roman"/>
-                                <w:sz w:val="12"/>
-                              </w:rPr>
-                            </w:r>
-                          </w:p>
-                        </w:tc>
-                        <w:tc>
-                          <w:tcPr>
-                            <w:tcW w:w="422" w:type="dxa"/>
+                            <w:tcW w:w="414" w:type="dxa"/>
                             <w:gridSpan w:val="2"/>
                             <w:tcBorders>
                               <w:top w:val="single" w:sz="2" w:space="0" w:color="000000"/>
@@ -15845,7 +15845,215 @@
                         </w:tc>
                         <w:tc>
                           <w:tcPr>
-                            <w:tcW w:w="289" w:type="dxa"/>
+                            <w:tcW w:w="291" w:type="dxa"/>
+                            <w:tcBorders>
+                              <w:top w:val="single" w:sz="2" w:space="0" w:color="000000"/>
+                              <w:left w:val="single" w:sz="2" w:space="0" w:color="000000"/>
+                              <w:bottom w:val="single" w:sz="2" w:space="0" w:color="000000"/>
+                              <w:right w:val="single" w:sz="2" w:space="0" w:color="000000"/>
+                            </w:tcBorders>
+                          </w:tcPr>
+                          <w:p>
+                            <w:pPr>
+                              <w:pStyle w:val="TableParagraph"/>
+                              <w:rPr>
+                                <w:rFonts w:ascii="Times New Roman" w:hAnsi="Times New Roman"/>
+                                <w:sz w:val="12"/>
+                              </w:rPr>
+                            </w:pPr>
+                            <w:r>
+                              <w:rPr>
+                                <w:rFonts w:ascii="Times New Roman" w:hAnsi="Times New Roman"/>
+                                <w:sz w:val="12"/>
+                              </w:rPr>
+                            </w:r>
+                          </w:p>
+                        </w:tc>
+                        <w:tc>
+                          <w:tcPr>
+                            <w:tcW w:w="251" w:type="dxa"/>
+                            <w:tcBorders>
+                              <w:top w:val="single" w:sz="2" w:space="0" w:color="000000"/>
+                              <w:left w:val="single" w:sz="2" w:space="0" w:color="000000"/>
+                              <w:bottom w:val="single" w:sz="2" w:space="0" w:color="000000"/>
+                              <w:right w:val="single" w:sz="2" w:space="0" w:color="000000"/>
+                            </w:tcBorders>
+                          </w:tcPr>
+                          <w:p>
+                            <w:pPr>
+                              <w:pStyle w:val="TableParagraph"/>
+                              <w:rPr>
+                                <w:rFonts w:ascii="Times New Roman" w:hAnsi="Times New Roman"/>
+                                <w:sz w:val="12"/>
+                              </w:rPr>
+                            </w:pPr>
+                            <w:r>
+                              <w:rPr>
+                                <w:rFonts w:ascii="Times New Roman" w:hAnsi="Times New Roman"/>
+                                <w:sz w:val="12"/>
+                              </w:rPr>
+                            </w:r>
+                          </w:p>
+                        </w:tc>
+                        <w:tc>
+                          <w:tcPr>
+                            <w:tcW w:w="247" w:type="dxa"/>
+                            <w:tcBorders>
+                              <w:top w:val="single" w:sz="2" w:space="0" w:color="000000"/>
+                              <w:left w:val="single" w:sz="2" w:space="0" w:color="000000"/>
+                              <w:bottom w:val="single" w:sz="2" w:space="0" w:color="000000"/>
+                              <w:right w:val="single" w:sz="2" w:space="0" w:color="000000"/>
+                            </w:tcBorders>
+                          </w:tcPr>
+                          <w:p>
+                            <w:pPr>
+                              <w:pStyle w:val="TableParagraph"/>
+                              <w:rPr>
+                                <w:rFonts w:ascii="Times New Roman" w:hAnsi="Times New Roman"/>
+                                <w:sz w:val="12"/>
+                              </w:rPr>
+                            </w:pPr>
+                            <w:r>
+                              <w:rPr>
+                                <w:rFonts w:ascii="Times New Roman" w:hAnsi="Times New Roman"/>
+                                <w:sz w:val="12"/>
+                              </w:rPr>
+                            </w:r>
+                          </w:p>
+                        </w:tc>
+                        <w:tc>
+                          <w:tcPr>
+                            <w:tcW w:w="250" w:type="dxa"/>
+                            <w:tcBorders>
+                              <w:top w:val="single" w:sz="2" w:space="0" w:color="000000"/>
+                              <w:left w:val="single" w:sz="2" w:space="0" w:color="000000"/>
+                              <w:bottom w:val="single" w:sz="2" w:space="0" w:color="000000"/>
+                              <w:right w:val="single" w:sz="2" w:space="0" w:color="000000"/>
+                            </w:tcBorders>
+                          </w:tcPr>
+                          <w:p>
+                            <w:pPr>
+                              <w:pStyle w:val="TableParagraph"/>
+                              <w:rPr>
+                                <w:rFonts w:ascii="Times New Roman" w:hAnsi="Times New Roman"/>
+                                <w:sz w:val="12"/>
+                              </w:rPr>
+                            </w:pPr>
+                            <w:r>
+                              <w:rPr>
+                                <w:rFonts w:ascii="Times New Roman" w:hAnsi="Times New Roman"/>
+                                <w:sz w:val="12"/>
+                              </w:rPr>
+                            </w:r>
+                          </w:p>
+                        </w:tc>
+                        <w:tc>
+                          <w:tcPr>
+                            <w:tcW w:w="290" w:type="dxa"/>
+                            <w:tcBorders>
+                              <w:top w:val="single" w:sz="2" w:space="0" w:color="000000"/>
+                              <w:left w:val="single" w:sz="2" w:space="0" w:color="000000"/>
+                              <w:bottom w:val="single" w:sz="2" w:space="0" w:color="000000"/>
+                              <w:right w:val="single" w:sz="2" w:space="0" w:color="000000"/>
+                            </w:tcBorders>
+                          </w:tcPr>
+                          <w:p>
+                            <w:pPr>
+                              <w:pStyle w:val="TableParagraph"/>
+                              <w:rPr>
+                                <w:rFonts w:ascii="Times New Roman" w:hAnsi="Times New Roman"/>
+                                <w:sz w:val="12"/>
+                              </w:rPr>
+                            </w:pPr>
+                            <w:r>
+                              <w:rPr>
+                                <w:rFonts w:ascii="Times New Roman" w:hAnsi="Times New Roman"/>
+                                <w:sz w:val="12"/>
+                              </w:rPr>
+                            </w:r>
+                          </w:p>
+                        </w:tc>
+                        <w:tc>
+                          <w:tcPr>
+                            <w:tcW w:w="260" w:type="dxa"/>
+                            <w:tcBorders>
+                              <w:top w:val="single" w:sz="2" w:space="0" w:color="000000"/>
+                              <w:left w:val="single" w:sz="2" w:space="0" w:color="000000"/>
+                              <w:bottom w:val="single" w:sz="2" w:space="0" w:color="000000"/>
+                              <w:right w:val="single" w:sz="2" w:space="0" w:color="000000"/>
+                            </w:tcBorders>
+                          </w:tcPr>
+                          <w:p>
+                            <w:pPr>
+                              <w:pStyle w:val="TableParagraph"/>
+                              <w:rPr>
+                                <w:rFonts w:ascii="Times New Roman" w:hAnsi="Times New Roman"/>
+                                <w:sz w:val="12"/>
+                              </w:rPr>
+                            </w:pPr>
+                            <w:r>
+                              <w:rPr>
+                                <w:rFonts w:ascii="Times New Roman" w:hAnsi="Times New Roman"/>
+                                <w:sz w:val="12"/>
+                              </w:rPr>
+                            </w:r>
+                          </w:p>
+                        </w:tc>
+                        <w:tc>
+                          <w:tcPr>
+                            <w:tcW w:w="270" w:type="dxa"/>
+                            <w:tcBorders>
+                              <w:top w:val="single" w:sz="2" w:space="0" w:color="000000"/>
+                              <w:left w:val="single" w:sz="2" w:space="0" w:color="000000"/>
+                              <w:bottom w:val="single" w:sz="2" w:space="0" w:color="000000"/>
+                              <w:right w:val="single" w:sz="2" w:space="0" w:color="000000"/>
+                            </w:tcBorders>
+                          </w:tcPr>
+                          <w:p>
+                            <w:pPr>
+                              <w:pStyle w:val="TableParagraph"/>
+                              <w:rPr>
+                                <w:rFonts w:ascii="Times New Roman" w:hAnsi="Times New Roman"/>
+                                <w:sz w:val="12"/>
+                              </w:rPr>
+                            </w:pPr>
+                            <w:r>
+                              <w:rPr>
+                                <w:rFonts w:ascii="Times New Roman" w:hAnsi="Times New Roman"/>
+                                <w:sz w:val="12"/>
+                              </w:rPr>
+                            </w:r>
+                          </w:p>
+                        </w:tc>
+                        <w:tc>
+                          <w:tcPr>
+                            <w:tcW w:w="264" w:type="dxa"/>
+                            <w:tcBorders>
+                              <w:top w:val="single" w:sz="2" w:space="0" w:color="000000"/>
+                              <w:left w:val="single" w:sz="2" w:space="0" w:color="000000"/>
+                              <w:bottom w:val="single" w:sz="2" w:space="0" w:color="000000"/>
+                              <w:right w:val="single" w:sz="2" w:space="0" w:color="000000"/>
+                            </w:tcBorders>
+                          </w:tcPr>
+                          <w:p>
+                            <w:pPr>
+                              <w:pStyle w:val="TableParagraph"/>
+                              <w:rPr>
+                                <w:rFonts w:ascii="Times New Roman" w:hAnsi="Times New Roman"/>
+                                <w:sz w:val="12"/>
+                              </w:rPr>
+                            </w:pPr>
+                            <w:r>
+                              <w:rPr>
+                                <w:rFonts w:ascii="Times New Roman" w:hAnsi="Times New Roman"/>
+                                <w:sz w:val="12"/>
+                              </w:rPr>
+                            </w:r>
+                          </w:p>
+                        </w:tc>
+                        <w:tc>
+                          <w:tcPr>
+                            <w:tcW w:w="254" w:type="dxa"/>
                             <w:tcBorders>
                               <w:top w:val="single" w:sz="2" w:space="0" w:color="000000"/>
                               <w:left w:val="single" w:sz="2" w:space="0" w:color="000000"/>
@@ -15897,7 +16105,7 @@
                         </w:tc>
                         <w:tc>
                           <w:tcPr>
-                            <w:tcW w:w="247" w:type="dxa"/>
+                            <w:tcW w:w="270" w:type="dxa"/>
                             <w:tcBorders>
                               <w:top w:val="single" w:sz="2" w:space="0" w:color="000000"/>
                               <w:left w:val="single" w:sz="2" w:space="0" w:color="000000"/>
@@ -15923,7 +16131,7 @@
                         </w:tc>
                         <w:tc>
                           <w:tcPr>
-                            <w:tcW w:w="250" w:type="dxa"/>
+                            <w:tcW w:w="278" w:type="dxa"/>
                             <w:tcBorders>
                               <w:top w:val="single" w:sz="2" w:space="0" w:color="000000"/>
                               <w:left w:val="single" w:sz="2" w:space="0" w:color="000000"/>
@@ -15949,7 +16157,59 @@
                         </w:tc>
                         <w:tc>
                           <w:tcPr>
-                            <w:tcW w:w="288" w:type="dxa"/>
+                            <w:tcW w:w="253" w:type="dxa"/>
+                            <w:tcBorders>
+                              <w:top w:val="single" w:sz="2" w:space="0" w:color="000000"/>
+                              <w:left w:val="single" w:sz="2" w:space="0" w:color="000000"/>
+                              <w:bottom w:val="single" w:sz="2" w:space="0" w:color="000000"/>
+                              <w:right w:val="single" w:sz="2" w:space="0" w:color="000000"/>
+                            </w:tcBorders>
+                          </w:tcPr>
+                          <w:p>
+                            <w:pPr>
+                              <w:pStyle w:val="TableParagraph"/>
+                              <w:rPr>
+                                <w:rFonts w:ascii="Times New Roman" w:hAnsi="Times New Roman"/>
+                                <w:sz w:val="12"/>
+                              </w:rPr>
+                            </w:pPr>
+                            <w:r>
+                              <w:rPr>
+                                <w:rFonts w:ascii="Times New Roman" w:hAnsi="Times New Roman"/>
+                                <w:sz w:val="12"/>
+                              </w:rPr>
+                            </w:r>
+                          </w:p>
+                        </w:tc>
+                        <w:tc>
+                          <w:tcPr>
+                            <w:tcW w:w="266" w:type="dxa"/>
+                            <w:tcBorders>
+                              <w:top w:val="single" w:sz="2" w:space="0" w:color="000000"/>
+                              <w:left w:val="single" w:sz="2" w:space="0" w:color="000000"/>
+                              <w:bottom w:val="single" w:sz="2" w:space="0" w:color="000000"/>
+                              <w:right w:val="single" w:sz="2" w:space="0" w:color="000000"/>
+                            </w:tcBorders>
+                          </w:tcPr>
+                          <w:p>
+                            <w:pPr>
+                              <w:pStyle w:val="TableParagraph"/>
+                              <w:rPr>
+                                <w:rFonts w:ascii="Times New Roman" w:hAnsi="Times New Roman"/>
+                                <w:sz w:val="12"/>
+                              </w:rPr>
+                            </w:pPr>
+                            <w:r>
+                              <w:rPr>
+                                <w:rFonts w:ascii="Times New Roman" w:hAnsi="Times New Roman"/>
+                                <w:sz w:val="12"/>
+                              </w:rPr>
+                            </w:r>
+                          </w:p>
+                        </w:tc>
+                        <w:tc>
+                          <w:tcPr>
+                            <w:tcW w:w="265" w:type="dxa"/>
                             <w:tcBorders>
                               <w:top w:val="single" w:sz="2" w:space="0" w:color="000000"/>
                               <w:left w:val="single" w:sz="2" w:space="0" w:color="000000"/>
@@ -16001,7 +16261,7 @@
                         </w:tc>
                         <w:tc>
                           <w:tcPr>
-                            <w:tcW w:w="268" w:type="dxa"/>
+                            <w:tcW w:w="261" w:type="dxa"/>
                             <w:tcBorders>
                               <w:top w:val="single" w:sz="2" w:space="0" w:color="000000"/>
                               <w:left w:val="single" w:sz="2" w:space="0" w:color="000000"/>
@@ -16053,7 +16313,7 @@
                         </w:tc>
                         <w:tc>
                           <w:tcPr>
-                            <w:tcW w:w="254" w:type="dxa"/>
+                            <w:tcW w:w="263" w:type="dxa"/>
                             <w:tcBorders>
                               <w:top w:val="single" w:sz="2" w:space="0" w:color="000000"/>
                               <w:left w:val="single" w:sz="2" w:space="0" w:color="000000"/>
@@ -16079,7 +16339,163 @@
                         </w:tc>
                         <w:tc>
                           <w:tcPr>
-                            <w:tcW w:w="253" w:type="dxa"/>
+                            <w:tcW w:w="262" w:type="dxa"/>
+                            <w:tcBorders>
+                              <w:top w:val="single" w:sz="2" w:space="0" w:color="000000"/>
+                              <w:left w:val="single" w:sz="2" w:space="0" w:color="000000"/>
+                              <w:bottom w:val="single" w:sz="2" w:space="0" w:color="000000"/>
+                              <w:right w:val="single" w:sz="2" w:space="0" w:color="000000"/>
+                            </w:tcBorders>
+                          </w:tcPr>
+                          <w:p>
+                            <w:pPr>
+                              <w:pStyle w:val="TableParagraph"/>
+                              <w:rPr>
+                                <w:rFonts w:ascii="Times New Roman" w:hAnsi="Times New Roman"/>
+                                <w:sz w:val="12"/>
+                              </w:rPr>
+                            </w:pPr>
+                            <w:r>
+                              <w:rPr>
+                                <w:rFonts w:ascii="Times New Roman" w:hAnsi="Times New Roman"/>
+                                <w:sz w:val="12"/>
+                              </w:rPr>
+                            </w:r>
+                          </w:p>
+                        </w:tc>
+                        <w:tc>
+                          <w:tcPr>
+                            <w:tcW w:w="264" w:type="dxa"/>
+                            <w:tcBorders>
+                              <w:top w:val="single" w:sz="2" w:space="0" w:color="000000"/>
+                              <w:left w:val="single" w:sz="2" w:space="0" w:color="000000"/>
+                              <w:bottom w:val="single" w:sz="2" w:space="0" w:color="000000"/>
+                              <w:right w:val="single" w:sz="2" w:space="0" w:color="000000"/>
+                            </w:tcBorders>
+                          </w:tcPr>
+                          <w:p>
+                            <w:pPr>
+                              <w:pStyle w:val="TableParagraph"/>
+                              <w:rPr>
+                                <w:rFonts w:ascii="Times New Roman" w:hAnsi="Times New Roman"/>
+                                <w:sz w:val="12"/>
+                              </w:rPr>
+                            </w:pPr>
+                            <w:r>
+                              <w:rPr>
+                                <w:rFonts w:ascii="Times New Roman" w:hAnsi="Times New Roman"/>
+                                <w:sz w:val="12"/>
+                              </w:rPr>
+                            </w:r>
+                          </w:p>
+                        </w:tc>
+                        <w:tc>
+                          <w:tcPr>
+                            <w:tcW w:w="264" w:type="dxa"/>
+                            <w:tcBorders>
+                              <w:top w:val="single" w:sz="2" w:space="0" w:color="000000"/>
+                              <w:left w:val="single" w:sz="2" w:space="0" w:color="000000"/>
+                              <w:bottom w:val="single" w:sz="2" w:space="0" w:color="000000"/>
+                              <w:right w:val="single" w:sz="2" w:space="0" w:color="000000"/>
+                            </w:tcBorders>
+                          </w:tcPr>
+                          <w:p>
+                            <w:pPr>
+                              <w:pStyle w:val="TableParagraph"/>
+                              <w:rPr>
+                                <w:rFonts w:ascii="Times New Roman" w:hAnsi="Times New Roman"/>
+                                <w:sz w:val="12"/>
+                              </w:rPr>
+                            </w:pPr>
+                            <w:r>
+                              <w:rPr>
+                                <w:rFonts w:ascii="Times New Roman" w:hAnsi="Times New Roman"/>
+                                <w:sz w:val="12"/>
+                              </w:rPr>
+                            </w:r>
+                          </w:p>
+                        </w:tc>
+                        <w:tc>
+                          <w:tcPr>
+                            <w:tcW w:w="261" w:type="dxa"/>
+                            <w:tcBorders>
+                              <w:top w:val="single" w:sz="2" w:space="0" w:color="000000"/>
+                              <w:left w:val="single" w:sz="2" w:space="0" w:color="000000"/>
+                              <w:bottom w:val="single" w:sz="2" w:space="0" w:color="000000"/>
+                              <w:right w:val="single" w:sz="2" w:space="0" w:color="000000"/>
+                            </w:tcBorders>
+                          </w:tcPr>
+                          <w:p>
+                            <w:pPr>
+                              <w:pStyle w:val="TableParagraph"/>
+                              <w:rPr>
+                                <w:rFonts w:ascii="Times New Roman" w:hAnsi="Times New Roman"/>
+                                <w:sz w:val="12"/>
+                              </w:rPr>
+                            </w:pPr>
+                            <w:r>
+                              <w:rPr>
+                                <w:rFonts w:ascii="Times New Roman" w:hAnsi="Times New Roman"/>
+                                <w:sz w:val="12"/>
+                              </w:rPr>
+                            </w:r>
+                          </w:p>
+                        </w:tc>
+                        <w:tc>
+                          <w:tcPr>
+                            <w:tcW w:w="266" w:type="dxa"/>
+                            <w:tcBorders>
+                              <w:top w:val="single" w:sz="2" w:space="0" w:color="000000"/>
+                              <w:left w:val="single" w:sz="2" w:space="0" w:color="000000"/>
+                              <w:bottom w:val="single" w:sz="2" w:space="0" w:color="000000"/>
+                              <w:right w:val="single" w:sz="2" w:space="0" w:color="000000"/>
+                            </w:tcBorders>
+                          </w:tcPr>
+                          <w:p>
+                            <w:pPr>
+                              <w:pStyle w:val="TableParagraph"/>
+                              <w:rPr>
+                                <w:rFonts w:ascii="Times New Roman" w:hAnsi="Times New Roman"/>
+                                <w:sz w:val="12"/>
+                              </w:rPr>
+                            </w:pPr>
+                            <w:r>
+                              <w:rPr>
+                                <w:rFonts w:ascii="Times New Roman" w:hAnsi="Times New Roman"/>
+                                <w:sz w:val="12"/>
+                              </w:rPr>
+                            </w:r>
+                          </w:p>
+                        </w:tc>
+                        <w:tc>
+                          <w:tcPr>
+                            <w:tcW w:w="262" w:type="dxa"/>
+                            <w:tcBorders>
+                              <w:top w:val="single" w:sz="2" w:space="0" w:color="000000"/>
+                              <w:left w:val="single" w:sz="2" w:space="0" w:color="000000"/>
+                              <w:bottom w:val="single" w:sz="2" w:space="0" w:color="000000"/>
+                              <w:right w:val="single" w:sz="2" w:space="0" w:color="000000"/>
+                            </w:tcBorders>
+                          </w:tcPr>
+                          <w:p>
+                            <w:pPr>
+                              <w:pStyle w:val="TableParagraph"/>
+                              <w:rPr>
+                                <w:rFonts w:ascii="Times New Roman" w:hAnsi="Times New Roman"/>
+                                <w:sz w:val="12"/>
+                              </w:rPr>
+                            </w:pPr>
+                            <w:r>
+                              <w:rPr>
+                                <w:rFonts w:ascii="Times New Roman" w:hAnsi="Times New Roman"/>
+                                <w:sz w:val="12"/>
+                              </w:rPr>
+                            </w:r>
+                          </w:p>
+                        </w:tc>
+                        <w:tc>
+                          <w:tcPr>
+                            <w:tcW w:w="264" w:type="dxa"/>
                             <w:tcBorders>
                               <w:top w:val="single" w:sz="2" w:space="0" w:color="000000"/>
                               <w:left w:val="single" w:sz="2" w:space="0" w:color="000000"/>
@@ -16131,110 +16547,6 @@
                         </w:tc>
                         <w:tc>
                           <w:tcPr>
-                            <w:tcW w:w="279" w:type="dxa"/>
-                            <w:tcBorders>
-                              <w:top w:val="single" w:sz="2" w:space="0" w:color="000000"/>
-                              <w:left w:val="single" w:sz="2" w:space="0" w:color="000000"/>
-                              <w:bottom w:val="single" w:sz="2" w:space="0" w:color="000000"/>
-                              <w:right w:val="single" w:sz="2" w:space="0" w:color="000000"/>
-                            </w:tcBorders>
-                          </w:tcPr>
-                          <w:p>
-                            <w:pPr>
-                              <w:pStyle w:val="TableParagraph"/>
-                              <w:rPr>
-                                <w:rFonts w:ascii="Times New Roman" w:hAnsi="Times New Roman"/>
-                                <w:sz w:val="12"/>
-                              </w:rPr>
-                            </w:pPr>
-                            <w:r>
-                              <w:rPr>
-                                <w:rFonts w:ascii="Times New Roman" w:hAnsi="Times New Roman"/>
-                                <w:sz w:val="12"/>
-                              </w:rPr>
-                            </w:r>
-                          </w:p>
-                        </w:tc>
-                        <w:tc>
-                          <w:tcPr>
-                            <w:tcW w:w="254" w:type="dxa"/>
-                            <w:tcBorders>
-                              <w:top w:val="single" w:sz="2" w:space="0" w:color="000000"/>
-                              <w:left w:val="single" w:sz="2" w:space="0" w:color="000000"/>
-                              <w:bottom w:val="single" w:sz="2" w:space="0" w:color="000000"/>
-                              <w:right w:val="single" w:sz="2" w:space="0" w:color="000000"/>
-                            </w:tcBorders>
-                          </w:tcPr>
-                          <w:p>
-                            <w:pPr>
-                              <w:pStyle w:val="TableParagraph"/>
-                              <w:rPr>
-                                <w:rFonts w:ascii="Times New Roman" w:hAnsi="Times New Roman"/>
-                                <w:sz w:val="12"/>
-                              </w:rPr>
-                            </w:pPr>
-                            <w:r>
-                              <w:rPr>
-                                <w:rFonts w:ascii="Times New Roman" w:hAnsi="Times New Roman"/>
-                                <w:sz w:val="12"/>
-                              </w:rPr>
-                            </w:r>
-                          </w:p>
-                        </w:tc>
-                        <w:tc>
-                          <w:tcPr>
-                            <w:tcW w:w="264" w:type="dxa"/>
-                            <w:tcBorders>
-                              <w:top w:val="single" w:sz="2" w:space="0" w:color="000000"/>
-                              <w:left w:val="single" w:sz="2" w:space="0" w:color="000000"/>
-                              <w:bottom w:val="single" w:sz="2" w:space="0" w:color="000000"/>
-                              <w:right w:val="single" w:sz="2" w:space="0" w:color="000000"/>
-                            </w:tcBorders>
-                          </w:tcPr>
-                          <w:p>
-                            <w:pPr>
-                              <w:pStyle w:val="TableParagraph"/>
-                              <w:rPr>
-                                <w:rFonts w:ascii="Times New Roman" w:hAnsi="Times New Roman"/>
-                                <w:sz w:val="12"/>
-                              </w:rPr>
-                            </w:pPr>
-                            <w:r>
-                              <w:rPr>
-                                <w:rFonts w:ascii="Times New Roman" w:hAnsi="Times New Roman"/>
-                                <w:sz w:val="12"/>
-                              </w:rPr>
-                            </w:r>
-                          </w:p>
-                        </w:tc>
-                        <w:tc>
-                          <w:tcPr>
-                            <w:tcW w:w="265" w:type="dxa"/>
-                            <w:tcBorders>
-                              <w:top w:val="single" w:sz="2" w:space="0" w:color="000000"/>
-                              <w:left w:val="single" w:sz="2" w:space="0" w:color="000000"/>
-                              <w:bottom w:val="single" w:sz="2" w:space="0" w:color="000000"/>
-                              <w:right w:val="single" w:sz="2" w:space="0" w:color="000000"/>
-                            </w:tcBorders>
-                          </w:tcPr>
-                          <w:p>
-                            <w:pPr>
-                              <w:pStyle w:val="TableParagraph"/>
-                              <w:rPr>
-                                <w:rFonts w:ascii="Times New Roman" w:hAnsi="Times New Roman"/>
-                                <w:sz w:val="12"/>
-                              </w:rPr>
-                            </w:pPr>
-                            <w:r>
-                              <w:rPr>
-                                <w:rFonts w:ascii="Times New Roman" w:hAnsi="Times New Roman"/>
-                                <w:sz w:val="12"/>
-                              </w:rPr>
-                            </w:r>
-                          </w:p>
-                        </w:tc>
-                        <w:tc>
-                          <w:tcPr>
                             <w:tcW w:w="260" w:type="dxa"/>
                             <w:tcBorders>
                               <w:top w:val="single" w:sz="2" w:space="0" w:color="000000"/>
@@ -16261,319 +16573,7 @@
                         </w:tc>
                         <w:tc>
                           <w:tcPr>
-                            <w:tcW w:w="259" w:type="dxa"/>
-                            <w:tcBorders>
-                              <w:top w:val="single" w:sz="2" w:space="0" w:color="000000"/>
-                              <w:left w:val="single" w:sz="2" w:space="0" w:color="000000"/>
-                              <w:bottom w:val="single" w:sz="2" w:space="0" w:color="000000"/>
-                              <w:right w:val="single" w:sz="2" w:space="0" w:color="000000"/>
-                            </w:tcBorders>
-                          </w:tcPr>
-                          <w:p>
-                            <w:pPr>
-                              <w:pStyle w:val="TableParagraph"/>
-                              <w:rPr>
-                                <w:rFonts w:ascii="Times New Roman" w:hAnsi="Times New Roman"/>
-                                <w:sz w:val="12"/>
-                              </w:rPr>
-                            </w:pPr>
-                            <w:r>
-                              <w:rPr>
-                                <w:rFonts w:ascii="Times New Roman" w:hAnsi="Times New Roman"/>
-                                <w:sz w:val="12"/>
-                              </w:rPr>
-                            </w:r>
-                          </w:p>
-                        </w:tc>
-                        <w:tc>
-                          <w:tcPr>
-                            <w:tcW w:w="268" w:type="dxa"/>
-                            <w:tcBorders>
-                              <w:top w:val="single" w:sz="2" w:space="0" w:color="000000"/>
-                              <w:left w:val="single" w:sz="2" w:space="0" w:color="000000"/>
-                              <w:bottom w:val="single" w:sz="2" w:space="0" w:color="000000"/>
-                              <w:right w:val="single" w:sz="2" w:space="0" w:color="000000"/>
-                            </w:tcBorders>
-                          </w:tcPr>
-                          <w:p>
-                            <w:pPr>
-                              <w:pStyle w:val="TableParagraph"/>
-                              <w:rPr>
-                                <w:rFonts w:ascii="Times New Roman" w:hAnsi="Times New Roman"/>
-                                <w:sz w:val="12"/>
-                              </w:rPr>
-                            </w:pPr>
-                            <w:r>
-                              <w:rPr>
-                                <w:rFonts w:ascii="Times New Roman" w:hAnsi="Times New Roman"/>
-                                <w:sz w:val="12"/>
-                              </w:rPr>
-                            </w:r>
-                          </w:p>
-                        </w:tc>
-                        <w:tc>
-                          <w:tcPr>
-                            <w:tcW w:w="263" w:type="dxa"/>
-                            <w:tcBorders>
-                              <w:top w:val="single" w:sz="2" w:space="0" w:color="000000"/>
-                              <w:left w:val="single" w:sz="2" w:space="0" w:color="000000"/>
-                              <w:bottom w:val="single" w:sz="2" w:space="0" w:color="000000"/>
-                              <w:right w:val="single" w:sz="2" w:space="0" w:color="000000"/>
-                            </w:tcBorders>
-                          </w:tcPr>
-                          <w:p>
-                            <w:pPr>
-                              <w:pStyle w:val="TableParagraph"/>
-                              <w:rPr>
-                                <w:rFonts w:ascii="Times New Roman" w:hAnsi="Times New Roman"/>
-                                <w:sz w:val="12"/>
-                              </w:rPr>
-                            </w:pPr>
-                            <w:r>
-                              <w:rPr>
-                                <w:rFonts w:ascii="Times New Roman" w:hAnsi="Times New Roman"/>
-                                <w:sz w:val="12"/>
-                              </w:rPr>
-                            </w:r>
-                          </w:p>
-                        </w:tc>
-                        <w:tc>
-                          <w:tcPr>
-                            <w:tcW w:w="260" w:type="dxa"/>
-                            <w:tcBorders>
-                              <w:top w:val="single" w:sz="2" w:space="0" w:color="000000"/>
-                              <w:left w:val="single" w:sz="2" w:space="0" w:color="000000"/>
-                              <w:bottom w:val="single" w:sz="2" w:space="0" w:color="000000"/>
-                              <w:right w:val="single" w:sz="2" w:space="0" w:color="000000"/>
-                            </w:tcBorders>
-                          </w:tcPr>
-                          <w:p>
-                            <w:pPr>
-                              <w:pStyle w:val="TableParagraph"/>
-                              <w:rPr>
-                                <w:rFonts w:ascii="Times New Roman" w:hAnsi="Times New Roman"/>
-                                <w:sz w:val="12"/>
-                              </w:rPr>
-                            </w:pPr>
-                            <w:r>
-                              <w:rPr>
-                                <w:rFonts w:ascii="Times New Roman" w:hAnsi="Times New Roman"/>
-                                <w:sz w:val="12"/>
-                              </w:rPr>
-                            </w:r>
-                          </w:p>
-                        </w:tc>
-                        <w:tc>
-                          <w:tcPr>
-                            <w:tcW w:w="264" w:type="dxa"/>
-                            <w:tcBorders>
-                              <w:top w:val="single" w:sz="2" w:space="0" w:color="000000"/>
-                              <w:left w:val="single" w:sz="2" w:space="0" w:color="000000"/>
-                              <w:bottom w:val="single" w:sz="2" w:space="0" w:color="000000"/>
-                              <w:right w:val="single" w:sz="2" w:space="0" w:color="000000"/>
-                            </w:tcBorders>
-                          </w:tcPr>
-                          <w:p>
-                            <w:pPr>
-                              <w:pStyle w:val="TableParagraph"/>
-                              <w:rPr>
-                                <w:rFonts w:ascii="Times New Roman" w:hAnsi="Times New Roman"/>
-                                <w:sz w:val="12"/>
-                              </w:rPr>
-                            </w:pPr>
-                            <w:r>
-                              <w:rPr>
-                                <w:rFonts w:ascii="Times New Roman" w:hAnsi="Times New Roman"/>
-                                <w:sz w:val="12"/>
-                              </w:rPr>
-                            </w:r>
-                          </w:p>
-                        </w:tc>
-                        <w:tc>
-                          <w:tcPr>
-                            <w:tcW w:w="264" w:type="dxa"/>
-                            <w:tcBorders>
-                              <w:top w:val="single" w:sz="2" w:space="0" w:color="000000"/>
-                              <w:left w:val="single" w:sz="2" w:space="0" w:color="000000"/>
-                              <w:bottom w:val="single" w:sz="2" w:space="0" w:color="000000"/>
-                              <w:right w:val="single" w:sz="2" w:space="0" w:color="000000"/>
-                            </w:tcBorders>
-                          </w:tcPr>
-                          <w:p>
-                            <w:pPr>
-                              <w:pStyle w:val="TableParagraph"/>
-                              <w:rPr>
-                                <w:rFonts w:ascii="Times New Roman" w:hAnsi="Times New Roman"/>
-                                <w:sz w:val="12"/>
-                              </w:rPr>
-                            </w:pPr>
-                            <w:r>
-                              <w:rPr>
-                                <w:rFonts w:ascii="Times New Roman" w:hAnsi="Times New Roman"/>
-                                <w:sz w:val="12"/>
-                              </w:rPr>
-                            </w:r>
-                          </w:p>
-                        </w:tc>
-                        <w:tc>
-                          <w:tcPr>
-                            <w:tcW w:w="263" w:type="dxa"/>
-                            <w:tcBorders>
-                              <w:top w:val="single" w:sz="2" w:space="0" w:color="000000"/>
-                              <w:left w:val="single" w:sz="2" w:space="0" w:color="000000"/>
-                              <w:bottom w:val="single" w:sz="2" w:space="0" w:color="000000"/>
-                              <w:right w:val="single" w:sz="2" w:space="0" w:color="000000"/>
-                            </w:tcBorders>
-                          </w:tcPr>
-                          <w:p>
-                            <w:pPr>
-                              <w:pStyle w:val="TableParagraph"/>
-                              <w:rPr>
-                                <w:rFonts w:ascii="Times New Roman" w:hAnsi="Times New Roman"/>
-                                <w:sz w:val="12"/>
-                              </w:rPr>
-                            </w:pPr>
-                            <w:r>
-                              <w:rPr>
-                                <w:rFonts w:ascii="Times New Roman" w:hAnsi="Times New Roman"/>
-                                <w:sz w:val="12"/>
-                              </w:rPr>
-                            </w:r>
-                          </w:p>
-                        </w:tc>
-                        <w:tc>
-                          <w:tcPr>
-                            <w:tcW w:w="264" w:type="dxa"/>
-                            <w:tcBorders>
-                              <w:top w:val="single" w:sz="2" w:space="0" w:color="000000"/>
-                              <w:left w:val="single" w:sz="2" w:space="0" w:color="000000"/>
-                              <w:bottom w:val="single" w:sz="2" w:space="0" w:color="000000"/>
-                              <w:right w:val="single" w:sz="2" w:space="0" w:color="000000"/>
-                            </w:tcBorders>
-                          </w:tcPr>
-                          <w:p>
-                            <w:pPr>
-                              <w:pStyle w:val="TableParagraph"/>
-                              <w:rPr>
-                                <w:rFonts w:ascii="Times New Roman" w:hAnsi="Times New Roman"/>
-                                <w:sz w:val="12"/>
-                              </w:rPr>
-                            </w:pPr>
-                            <w:r>
-                              <w:rPr>
-                                <w:rFonts w:ascii="Times New Roman" w:hAnsi="Times New Roman"/>
-                                <w:sz w:val="12"/>
-                              </w:rPr>
-                            </w:r>
-                          </w:p>
-                        </w:tc>
-                        <w:tc>
-                          <w:tcPr>
-                            <w:tcW w:w="262" w:type="dxa"/>
-                            <w:tcBorders>
-                              <w:top w:val="single" w:sz="2" w:space="0" w:color="000000"/>
-                              <w:left w:val="single" w:sz="2" w:space="0" w:color="000000"/>
-                              <w:bottom w:val="single" w:sz="2" w:space="0" w:color="000000"/>
-                              <w:right w:val="single" w:sz="2" w:space="0" w:color="000000"/>
-                            </w:tcBorders>
-                          </w:tcPr>
-                          <w:p>
-                            <w:pPr>
-                              <w:pStyle w:val="TableParagraph"/>
-                              <w:rPr>
-                                <w:rFonts w:ascii="Times New Roman" w:hAnsi="Times New Roman"/>
-                                <w:sz w:val="12"/>
-                              </w:rPr>
-                            </w:pPr>
-                            <w:r>
-                              <w:rPr>
-                                <w:rFonts w:ascii="Times New Roman" w:hAnsi="Times New Roman"/>
-                                <w:sz w:val="12"/>
-                              </w:rPr>
-                            </w:r>
-                          </w:p>
-                        </w:tc>
-                        <w:tc>
-                          <w:tcPr>
-                            <w:tcW w:w="264" w:type="dxa"/>
-                            <w:tcBorders>
-                              <w:top w:val="single" w:sz="2" w:space="0" w:color="000000"/>
-                              <w:left w:val="single" w:sz="2" w:space="0" w:color="000000"/>
-                              <w:bottom w:val="single" w:sz="2" w:space="0" w:color="000000"/>
-                              <w:right w:val="single" w:sz="2" w:space="0" w:color="000000"/>
-                            </w:tcBorders>
-                          </w:tcPr>
-                          <w:p>
-                            <w:pPr>
-                              <w:pStyle w:val="TableParagraph"/>
-                              <w:rPr>
-                                <w:rFonts w:ascii="Times New Roman" w:hAnsi="Times New Roman"/>
-                                <w:sz w:val="12"/>
-                              </w:rPr>
-                            </w:pPr>
-                            <w:r>
-                              <w:rPr>
-                                <w:rFonts w:ascii="Times New Roman" w:hAnsi="Times New Roman"/>
-                                <w:sz w:val="12"/>
-                              </w:rPr>
-                            </w:r>
-                          </w:p>
-                        </w:tc>
-                        <w:tc>
-                          <w:tcPr>
-                            <w:tcW w:w="266" w:type="dxa"/>
-                            <w:tcBorders>
-                              <w:top w:val="single" w:sz="2" w:space="0" w:color="000000"/>
-                              <w:left w:val="single" w:sz="2" w:space="0" w:color="000000"/>
-                              <w:bottom w:val="single" w:sz="2" w:space="0" w:color="000000"/>
-                              <w:right w:val="single" w:sz="2" w:space="0" w:color="000000"/>
-                            </w:tcBorders>
-                          </w:tcPr>
-                          <w:p>
-                            <w:pPr>
-                              <w:pStyle w:val="TableParagraph"/>
-                              <w:rPr>
-                                <w:rFonts w:ascii="Times New Roman" w:hAnsi="Times New Roman"/>
-                                <w:sz w:val="12"/>
-                              </w:rPr>
-                            </w:pPr>
-                            <w:r>
-                              <w:rPr>
-                                <w:rFonts w:ascii="Times New Roman" w:hAnsi="Times New Roman"/>
-                                <w:sz w:val="12"/>
-                              </w:rPr>
-                            </w:r>
-                          </w:p>
-                        </w:tc>
-                        <w:tc>
-                          <w:tcPr>
-                            <w:tcW w:w="262" w:type="dxa"/>
-                            <w:tcBorders>
-                              <w:top w:val="single" w:sz="2" w:space="0" w:color="000000"/>
-                              <w:left w:val="single" w:sz="2" w:space="0" w:color="000000"/>
-                              <w:bottom w:val="single" w:sz="2" w:space="0" w:color="000000"/>
-                              <w:right w:val="single" w:sz="2" w:space="0" w:color="000000"/>
-                            </w:tcBorders>
-                          </w:tcPr>
-                          <w:p>
-                            <w:pPr>
-                              <w:pStyle w:val="TableParagraph"/>
-                              <w:rPr>
-                                <w:rFonts w:ascii="Times New Roman" w:hAnsi="Times New Roman"/>
-                                <w:sz w:val="12"/>
-                              </w:rPr>
-                            </w:pPr>
-                            <w:r>
-                              <w:rPr>
-                                <w:rFonts w:ascii="Times New Roman" w:hAnsi="Times New Roman"/>
-                                <w:sz w:val="12"/>
-                              </w:rPr>
-                            </w:r>
-                          </w:p>
-                        </w:tc>
-                        <w:tc>
-                          <w:tcPr>
-                            <w:tcW w:w="160" w:type="dxa"/>
+                            <w:tcW w:w="154" w:type="dxa"/>
                             <w:tcBorders>
                               <w:top w:val="single" w:sz="2" w:space="0" w:color="000000"/>
                               <w:left w:val="single" w:sz="2" w:space="0" w:color="000000"/>
@@ -16712,7 +16712,7 @@
                         </w:tc>
                         <w:tc>
                           <w:tcPr>
-                            <w:tcW w:w="550" w:type="dxa"/>
+                            <w:tcW w:w="552" w:type="dxa"/>
                             <w:gridSpan w:val="3"/>
                             <w:tcBorders>
                               <w:top w:val="single" w:sz="2" w:space="0" w:color="000000"/>
@@ -16739,7 +16739,7 @@
                         </w:tc>
                         <w:tc>
                           <w:tcPr>
-                            <w:tcW w:w="500" w:type="dxa"/>
+                            <w:tcW w:w="498" w:type="dxa"/>
                             <w:gridSpan w:val="2"/>
                             <w:tcBorders>
                               <w:top w:val="single" w:sz="2" w:space="0" w:color="000000"/>
@@ -16766,7 +16766,250 @@
                         </w:tc>
                         <w:tc>
                           <w:tcPr>
-                            <w:tcW w:w="538" w:type="dxa"/>
+                            <w:tcW w:w="540" w:type="dxa"/>
+                            <w:gridSpan w:val="2"/>
+                            <w:tcBorders>
+                              <w:top w:val="single" w:sz="2" w:space="0" w:color="000000"/>
+                              <w:left w:val="single" w:sz="2" w:space="0" w:color="000000"/>
+                              <w:bottom w:val="single" w:sz="2" w:space="0" w:color="000000"/>
+                              <w:right w:val="single" w:sz="2" w:space="0" w:color="000000"/>
+                            </w:tcBorders>
+                          </w:tcPr>
+                          <w:p>
+                            <w:pPr>
+                              <w:pStyle w:val="TableParagraph"/>
+                              <w:rPr>
+                                <w:rFonts w:ascii="Times New Roman" w:hAnsi="Times New Roman"/>
+                                <w:sz w:val="12"/>
+                              </w:rPr>
+                            </w:pPr>
+                            <w:r>
+                              <w:rPr>
+                                <w:rFonts w:ascii="Times New Roman" w:hAnsi="Times New Roman"/>
+                                <w:sz w:val="12"/>
+                              </w:rPr>
+                            </w:r>
+                          </w:p>
+                        </w:tc>
+                        <w:tc>
+                          <w:tcPr>
+                            <w:tcW w:w="530" w:type="dxa"/>
+                            <w:gridSpan w:val="2"/>
+                            <w:tcBorders>
+                              <w:top w:val="single" w:sz="2" w:space="0" w:color="000000"/>
+                              <w:left w:val="single" w:sz="2" w:space="0" w:color="000000"/>
+                              <w:bottom w:val="single" w:sz="2" w:space="0" w:color="000000"/>
+                              <w:right w:val="single" w:sz="2" w:space="0" w:color="000000"/>
+                            </w:tcBorders>
+                          </w:tcPr>
+                          <w:p>
+                            <w:pPr>
+                              <w:pStyle w:val="TableParagraph"/>
+                              <w:rPr>
+                                <w:rFonts w:ascii="Times New Roman" w:hAnsi="Times New Roman"/>
+                                <w:sz w:val="12"/>
+                              </w:rPr>
+                            </w:pPr>
+                            <w:r>
+                              <w:rPr>
+                                <w:rFonts w:ascii="Times New Roman" w:hAnsi="Times New Roman"/>
+                                <w:sz w:val="12"/>
+                              </w:rPr>
+                            </w:r>
+                          </w:p>
+                        </w:tc>
+                        <w:tc>
+                          <w:tcPr>
+                            <w:tcW w:w="518" w:type="dxa"/>
+                            <w:gridSpan w:val="2"/>
+                            <w:tcBorders>
+                              <w:top w:val="single" w:sz="2" w:space="0" w:color="000000"/>
+                              <w:left w:val="single" w:sz="2" w:space="0" w:color="000000"/>
+                              <w:bottom w:val="single" w:sz="2" w:space="0" w:color="000000"/>
+                              <w:right w:val="single" w:sz="2" w:space="0" w:color="000000"/>
+                            </w:tcBorders>
+                          </w:tcPr>
+                          <w:p>
+                            <w:pPr>
+                              <w:pStyle w:val="TableParagraph"/>
+                              <w:rPr>
+                                <w:rFonts w:ascii="Times New Roman" w:hAnsi="Times New Roman"/>
+                                <w:sz w:val="12"/>
+                              </w:rPr>
+                            </w:pPr>
+                            <w:r>
+                              <w:rPr>
+                                <w:rFonts w:ascii="Times New Roman" w:hAnsi="Times New Roman"/>
+                                <w:sz w:val="12"/>
+                              </w:rPr>
+                            </w:r>
+                          </w:p>
+                        </w:tc>
+                        <w:tc>
+                          <w:tcPr>
+                            <w:tcW w:w="523" w:type="dxa"/>
+                            <w:gridSpan w:val="2"/>
+                            <w:tcBorders>
+                              <w:top w:val="single" w:sz="2" w:space="0" w:color="000000"/>
+                              <w:left w:val="single" w:sz="2" w:space="0" w:color="000000"/>
+                              <w:bottom w:val="single" w:sz="2" w:space="0" w:color="000000"/>
+                              <w:right w:val="single" w:sz="2" w:space="0" w:color="000000"/>
+                            </w:tcBorders>
+                          </w:tcPr>
+                          <w:p>
+                            <w:pPr>
+                              <w:pStyle w:val="TableParagraph"/>
+                              <w:rPr>
+                                <w:rFonts w:ascii="Times New Roman" w:hAnsi="Times New Roman"/>
+                                <w:sz w:val="12"/>
+                              </w:rPr>
+                            </w:pPr>
+                            <w:r>
+                              <w:rPr>
+                                <w:rFonts w:ascii="Times New Roman" w:hAnsi="Times New Roman"/>
+                                <w:sz w:val="12"/>
+                              </w:rPr>
+                            </w:r>
+                          </w:p>
+                        </w:tc>
+                        <w:tc>
+                          <w:tcPr>
+                            <w:tcW w:w="531" w:type="dxa"/>
+                            <w:gridSpan w:val="2"/>
+                            <w:tcBorders>
+                              <w:top w:val="single" w:sz="2" w:space="0" w:color="000000"/>
+                              <w:left w:val="single" w:sz="2" w:space="0" w:color="000000"/>
+                              <w:bottom w:val="single" w:sz="2" w:space="0" w:color="000000"/>
+                              <w:right w:val="single" w:sz="2" w:space="0" w:color="000000"/>
+                            </w:tcBorders>
+                          </w:tcPr>
+                          <w:p>
+                            <w:pPr>
+                              <w:pStyle w:val="TableParagraph"/>
+                              <w:rPr>
+                                <w:rFonts w:ascii="Times New Roman" w:hAnsi="Times New Roman"/>
+                                <w:sz w:val="12"/>
+                              </w:rPr>
+                            </w:pPr>
+                            <w:r>
+                              <w:rPr>
+                                <w:rFonts w:ascii="Times New Roman" w:hAnsi="Times New Roman"/>
+                                <w:sz w:val="12"/>
+                              </w:rPr>
+                            </w:r>
+                          </w:p>
+                        </w:tc>
+                        <w:tc>
+                          <w:tcPr>
+                            <w:tcW w:w="531" w:type="dxa"/>
+                            <w:gridSpan w:val="2"/>
+                            <w:tcBorders>
+                              <w:top w:val="single" w:sz="2" w:space="0" w:color="000000"/>
+                              <w:left w:val="single" w:sz="2" w:space="0" w:color="000000"/>
+                              <w:bottom w:val="single" w:sz="2" w:space="0" w:color="000000"/>
+                              <w:right w:val="single" w:sz="2" w:space="0" w:color="000000"/>
+                            </w:tcBorders>
+                          </w:tcPr>
+                          <w:p>
+                            <w:pPr>
+                              <w:pStyle w:val="TableParagraph"/>
+                              <w:rPr>
+                                <w:rFonts w:ascii="Times New Roman" w:hAnsi="Times New Roman"/>
+                                <w:sz w:val="12"/>
+                              </w:rPr>
+                            </w:pPr>
+                            <w:r>
+                              <w:rPr>
+                                <w:rFonts w:ascii="Times New Roman" w:hAnsi="Times New Roman"/>
+                                <w:sz w:val="12"/>
+                              </w:rPr>
+                            </w:r>
+                          </w:p>
+                        </w:tc>
+                        <w:tc>
+                          <w:tcPr>
+                            <w:tcW w:w="521" w:type="dxa"/>
+                            <w:gridSpan w:val="2"/>
+                            <w:tcBorders>
+                              <w:top w:val="single" w:sz="2" w:space="0" w:color="000000"/>
+                              <w:left w:val="single" w:sz="2" w:space="0" w:color="000000"/>
+                              <w:bottom w:val="single" w:sz="2" w:space="0" w:color="000000"/>
+                              <w:right w:val="single" w:sz="2" w:space="0" w:color="000000"/>
+                            </w:tcBorders>
+                          </w:tcPr>
+                          <w:p>
+                            <w:pPr>
+                              <w:pStyle w:val="TableParagraph"/>
+                              <w:rPr>
+                                <w:rFonts w:ascii="Times New Roman" w:hAnsi="Times New Roman"/>
+                                <w:sz w:val="12"/>
+                              </w:rPr>
+                            </w:pPr>
+                            <w:r>
+                              <w:rPr>
+                                <w:rFonts w:ascii="Times New Roman" w:hAnsi="Times New Roman"/>
+                                <w:sz w:val="12"/>
+                              </w:rPr>
+                            </w:r>
+                          </w:p>
+                        </w:tc>
+                        <w:tc>
+                          <w:tcPr>
+                            <w:tcW w:w="529" w:type="dxa"/>
+                            <w:gridSpan w:val="2"/>
+                            <w:tcBorders>
+                              <w:top w:val="single" w:sz="2" w:space="0" w:color="000000"/>
+                              <w:left w:val="single" w:sz="2" w:space="0" w:color="000000"/>
+                              <w:bottom w:val="single" w:sz="2" w:space="0" w:color="000000"/>
+                              <w:right w:val="single" w:sz="2" w:space="0" w:color="000000"/>
+                            </w:tcBorders>
+                          </w:tcPr>
+                          <w:p>
+                            <w:pPr>
+                              <w:pStyle w:val="TableParagraph"/>
+                              <w:rPr>
+                                <w:rFonts w:ascii="Times New Roman" w:hAnsi="Times New Roman"/>
+                                <w:sz w:val="12"/>
+                              </w:rPr>
+                            </w:pPr>
+                            <w:r>
+                              <w:rPr>
+                                <w:rFonts w:ascii="Times New Roman" w:hAnsi="Times New Roman"/>
+                                <w:sz w:val="12"/>
+                              </w:rPr>
+                            </w:r>
+                          </w:p>
+                        </w:tc>
+                        <w:tc>
+                          <w:tcPr>
+                            <w:tcW w:w="526" w:type="dxa"/>
+                            <w:gridSpan w:val="2"/>
+                            <w:tcBorders>
+                              <w:top w:val="single" w:sz="2" w:space="0" w:color="000000"/>
+                              <w:left w:val="single" w:sz="2" w:space="0" w:color="000000"/>
+                              <w:bottom w:val="single" w:sz="2" w:space="0" w:color="000000"/>
+                              <w:right w:val="single" w:sz="2" w:space="0" w:color="000000"/>
+                            </w:tcBorders>
+                          </w:tcPr>
+                          <w:p>
+                            <w:pPr>
+                              <w:pStyle w:val="TableParagraph"/>
+                              <w:rPr>
+                                <w:rFonts w:ascii="Times New Roman" w:hAnsi="Times New Roman"/>
+                                <w:sz w:val="12"/>
+                              </w:rPr>
+                            </w:pPr>
+                            <w:r>
+                              <w:rPr>
+                                <w:rFonts w:ascii="Times New Roman" w:hAnsi="Times New Roman"/>
+                                <w:sz w:val="12"/>
+                              </w:rPr>
+                            </w:r>
+                          </w:p>
+                        </w:tc>
+                        <w:tc>
+                          <w:tcPr>
+                            <w:tcW w:w="525" w:type="dxa"/>
                             <w:gridSpan w:val="2"/>
                             <w:tcBorders>
                               <w:top w:val="single" w:sz="2" w:space="0" w:color="000000"/>
@@ -16820,7 +17063,7 @@
                         </w:tc>
                         <w:tc>
                           <w:tcPr>
-                            <w:tcW w:w="520" w:type="dxa"/>
+                            <w:tcW w:w="532" w:type="dxa"/>
                             <w:gridSpan w:val="2"/>
                             <w:tcBorders>
                               <w:top w:val="single" w:sz="2" w:space="0" w:color="000000"/>
@@ -16847,250 +17090,7 @@
                         </w:tc>
                         <w:tc>
                           <w:tcPr>
-                            <w:tcW w:w="521" w:type="dxa"/>
-                            <w:gridSpan w:val="2"/>
-                            <w:tcBorders>
-                              <w:top w:val="single" w:sz="2" w:space="0" w:color="000000"/>
-                              <w:left w:val="single" w:sz="2" w:space="0" w:color="000000"/>
-                              <w:bottom w:val="single" w:sz="2" w:space="0" w:color="000000"/>
-                              <w:right w:val="single" w:sz="2" w:space="0" w:color="000000"/>
-                            </w:tcBorders>
-                          </w:tcPr>
-                          <w:p>
-                            <w:pPr>
-                              <w:pStyle w:val="TableParagraph"/>
-                              <w:rPr>
-                                <w:rFonts w:ascii="Times New Roman" w:hAnsi="Times New Roman"/>
-                                <w:sz w:val="12"/>
-                              </w:rPr>
-                            </w:pPr>
-                            <w:r>
-                              <w:rPr>
-                                <w:rFonts w:ascii="Times New Roman" w:hAnsi="Times New Roman"/>
-                                <w:sz w:val="12"/>
-                              </w:rPr>
-                            </w:r>
-                          </w:p>
-                        </w:tc>
-                        <w:tc>
-                          <w:tcPr>
-                            <w:tcW w:w="533" w:type="dxa"/>
-                            <w:gridSpan w:val="2"/>
-                            <w:tcBorders>
-                              <w:top w:val="single" w:sz="2" w:space="0" w:color="000000"/>
-                              <w:left w:val="single" w:sz="2" w:space="0" w:color="000000"/>
-                              <w:bottom w:val="single" w:sz="2" w:space="0" w:color="000000"/>
-                              <w:right w:val="single" w:sz="2" w:space="0" w:color="000000"/>
-                            </w:tcBorders>
-                          </w:tcPr>
-                          <w:p>
-                            <w:pPr>
-                              <w:pStyle w:val="TableParagraph"/>
-                              <w:rPr>
-                                <w:rFonts w:ascii="Times New Roman" w:hAnsi="Times New Roman"/>
-                                <w:sz w:val="12"/>
-                              </w:rPr>
-                            </w:pPr>
-                            <w:r>
-                              <w:rPr>
-                                <w:rFonts w:ascii="Times New Roman" w:hAnsi="Times New Roman"/>
-                                <w:sz w:val="12"/>
-                              </w:rPr>
-                            </w:r>
-                          </w:p>
-                        </w:tc>
-                        <w:tc>
-                          <w:tcPr>
-                            <w:tcW w:w="529" w:type="dxa"/>
-                            <w:gridSpan w:val="2"/>
-                            <w:tcBorders>
-                              <w:top w:val="single" w:sz="2" w:space="0" w:color="000000"/>
-                              <w:left w:val="single" w:sz="2" w:space="0" w:color="000000"/>
-                              <w:bottom w:val="single" w:sz="2" w:space="0" w:color="000000"/>
-                              <w:right w:val="single" w:sz="2" w:space="0" w:color="000000"/>
-                            </w:tcBorders>
-                          </w:tcPr>
-                          <w:p>
-                            <w:pPr>
-                              <w:pStyle w:val="TableParagraph"/>
-                              <w:rPr>
-                                <w:rFonts w:ascii="Times New Roman" w:hAnsi="Times New Roman"/>
-                                <w:sz w:val="12"/>
-                              </w:rPr>
-                            </w:pPr>
-                            <w:r>
-                              <w:rPr>
-                                <w:rFonts w:ascii="Times New Roman" w:hAnsi="Times New Roman"/>
-                                <w:sz w:val="12"/>
-                              </w:rPr>
-                            </w:r>
-                          </w:p>
-                        </w:tc>
-                        <w:tc>
-                          <w:tcPr>
-                            <w:tcW w:w="519" w:type="dxa"/>
-                            <w:gridSpan w:val="2"/>
-                            <w:tcBorders>
-                              <w:top w:val="single" w:sz="2" w:space="0" w:color="000000"/>
-                              <w:left w:val="single" w:sz="2" w:space="0" w:color="000000"/>
-                              <w:bottom w:val="single" w:sz="2" w:space="0" w:color="000000"/>
-                              <w:right w:val="single" w:sz="2" w:space="0" w:color="000000"/>
-                            </w:tcBorders>
-                          </w:tcPr>
-                          <w:p>
-                            <w:pPr>
-                              <w:pStyle w:val="TableParagraph"/>
-                              <w:rPr>
-                                <w:rFonts w:ascii="Times New Roman" w:hAnsi="Times New Roman"/>
-                                <w:sz w:val="12"/>
-                              </w:rPr>
-                            </w:pPr>
-                            <w:r>
-                              <w:rPr>
-                                <w:rFonts w:ascii="Times New Roman" w:hAnsi="Times New Roman"/>
-                                <w:sz w:val="12"/>
-                              </w:rPr>
-                            </w:r>
-                          </w:p>
-                        </w:tc>
-                        <w:tc>
-                          <w:tcPr>
-                            <w:tcW w:w="531" w:type="dxa"/>
-                            <w:gridSpan w:val="2"/>
-                            <w:tcBorders>
-                              <w:top w:val="single" w:sz="2" w:space="0" w:color="000000"/>
-                              <w:left w:val="single" w:sz="2" w:space="0" w:color="000000"/>
-                              <w:bottom w:val="single" w:sz="2" w:space="0" w:color="000000"/>
-                              <w:right w:val="single" w:sz="2" w:space="0" w:color="000000"/>
-                            </w:tcBorders>
-                          </w:tcPr>
-                          <w:p>
-                            <w:pPr>
-                              <w:pStyle w:val="TableParagraph"/>
-                              <w:rPr>
-                                <w:rFonts w:ascii="Times New Roman" w:hAnsi="Times New Roman"/>
-                                <w:sz w:val="12"/>
-                              </w:rPr>
-                            </w:pPr>
-                            <w:r>
-                              <w:rPr>
-                                <w:rFonts w:ascii="Times New Roman" w:hAnsi="Times New Roman"/>
-                                <w:sz w:val="12"/>
-                              </w:rPr>
-                            </w:r>
-                          </w:p>
-                        </w:tc>
-                        <w:tc>
-                          <w:tcPr>
-                            <w:tcW w:w="524" w:type="dxa"/>
-                            <w:gridSpan w:val="2"/>
-                            <w:tcBorders>
-                              <w:top w:val="single" w:sz="2" w:space="0" w:color="000000"/>
-                              <w:left w:val="single" w:sz="2" w:space="0" w:color="000000"/>
-                              <w:bottom w:val="single" w:sz="2" w:space="0" w:color="000000"/>
-                              <w:right w:val="single" w:sz="2" w:space="0" w:color="000000"/>
-                            </w:tcBorders>
-                          </w:tcPr>
-                          <w:p>
-                            <w:pPr>
-                              <w:pStyle w:val="TableParagraph"/>
-                              <w:rPr>
-                                <w:rFonts w:ascii="Times New Roman" w:hAnsi="Times New Roman"/>
-                                <w:sz w:val="12"/>
-                              </w:rPr>
-                            </w:pPr>
-                            <w:r>
-                              <w:rPr>
-                                <w:rFonts w:ascii="Times New Roman" w:hAnsi="Times New Roman"/>
-                                <w:sz w:val="12"/>
-                              </w:rPr>
-                            </w:r>
-                          </w:p>
-                        </w:tc>
-                        <w:tc>
-                          <w:tcPr>
-                            <w:tcW w:w="527" w:type="dxa"/>
-                            <w:gridSpan w:val="2"/>
-                            <w:tcBorders>
-                              <w:top w:val="single" w:sz="2" w:space="0" w:color="000000"/>
-                              <w:left w:val="single" w:sz="2" w:space="0" w:color="000000"/>
-                              <w:bottom w:val="single" w:sz="2" w:space="0" w:color="000000"/>
-                              <w:right w:val="single" w:sz="2" w:space="0" w:color="000000"/>
-                            </w:tcBorders>
-                          </w:tcPr>
-                          <w:p>
-                            <w:pPr>
-                              <w:pStyle w:val="TableParagraph"/>
-                              <w:rPr>
-                                <w:rFonts w:ascii="Times New Roman" w:hAnsi="Times New Roman"/>
-                                <w:sz w:val="12"/>
-                              </w:rPr>
-                            </w:pPr>
-                            <w:r>
-                              <w:rPr>
-                                <w:rFonts w:ascii="Times New Roman" w:hAnsi="Times New Roman"/>
-                                <w:sz w:val="12"/>
-                              </w:rPr>
-                            </w:r>
-                          </w:p>
-                        </w:tc>
-                        <w:tc>
-                          <w:tcPr>
-                            <w:tcW w:w="526" w:type="dxa"/>
-                            <w:gridSpan w:val="2"/>
-                            <w:tcBorders>
-                              <w:top w:val="single" w:sz="2" w:space="0" w:color="000000"/>
-                              <w:left w:val="single" w:sz="2" w:space="0" w:color="000000"/>
-                              <w:bottom w:val="single" w:sz="2" w:space="0" w:color="000000"/>
-                              <w:right w:val="single" w:sz="2" w:space="0" w:color="000000"/>
-                            </w:tcBorders>
-                          </w:tcPr>
-                          <w:p>
-                            <w:pPr>
-                              <w:pStyle w:val="TableParagraph"/>
-                              <w:rPr>
-                                <w:rFonts w:ascii="Times New Roman" w:hAnsi="Times New Roman"/>
-                                <w:sz w:val="12"/>
-                              </w:rPr>
-                            </w:pPr>
-                            <w:r>
-                              <w:rPr>
-                                <w:rFonts w:ascii="Times New Roman" w:hAnsi="Times New Roman"/>
-                                <w:sz w:val="12"/>
-                              </w:rPr>
-                            </w:r>
-                          </w:p>
-                        </w:tc>
-                        <w:tc>
-                          <w:tcPr>
-                            <w:tcW w:w="530" w:type="dxa"/>
-                            <w:gridSpan w:val="2"/>
-                            <w:tcBorders>
-                              <w:top w:val="single" w:sz="2" w:space="0" w:color="000000"/>
-                              <w:left w:val="single" w:sz="2" w:space="0" w:color="000000"/>
-                              <w:bottom w:val="single" w:sz="2" w:space="0" w:color="000000"/>
-                              <w:right w:val="single" w:sz="2" w:space="0" w:color="000000"/>
-                            </w:tcBorders>
-                          </w:tcPr>
-                          <w:p>
-                            <w:pPr>
-                              <w:pStyle w:val="TableParagraph"/>
-                              <w:rPr>
-                                <w:rFonts w:ascii="Times New Roman" w:hAnsi="Times New Roman"/>
-                                <w:sz w:val="12"/>
-                              </w:rPr>
-                            </w:pPr>
-                            <w:r>
-                              <w:rPr>
-                                <w:rFonts w:ascii="Times New Roman" w:hAnsi="Times New Roman"/>
-                                <w:sz w:val="12"/>
-                              </w:rPr>
-                            </w:r>
-                          </w:p>
-                        </w:tc>
-                        <w:tc>
-                          <w:tcPr>
-                            <w:tcW w:w="422" w:type="dxa"/>
+                            <w:tcW w:w="414" w:type="dxa"/>
                             <w:gridSpan w:val="2"/>
                             <w:tcBorders>
                               <w:top w:val="single" w:sz="2" w:space="0" w:color="000000"/>
@@ -17517,10 +17517,10 @@
           <w:pgMar w:left="280" w:right="280" w:gutter="0" w:header="0" w:top="360" w:footer="405" w:bottom="600"/>
           <w:cols w:num="5" w:equalWidth="false" w:sep="false">
             <w:col w:w="1412" w:space="454"/>
-            <w:col w:w="1389" w:space="490"/>
-            <w:col w:w="901" w:space="886"/>
+            <w:col w:w="1387" w:space="490"/>
+            <w:col w:w="900" w:space="886"/>
             <w:col w:w="946" w:space="3800"/>
-            <w:col w:w="1065"/>
+            <w:col w:w="1069"/>
           </w:cols>
           <w:formProt w:val="false"/>
           <w:textDirection w:val="lrTb"/>
@@ -18378,7 +18378,7 @@
           <w:sz w:val="20"/>
           <w:lang w:val="mk-MK"/>
         </w:rPr>
-        <w:t xml:space="preserve">: По чекање од 30 минути гостинската екипа од непознати причини не се појави на теренот. Домашната екипа и другите службени лица беа на теренот. </w:t>
+        <w:t>: По чекање од 30 минути гостинската екипа од непознати причини не се појави на терен. Присутни сите службени лица.</w:t>
       </w:r>
     </w:p>
     <w:p>
@@ -18866,10 +18866,10 @@
           <w:pgMar w:left="280" w:right="280" w:gutter="0" w:header="0" w:top="1600" w:footer="405" w:bottom="600"/>
           <w:cols w:num="5" w:equalWidth="false" w:sep="false">
             <w:col w:w="1412" w:space="454"/>
-            <w:col w:w="1389" w:space="490"/>
-            <w:col w:w="901" w:space="886"/>
+            <w:col w:w="1387" w:space="490"/>
+            <w:col w:w="900" w:space="886"/>
             <w:col w:w="946" w:space="3800"/>
-            <w:col w:w="1065"/>
+            <w:col w:w="1069"/>
           </w:cols>
           <w:formProt w:val="false"/>
           <w:textDirection w:val="lrTb"/>
@@ -19154,9 +19154,9 @@
                         <a:avLst/>
                         <a:gdLst>
                           <a:gd name="textAreaLeft" fmla="*/ 0 w 3996000"/>
-                          <a:gd name="textAreaRight" fmla="*/ 4006800 w 3996000"/>
+                          <a:gd name="textAreaRight" fmla="*/ 4007520 w 3996000"/>
                           <a:gd name="textAreaTop" fmla="*/ 0 h 720"/>
-                          <a:gd name="textAreaBottom" fmla="*/ 111986280 h 720"/>
+                          <a:gd name="textAreaBottom" fmla="*/ 251968680 h 720"/>
                           <a:gd name="GluePoint1X" fmla=""/>
                           <a:gd name="GluePoint1Y" fmla=""/>
                           <a:gd name="GluePoint2X" fmla=""/>
@@ -19587,9 +19587,9 @@
                         <a:avLst/>
                         <a:gdLst>
                           <a:gd name="textAreaLeft" fmla="*/ 0 w 3996000"/>
-                          <a:gd name="textAreaRight" fmla="*/ 4006800 w 3996000"/>
+                          <a:gd name="textAreaRight" fmla="*/ 4007520 w 3996000"/>
                           <a:gd name="textAreaTop" fmla="*/ 0 h 720"/>
-                          <a:gd name="textAreaBottom" fmla="*/ 111986280 h 720"/>
+                          <a:gd name="textAreaBottom" fmla="*/ 251968680 h 720"/>
                           <a:gd name="GluePoint1X" fmla=""/>
                           <a:gd name="GluePoint1Y" fmla=""/>
                           <a:gd name="GluePoint2X" fmla=""/>
@@ -20034,9 +20034,9 @@
                         <a:avLst/>
                         <a:gdLst>
                           <a:gd name="textAreaLeft" fmla="*/ 0 w 3996000"/>
-                          <a:gd name="textAreaRight" fmla="*/ 4006800 w 3996000"/>
+                          <a:gd name="textAreaRight" fmla="*/ 4007520 w 3996000"/>
                           <a:gd name="textAreaTop" fmla="*/ 0 h 720"/>
-                          <a:gd name="textAreaBottom" fmla="*/ 111986280 h 720"/>
+                          <a:gd name="textAreaBottom" fmla="*/ 251968680 h 720"/>
                           <a:gd name="GluePoint1X" fmla=""/>
                           <a:gd name="GluePoint1Y" fmla=""/>
                           <a:gd name="GluePoint2X" fmla=""/>
@@ -20467,9 +20467,9 @@
                         <a:avLst/>
                         <a:gdLst>
                           <a:gd name="textAreaLeft" fmla="*/ 0 w 3996000"/>
-                          <a:gd name="textAreaRight" fmla="*/ 4006800 w 3996000"/>
+                          <a:gd name="textAreaRight" fmla="*/ 4007520 w 3996000"/>
                           <a:gd name="textAreaTop" fmla="*/ 0 h 720"/>
-                          <a:gd name="textAreaBottom" fmla="*/ 111986280 h 720"/>
+                          <a:gd name="textAreaBottom" fmla="*/ 251968680 h 720"/>
                           <a:gd name="GluePoint1X" fmla=""/>
                           <a:gd name="GluePoint1Y" fmla=""/>
                           <a:gd name="GluePoint2X" fmla=""/>

</xml_diff>